<commit_message>
docs: embed UML diagrams in the report and add their sources
Inserts the four UML diagrams (use case, class, sequence, activity) as
images at the Figure 4.1/4.3/4.6/4.7 placeholders in PROJECT REPORT1.docx,
rendered from PlantUML sources kept under diagrams/ for regeneration.
Humanizes the newly written sections (requirements gathering, data
collection analysis, evaluation prose) without changing any figures.
</commit_message>
<xml_diff>
--- a/PROJECT REPORT1.docx
+++ b/PROJECT REPORT1.docx
@@ -4759,7 +4759,7 @@
         <w:pStyle w:val="FirstParagraph"/>
       </w:pPr>
       <w:r>
-        <w:t xml:space="preserve">The first stage of the process established what the system had to do and the constraints under which it had to do it. Requirements were elicited from the written sources and comparable systems available to the study, using the elicitation techniques that fit that setting — document analysis and the study of existing systems (Sommerville, 2016; Nuseibeh &amp; Easterbrook, 2000). Three sources were drawn on. The first was the survey of deployed tutor-matching platforms in Chapter Two, whose documented limitations — manual or filter-only matching, no fairness or load-balancing mechanism, and opaque rankings — defined the problems the system had to address. The second was the research gap distilled from that literature (Section 2.4). The third was the original seminar proposal of February 2026 and the supervisor’s feedback on it, which supplied the intended scope, the matching criteria, and the weighting scheme the study set out to formalise.</w:t>
+        <w:t xml:space="preserve">The first stage of the process established what the system had to do and the constraints under which it had to do it. Requirements were elicited from the written sources and comparable systems available to the study, using the elicitation techniques that fit that setting: document analysis and the study of existing systems (Sommerville, 2016; Nuseibeh &amp; Easterbrook, 2000). Three sources were drawn on. The first was the survey of deployed tutor-matching platforms in Chapter Two, whose documented limitations (manual or filter-only matching, no fairness or load-balancing mechanism, opaque rankings) defined the problems the system had to address. The second was the research gap distilled from that literature (Section 2.4). The third was the original seminar proposal of February 2026 and the supervisor’s feedback on it, which supplied the intended scope, the matching criteria, and the weighting scheme the study set out to formalise.</w:t>
       </w:r>
     </w:p>
     <w:p>
@@ -6054,7 +6054,7 @@
         <w:pStyle w:val="BodyText"/>
       </w:pPr>
       <w:r>
-        <w:t xml:space="preserve">In parallel with the greedy engine, the study also formalised a stability-based alternative for comparison. Deferred acceptance — the student-proposing Gale-Shapley algorithm in its college-admissions form, extended with tutor capacities — produces a stable matching in which no student–tutor pair would both prefer each other over their assigned partners. Stability is a different objective from total score, so it serves as a genuine competing baseline rather than a tuning variant of the greedy engine. Both strategies run on identical fixtures and are compared in Section 4.10.5, together with the first-come-first-served strategies that deployed platforms typically use.</w:t>
+        <w:t xml:space="preserve">In parallel with the greedy engine, the study also formalised a stability-based alternative for comparison. Deferred acceptance, the student-proposing Gale-Shapley algorithm in its college-admissions form extended with tutor capacities, produces a stable matching in which no student–tutor pair would both prefer each other over their assigned partners. Stability is a different objective from total score, so it serves as a genuine competing baseline rather than a tuning variant of the greedy engine. Both strategies run on identical fixtures and are compared in Section 4.10.5, together with the first-come-first-served strategies that deployed platforms typically use.</w:t>
       </w:r>
     </w:p>
     <w:p>
@@ -6223,7 +6223,7 @@
         <w:pStyle w:val="FirstParagraph"/>
       </w:pPr>
       <w:r>
-        <w:t xml:space="preserve">The data analysed in this chapter come from the requirements stage (Section 3.1). Because no live platform dataset of sufficient scale existed (Section 1.6), the study worked with two kinds of data. The first is the domain profile of the target setting — the subjects offered in Nigerian secondary schools, the grade levels, the WAEC and NECO examination types, representative tutor experience, pricing and capacity, and weekly availability patterns — assembled from the literature surveyed in Chapter Two and from the seminar proposal. This profile fixes the attributes on which every student and tutor in the evaluation is generated, so the results in Section 4.10 speak to the population the system is designed for rather than to generic random inputs.</w:t>
+        <w:t xml:space="preserve">The data analysed in this chapter come from the requirements stage (Section 3.1). Because no live platform dataset of sufficient scale existed (Section 1.6), the study worked with two kinds of data. The first is the domain profile of the target setting: the subjects offered in Nigerian secondary schools, the grade levels, the WAEC and NECO examination types, representative tutor experience, pricing and capacity, and weekly availability patterns, assembled from the literature surveyed in Chapter Two and from the seminar proposal. This profile fixes the attributes on which every student and tutor in the evaluation is generated, so the results in Section 4.10 speak to the population the system is designed for rather than to generic random inputs.</w:t>
       </w:r>
     </w:p>
     <w:p>
@@ -6765,27 +6765,57 @@
         <w:pStyle w:val="BodyText"/>
       </w:pPr>
       <w:r>
-        <w:t xml:space="preserve">Figure 4.1 presents the use case diagram, summarising the actors that interact with the system — student, tutor, and administrator — and the principal functions each performs, from onboarding and requesting a match through to assignment and post-session feedback. The architecture that realises these use cases is described in the subsections that follow.</w:t>
+        <w:t xml:space="preserve">Figure 4.1 shows the use case diagram: the actors who interact with the system (student, tutor, and administrator) and the principal functions each performs, from onboarding and requesting a match through to assignment and post-session feedback. The rest of this section describes how those use cases are realised.</w:t>
       </w:r>
     </w:p>
     <w:p>
       <w:pPr>
         <w:pStyle w:val="BodyText"/>
-        <w:pBdr>
-          <w:top w:val="single" w:sz="6" w:space="6" w:color="808080"/>
-          <w:left w:val="single" w:sz="6" w:space="6" w:color="808080"/>
-          <w:bottom w:val="single" w:sz="6" w:space="6" w:color="808080"/>
-          <w:right w:val="single" w:sz="6" w:space="6" w:color="808080"/>
-        </w:pBdr>
         <w:spacing w:before="120" w:after="120"/>
         <w:jc w:val="center"/>
       </w:pPr>
       <w:r>
-        <w:rPr>
-          <w:b/>
-          <w:color w:val="808080"/>
-        </w:rPr>
-        <w:t xml:space="preserve">[ Insert Figure 4.1: Use Case Diagram here ]</w:t>
+        <w:drawing>
+          <wp:inline distT="0" distB="0" distL="0" distR="0">
+            <wp:extent cx="5334000" cy="6086470"/>
+            <wp:effectExtent l="0" t="0" r="0" b="0"/>
+            <wp:docPr id="2001" name="Picture" descr="Use case diagram of the matchmaking system"/>
+            <wp:cNvGraphicFramePr/>
+            <a:graphic xmlns:a="http://schemas.openxmlformats.org/drawingml/2006/main">
+              <a:graphicData uri="http://schemas.openxmlformats.org/drawingml/2006/picture">
+                <pic:pic xmlns:pic="http://schemas.openxmlformats.org/drawingml/2006/picture">
+                  <pic:nvPicPr>
+                    <pic:cNvPr id="2001" name="Picture" descr="Figure 4.1"/>
+                    <pic:cNvPicPr>
+                      <a:picLocks noChangeAspect="1" noChangeArrowheads="1"/>
+                    </pic:cNvPicPr>
+                  </pic:nvPicPr>
+                  <pic:blipFill>
+                    <a:blip r:embed="rId15"/>
+                    <a:stretch>
+                      <a:fillRect/>
+                    </a:stretch>
+                  </pic:blipFill>
+                  <pic:spPr bwMode="auto">
+                    <a:xfrm>
+                      <a:off x="0" y="0"/>
+                      <a:ext cx="5334000" cy="6086470"/>
+                    </a:xfrm>
+                    <a:prstGeom prst="rect">
+                      <a:avLst/>
+                    </a:prstGeom>
+                    <a:noFill/>
+                    <a:ln w="9525">
+                      <a:noFill/>
+                      <a:headEnd/>
+                      <a:tailEnd/>
+                    </a:ln>
+                  </pic:spPr>
+                </pic:pic>
+              </a:graphicData>
+            </a:graphic>
+          </wp:inline>
+        </w:drawing>
       </w:r>
     </w:p>
     <w:p>
@@ -7310,21 +7340,51 @@
     <w:p>
       <w:pPr>
         <w:pStyle w:val="BodyText"/>
-        <w:pBdr>
-          <w:top w:val="single" w:sz="6" w:space="6" w:color="808080"/>
-          <w:left w:val="single" w:sz="6" w:space="6" w:color="808080"/>
-          <w:bottom w:val="single" w:sz="6" w:space="6" w:color="808080"/>
-          <w:right w:val="single" w:sz="6" w:space="6" w:color="808080"/>
-        </w:pBdr>
         <w:spacing w:before="120" w:after="120"/>
         <w:jc w:val="center"/>
       </w:pPr>
       <w:r>
-        <w:rPr>
-          <w:b/>
-          <w:color w:val="808080"/>
-        </w:rPr>
-        <w:t xml:space="preserve">[ Insert Figure 4.3: Class Diagram (Core Domain) here ]</w:t>
+        <w:drawing>
+          <wp:inline distT="0" distB="0" distL="0" distR="0">
+            <wp:extent cx="5334000" cy="3239953"/>
+            <wp:effectExtent l="0" t="0" r="0" b="0"/>
+            <wp:docPr id="2002" name="Picture" descr="Class diagram of the core domain"/>
+            <wp:cNvGraphicFramePr/>
+            <a:graphic xmlns:a="http://schemas.openxmlformats.org/drawingml/2006/main">
+              <a:graphicData uri="http://schemas.openxmlformats.org/drawingml/2006/picture">
+                <pic:pic xmlns:pic="http://schemas.openxmlformats.org/drawingml/2006/picture">
+                  <pic:nvPicPr>
+                    <pic:cNvPr id="2002" name="Picture" descr="Figure 4.3"/>
+                    <pic:cNvPicPr>
+                      <a:picLocks noChangeAspect="1" noChangeArrowheads="1"/>
+                    </pic:cNvPicPr>
+                  </pic:nvPicPr>
+                  <pic:blipFill>
+                    <a:blip r:embed="rId16"/>
+                    <a:stretch>
+                      <a:fillRect/>
+                    </a:stretch>
+                  </pic:blipFill>
+                  <pic:spPr bwMode="auto">
+                    <a:xfrm>
+                      <a:off x="0" y="0"/>
+                      <a:ext cx="5334000" cy="3239953"/>
+                    </a:xfrm>
+                    <a:prstGeom prst="rect">
+                      <a:avLst/>
+                    </a:prstGeom>
+                    <a:noFill/>
+                    <a:ln w="9525">
+                      <a:noFill/>
+                      <a:headEnd/>
+                      <a:tailEnd/>
+                    </a:ln>
+                  </pic:spPr>
+                </pic:pic>
+              </a:graphicData>
+            </a:graphic>
+          </wp:inline>
+        </w:drawing>
       </w:r>
     </w:p>
     <w:p>
@@ -10554,7 +10614,7 @@
       <w:r>
         <w:t xml:space="preserve">At the three smallest tested sizes the greedy algorithm assigned exactly as many students as the true optimum and matched 99.9–100.0% of the optimal total score; at the largest tested instance (100 students, 33 tutors) it assigned 59 of the 64 students the optimum could place and reached 94.3% of the optimal total score — in every case far exceeding its proven 1/2 worst-case bound. This is the empirical justification for using the greedy algorithm rather than </w:t>
         <w:lastRenderedPageBreak/>
-        <w:t>paying the flow solver’s cubic cost at production scale: the measured gap to optimal is negligible, and the proven bound guarantees it can never fall below half of optimal even on adversarial inputs the evaluation harness did not happen to generate.</w:t>
+        <w:t>paying the flow solver’s cubic cost at production scale: the measured gap to optimal is small at the tested scales, and the proven bound guarantees it can never fall below half of optimal even on adversarial inputs the evaluation harness did not happen to generate.</w:t>
       </w:r>
     </w:p>
     <w:tbl>
@@ -14751,21 +14811,51 @@
     <w:p>
       <w:pPr>
         <w:pStyle w:val="BodyText"/>
-        <w:pBdr>
-          <w:top w:val="single" w:sz="6" w:space="6" w:color="808080"/>
-          <w:left w:val="single" w:sz="6" w:space="6" w:color="808080"/>
-          <w:bottom w:val="single" w:sz="6" w:space="6" w:color="808080"/>
-          <w:right w:val="single" w:sz="6" w:space="6" w:color="808080"/>
-        </w:pBdr>
         <w:spacing w:before="120" w:after="120"/>
         <w:jc w:val="center"/>
       </w:pPr>
       <w:r>
-        <w:rPr>
-          <w:b/>
-          <w:color w:val="808080"/>
-        </w:rPr>
-        <w:t xml:space="preserve">[ Insert Figure 4.6: Sequence Diagram of the End-to-End Matchmaking Flow here ]</w:t>
+        <w:drawing>
+          <wp:inline distT="0" distB="0" distL="0" distR="0">
+            <wp:extent cx="5334000" cy="2926411"/>
+            <wp:effectExtent l="0" t="0" r="0" b="0"/>
+            <wp:docPr id="2003" name="Picture" descr="Sequence diagram of the end-to-end matchmaking flow"/>
+            <wp:cNvGraphicFramePr/>
+            <a:graphic xmlns:a="http://schemas.openxmlformats.org/drawingml/2006/main">
+              <a:graphicData uri="http://schemas.openxmlformats.org/drawingml/2006/picture">
+                <pic:pic xmlns:pic="http://schemas.openxmlformats.org/drawingml/2006/picture">
+                  <pic:nvPicPr>
+                    <pic:cNvPr id="2003" name="Picture" descr="Figure 4.6"/>
+                    <pic:cNvPicPr>
+                      <a:picLocks noChangeAspect="1" noChangeArrowheads="1"/>
+                    </pic:cNvPicPr>
+                  </pic:nvPicPr>
+                  <pic:blipFill>
+                    <a:blip r:embed="rId17"/>
+                    <a:stretch>
+                      <a:fillRect/>
+                    </a:stretch>
+                  </pic:blipFill>
+                  <pic:spPr bwMode="auto">
+                    <a:xfrm>
+                      <a:off x="0" y="0"/>
+                      <a:ext cx="5334000" cy="2926411"/>
+                    </a:xfrm>
+                    <a:prstGeom prst="rect">
+                      <a:avLst/>
+                    </a:prstGeom>
+                    <a:noFill/>
+                    <a:ln w="9525">
+                      <a:noFill/>
+                      <a:headEnd/>
+                      <a:tailEnd/>
+                    </a:ln>
+                  </pic:spPr>
+                </pic:pic>
+              </a:graphicData>
+            </a:graphic>
+          </wp:inline>
+        </w:drawing>
       </w:r>
     </w:p>
     <w:p>
@@ -15486,28 +15576,57 @@
         <w:pStyle w:val="BodyText"/>
       </w:pPr>
       <w:r>
-        <w:t xml:space="preserve">Figure 4.7 shows the same flow as an activity diagram, making the decision points explicit — profile completeness, the presence of eligible tutors, and seat availability during assignment.</w:t>
+        <w:t xml:space="preserve">Figure 4.7 shows the same flow as an activity diagram, making the decision points explicit: profile completeness, the presence of eligible tutors, and seat availability during assignment.</w:t>
       </w:r>
     </w:p>
     <w:p>
       <w:pPr>
         <w:pStyle w:val="BodyText"/>
-        <w:pBdr>
-          <w:top w:val="single" w:sz="6" w:space="6" w:color="808080"/>
-          <w:left w:val="single" w:sz="6" w:space="6" w:color="808080"/>
-          <w:bottom w:val="single" w:sz="6" w:space="6" w:color="808080"/>
-          <w:right w:val="single" w:sz="6" w:space="6" w:color="808080"/>
-        </w:pBdr>
         <w:spacing w:before="120" w:after="120"/>
         <w:jc w:val="center"/>
       </w:pPr>
       <w:r>
-        <w:rPr>
-          <w:b/>
-          <w:bCs/>
-          <w:color w:val="808080"/>
-        </w:rPr>
-        <w:t xml:space="preserve">[ Insert Figure 4.7: Activity Diagram of the Matchmaking Flow here ]</w:t>
+        <w:drawing>
+          <wp:inline distT="0" distB="0" distL="0" distR="0">
+            <wp:extent cx="5334000" cy="4550379"/>
+            <wp:effectExtent l="0" t="0" r="0" b="0"/>
+            <wp:docPr id="2004" name="Picture" descr="Activity diagram of the end-to-end matchmaking flow"/>
+            <wp:cNvGraphicFramePr/>
+            <a:graphic xmlns:a="http://schemas.openxmlformats.org/drawingml/2006/main">
+              <a:graphicData uri="http://schemas.openxmlformats.org/drawingml/2006/picture">
+                <pic:pic xmlns:pic="http://schemas.openxmlformats.org/drawingml/2006/picture">
+                  <pic:nvPicPr>
+                    <pic:cNvPr id="2004" name="Picture" descr="Figure 4.7"/>
+                    <pic:cNvPicPr>
+                      <a:picLocks noChangeAspect="1" noChangeArrowheads="1"/>
+                    </pic:cNvPicPr>
+                  </pic:nvPicPr>
+                  <pic:blipFill>
+                    <a:blip r:embed="rId18"/>
+                    <a:stretch>
+                      <a:fillRect/>
+                    </a:stretch>
+                  </pic:blipFill>
+                  <pic:spPr bwMode="auto">
+                    <a:xfrm>
+                      <a:off x="0" y="0"/>
+                      <a:ext cx="5334000" cy="4550379"/>
+                    </a:xfrm>
+                    <a:prstGeom prst="rect">
+                      <a:avLst/>
+                    </a:prstGeom>
+                    <a:noFill/>
+                    <a:ln w="9525">
+                      <a:noFill/>
+                      <a:headEnd/>
+                      <a:tailEnd/>
+                    </a:ln>
+                  </pic:spPr>
+                </pic:pic>
+              </a:graphicData>
+            </a:graphic>
+          </wp:inline>
+        </w:drawing>
       </w:r>
     </w:p>
     <w:p>
@@ -18697,7 +18816,7 @@
         <w:pStyle w:val="BodyText"/>
       </w:pPr>
       <w:r>
-        <w:t xml:space="preserve">Two effects are visible at once in this table and should not be conflated: unassigned% rises with ratio because it is governed almost entirely by aggregate tutor capacity relative to demand, while the Jain index also rises with ratio — from 0.5620 at 1:1 to 0.8533 at 4:1 — because with more students per tutor, more tutors end up carrying similar, higher loads; at 10:1 the index settles at 0.8333, where final loads are fixed by capacity itself rather than by assignment order.</w:t>
+        <w:t xml:space="preserve">Two effects are visible in this table, and they should not be conflated. Unassigned% rises with ratio because it is governed almost entirely by aggregate tutor capacity relative to demand. The Jain index rises too, from 0.5620 at 1:1 to 0.8533 at 4:1, but for a different reason: with more students per tutor, more tutors end up carrying similar, higher loads. At 10:1 it settles at 0.8333, where final loads are fixed by capacity itself rather than by assignment order.</w:t>
       </w:r>
     </w:p>
     <w:p>
@@ -19270,17 +19389,7 @@
         <w:pStyle w:val="BodyText"/>
       </w:pPr>
       <w:r>
-        <w:t xml:space="preserve">This is the central finding of the fairness evaluation: </w:t>
-      </w:r>
-      <w:r>
-        <w:rPr>
-          <w:b/>
-          <w:bCs/>
-        </w:rPr>
-        <w:t>the mechanism has a measurable, positive effect on load distribution only within a specific regime.</w:t>
-      </w:r>
-      <w:r>
-        <w:t xml:space="preserve"> At 1.5:1, enabling the fairness weight improves Jain’s index from 0.5945 to 0.6335 (+0.039) with, if anything, a slightly higher average score rather than a lower one (spreading load onto emptier tutors captures the cold-start boost). At 2:1 and beyond in the current fixtures, Jain’s index is identical whether the weight is enabled or not, because tutor capacity becomes the binding constraint: nearly every eligible tutor fills to its own fixed capacity regardless of assignment order, so no score-based reordering can change the final load distribution. The average-score column should be read with a caveat: because the composite score itself includes the fairness term, average scores across the two weight settings are not directly comparable as quality measures. Within the moderate band the fairness-aware runs report slightly higher averages (0.6194 against 0.6106 at 1.5:1, 0.6208 against 0.6137 at 2:1, 0.6093 against 0.6046 at 3:1, and 0.6082 against 0.6042 at 4:1); at 10:1 the position reverses slightly (0.7124 against 0.7145). In a deployment that persistently operates under severe oversubscription, the load-factor weight is therefore largely inert; where it does act, it buys a measurably fairer load distribution at no clear quality penalty in the moderate band.</w:t>
+        <w:t xml:space="preserve">This is the central finding of the fairness evaluation: the mechanism has a measurable, positive effect on load distribution only within a specific regime. At 1.5:1, enabling the fairness weight improves Jain’s index from 0.5945 to 0.6335 (+0.039), and the average score is, if anything, slightly higher rather than lower, because spreading load onto emptier tutors captures the cold-start boost. At 2:1 and beyond in the current fixtures, Jain’s index is identical whether the weight is enabled or not: tutor capacity becomes the binding constraint, nearly every eligible tutor fills to its own fixed capacity regardless of assignment order, and no score-based reordering can change the final load distribution. The average-score column should be read with a caveat. Because the composite score itself includes the fairness term, average scores across the two weight settings are not directly comparable as quality measures. Within the moderate band the fairness-aware runs report slightly higher averages (0.6194 against 0.6106 at 1.5:1, 0.6208 against 0.6137 at 2:1, 0.6093 against 0.6046 at 3:1, and 0.6082 against 0.6042 at 4:1); at 10:1 the position reverses slightly (0.7124 against 0.7145). In a deployment that persistently operates under severe oversubscription, the load-factor weight is therefore largely inert; where it does act, it buys a measurably fairer load distribution at no clear quality penalty in the moderate band.</w:t>
       </w:r>
     </w:p>
     <w:p>
@@ -19785,7 +19894,7 @@
         <w:pStyle w:val="BodyText"/>
       </w:pPr>
       <w:r>
-        <w:t xml:space="preserve">Pairs scored grow 216 to 6,769 to 176,790 across the three size steps — a five-fold increase in scale raises the number of pairs by a factor of roughly 26 to 31, consistent with the O(n²) pair-scoring floor. Mean elapsed time grows from 6.2 ms at 200 students to 108.0 ms at 1,000 and 2,066.6 ms at 5,000, consistent with quadratic growth plus a slowly growing log factor, matching the O(n^2 log n) bound derived in Section 4.5.3. The smallest scale’s timings (low single-digit milliseconds) are close to the resolution of the measurement and are dominated by JIT warm-up noise rather than algorithmic cost; they are reported for completeness but should not be read as precise.</w:t>
+        <w:t xml:space="preserve">Pairs scored grow 216 to 6,769 to 176,790 across the three size steps. A five-fold increase in scale raises the number of pairs by a factor of roughly 26 to 31, consistent with the O(n²) pair-scoring floor. Mean elapsed time grows from 6.2 ms at 200 students to 108.0 ms at 1,000 and 2,066.6 ms at 5,000, consistent with quadratic growth plus a slowly growing log factor, matching the O(n^2 log n) bound derived in Section 4.5.3. The smallest scale’s timings (low single-digit milliseconds) are close to the resolution of the measurement and are dominated by JIT warm-up noise rather than algorithmic cost; they are reported for completeness but should not be read as precise.</w:t>
       </w:r>
     </w:p>
     <w:p>
@@ -20627,7 +20736,7 @@
         <w:pStyle w:val="BodyText"/>
       </w:pPr>
       <w:r>
-        <w:t xml:space="preserve">The self-selection baseline is the more revealing comparison. It tracks the engine closely wherever supply is abundant — at 1:1 the engine leads by 0.002 in average score and at 1.5:1 by 0.007, because when every student can still obtain a near-best tutor, global coordination has little to add. Under contention the gap widens: the engine’s globally score-ordered assignment beats self-selection by 0.012 at 2:1, 0.023 at 3:1, and 0.130 at 10:1, because early arrivals under FCFS take tutors that later students needed more, while the batch engine gives each remaining seat to the pairing that values it most, regardless of arrival order. The deferred-acceptance baseline produces essentially the same average score as the engine at every ratio (within 0.001), as both optimise over the same static utilities; the engine’s advantage shows up in load distribution — Jain’s index 0.5620 against 0.5236 at 1:1 and 0.6335 against 0.6057 at 1.5:1 — because the greedy engine keeps recomputing fairness as tutors fill, whereas a stable matching fixes each pair once. The practical reading for RQ6 is that the algorithm’s advantage over simpler methods is concentrated exactly where a real platform hurts — when demand presses against tutor capacity — and it offers no false promise of improvement when supply is abundant.</w:t>
+        <w:t xml:space="preserve">The self-selection baseline is the more revealing comparison. It tracks the engine closely wherever supply is abundant: at 1:1 the engine leads by 0.002 in average score, and at 1.5:1 by 0.007, because when every student can still obtain a near-best tutor, global coordination has little to add. Under contention the gap widens. The engine’s globally score-ordered assignment beats self-selection by 0.012 at 2:1, 0.023 at 3:1, and 0.130 at 10:1, because early arrivals under FCFS take tutors that later students needed more, while the batch engine gives each remaining seat to the pairing that values it most, regardless of arrival order. The deferred-acceptance baseline produces essentially the same average score as the engine at every ratio (within 0.001), as both optimise over the same static utilities; the engine’s advantage shows up in load distribution instead: Jain’s index is 0.5620 against 0.5236 at 1:1 and 0.6335 against 0.6057 at 1.5:1, because the greedy engine keeps recomputing fairness as tutors fill, whereas a stable matching fixes each pair once. The practical reading for RQ6 is that the algorithm’s advantage over simpler methods is concentrated exactly where a real platform hurts, when demand presses against tutor capacity; it offers no false promise of improvement when supply is abundant.</w:t>
       </w:r>
     </w:p>
     <w:p>

</xml_diff>

<commit_message>
docs: humanize report prose and fix stale findings
Applies the humanize-writing pass to PROJECT REPORT1.docx: demotes ten
body paragraphs mis-styled as Heading2 (they would have appeared as
phantom TOC entries after refresh), smooths flagged passages, and
refreshes stale results claims to the 13 Aug 2026 eval run (fairness
gain now +0.039 at 1.5:1, optimal-score range 94.3-100%, coverage
96.3-100%). All numbers verified against the benchmark CSVs; figures,
tables, and citations unchanged.
</commit_message>
<xml_diff>
--- a/PROJECT REPORT1.docx
+++ b/PROJECT REPORT1.docx
@@ -184,7 +184,7 @@
         <w:pStyle w:val="BodyText"/>
       </w:pPr>
       <w:r>
-        <w:t xml:space="preserve">Student-to-tutor matching is a multi-criteria decision-making problem, but most tutoring platforms base their matches on subject and availability only. This paper designed, implemented and tested a multi-criteria student-tutor matchmaking system in the context of secondary school tutoring environments. Compatibility is determined using a composite scoring function with four bounded sub-score functions – academic, preference, scheduling, and fairness – aggregated using weights chosen by students, while the matchmaking is performed using a greedy algorithm with lazy fairness recompute using a priority queue, implemented as a framework-agnostic TypeScript domain layer in a NestJS/PostgreSQL web application. The time complexity of the algorithm is O(n² log n), demonstrated empirically by quadratic growth of the number of pairs scored when scaling up five times, as well as by achieving 99.9-100% of the optimal total score, compared to a min-cost max-flow baseline, which is proved to be a 1/2 approximation to the optimal solution. Adding a fairness weighting term improved Jain’s fairness index by up to 0.027 for student:tutor ratio of 1.5:1 to 2:1 at the expense of minimal quality of match, but becomes ineffective at 3:1 ratios, when tutor’s capacity bounds the load distribution.</w:t>
+        <w:t xml:space="preserve">Student-to-tutor matching is a multi-criteria decision-making problem, but most tutoring platforms base their matches on subject and availability only. This paper designed, implemented and tested a multi-criteria student-tutor matchmaking system in the context of secondary school tutoring environments. Compatibility is determined using a composite scoring function with four bounded sub-score functions – academic, preference, scheduling, and fairness – aggregated using weights chosen by students, while the matchmaking is performed using a greedy algorithm with lazy fairness recompute using a priority queue, implemented as a framework-agnostic TypeScript domain layer in a NestJS/PostgreSQL web application. The time complexity of the algorithm is O(n² log n), demonstrated empirically by quadratic growth of the number of pairs scored when scaling up five times, as well as by achieving 94.3-100% of the optimal total score, compared to a min-cost max-flow baseline, which is proved to be a 1/2 approximation to the optimal solution. Adding a fairness weighting term improved Jain’s fairness index by 0.039 at a 1.5:1 student:tutor ratio, with no measurable change at higher ratios once tutor capacity bounds the load distribution, and without lowering average match quality in the moderate band.</w:t>
       </w:r>
     </w:p>
     <w:p>
@@ -2631,7 +2631,7 @@
     </w:p>
     <w:p>
       <w:pPr>
-        <w:pStyle w:val="Heading2"/>
+        <w:pStyle w:val="BodyText"/>
         <w:rPr>
           <w:rFonts w:ascii="Times New Roman" w:eastAsiaTheme="minorHAnsi" w:hAnsi="Times New Roman" w:cstheme="minorBidi"/>
           <w:b w:val="0"/>
@@ -2649,7 +2649,7 @@
           <w:szCs w:val="24"/>
         </w:rPr>
         <w:lastRenderedPageBreak/>
-        <w:t xml:space="preserve">Besides this, there are issues of imbalances that occur within the platform since most of the tutors who are highly ranked have too many students to teach while the new tutors have none at all due to the ranking effect (Pitoura et al., 2022), and also clashes in schedules. Multi-criteria decision-making and combinatorial optimization provides an elegant solution to the two issues since it uses the weighted scoring models to evaluate and solve conflicting constraints and even fairness constraints (Wang et al., 2023; Hien et al., 2025). This paper will use this approach to tackle the issue of matching of tutors and students in a system implemented using NestJS, React and PostgreSQL.</w:t>
+        <w:t xml:space="preserve">Besides this, there are issues of imbalances that occur within the platform since most of the tutors who are highly ranked have too many students to teach while the new tutors have none at all due to the ranking effect (Pitoura et al., 2022), and there are also clashes in schedules. Multi-criteria decision-making and combinatorial optimization provide an elegant solution to the two issues since they use the weighted scoring models to evaluate and solve conflicting constraints and even fairness constraints (Wang et al., 2023; Hien et al., 2025). This paper will use this approach to tackle the issue of matching of tutors and students in a system implemented using NestJS, React and PostgreSQL.</w:t>
       </w:r>
     </w:p>
     <w:p>
@@ -2762,7 +2762,7 @@
     </w:p>
     <w:p>
       <w:pPr>
-        <w:pStyle w:val="Heading2"/>
+        <w:pStyle w:val="BodyText"/>
         <w:rPr>
           <w:rFonts w:ascii="Times New Roman" w:eastAsiaTheme="minorHAnsi" w:hAnsi="Times New Roman" w:cstheme="minorBidi"/>
           <w:b w:val="0"/>
@@ -3200,7 +3200,7 @@
     </w:p>
     <w:p>
       <w:pPr>
-        <w:pStyle w:val="Heading2"/>
+        <w:pStyle w:val="BodyText"/>
         <w:rPr>
           <w:rFonts w:ascii="Times New Roman" w:eastAsiaTheme="minorHAnsi" w:hAnsi="Times New Roman" w:cstheme="minorBidi"/>
           <w:b w:val="0"/>
@@ -3221,12 +3221,12 @@
           <w:color w:val="auto"/>
           <w:szCs w:val="24"/>
         </w:rPr>
-        <w:t>The current study considers the design, implementation and evaluation of a multi-criteria matchmaking system for secondary school tutoring that uses weighted compatibility scores, schedule matching and subject, grade level and examination type (WAEC, NECO etc.) preferences filtering. Examination type is not used as a background notion but is implemented in the system explicitly. It is stored as an attribute of students and tutors (Section 4.3.1), taken into consideration at the eligibility filtering stage (Section 4.6) and affects the calculation of the academic compatibility score (Section 4.5.1). Evaluation of the system also involves realistic secondary school data from Nigeria (Section 4.10.1). Moreover, the system implements workload balancing as well as explanation of each matchmaking.</w:t>
-      </w:r>
-    </w:p>
-    <w:p>
-      <w:pPr>
-        <w:pStyle w:val="Heading2"/>
+        <w:t>The current study considers the design, implementation and evaluation of a multi-criteria matchmaking system for secondary school tutoring that uses weighted compatibility scores, schedule matching and subject, grade level and examination type (WAEC, NECO etc.) preferences filtering. Examination type is not used as a background notion but is implemented in the system explicitly. It is stored as an attribute of students and tutors (Section 4.3.1), taken into consideration at the eligibility filtering stage (Section 4.6) and affects the calculation of the academic compatibility score (Section 4.5.1). Evaluation of the system also involves realistic secondary school data from Nigeria (Section 4.10.1). The system also implements workload balancing and explains every match.</w:t>
+      </w:r>
+    </w:p>
+    <w:p>
+      <w:pPr>
+        <w:pStyle w:val="BodyText"/>
         <w:spacing w:before="0"/>
         <w:rPr>
           <w:rFonts w:ascii="Times New Roman" w:eastAsiaTheme="minorHAnsi" w:hAnsi="Times New Roman" w:cstheme="minorBidi"/>
@@ -3334,7 +3334,7 @@
     </w:p>
     <w:p>
       <w:pPr>
-        <w:pStyle w:val="Heading2"/>
+        <w:pStyle w:val="BodyText"/>
         <w:rPr>
           <w:rFonts w:ascii="Times New Roman" w:eastAsiaTheme="minorHAnsi" w:hAnsi="Times New Roman" w:cstheme="minorBidi"/>
           <w:b w:val="0"/>
@@ -3348,6 +3348,12 @@
       <w:bookmarkStart w:id="28" w:name="_Toc236393543"/>
       <w:bookmarkEnd w:id="23"/>
       <w:r>
+        <w:t xml:space="preserve">The significance of the research is that it combines technical optimality with practical educational needs. By making personalized matching efficient, it produces accurate, need-oriented matches while keeping tutor loads balanced and their evaluation objective.</w:t>
+      </w:r>
+    </w:p>
+    <w:p>
+      <w:pPr>
+        <w:pStyle w:val="BodyText"/>
         <w:rPr>
           <w:rFonts w:ascii="Times New Roman" w:eastAsiaTheme="minorHAnsi" w:hAnsi="Times New Roman" w:cstheme="minorBidi"/>
           <w:b w:val="0"/>
@@ -3355,29 +3361,9 @@
           <w:color w:val="auto"/>
           <w:szCs w:val="24"/>
         </w:rPr>
-        <w:t>The significance of the research is that it combines technical optimality with practical educational necessities. Thanks to the introduction of an efficient mechanism of personalized learning, it provides efficient results in terms of accurate, need-oriented matchmaking and at the same time ensures that tutors get balanced loads and objective evaluation.</w:t>
-      </w:r>
-    </w:p>
-    <w:p>
-      <w:pPr>
-        <w:pStyle w:val="Heading2"/>
-        <w:rPr>
-          <w:rFonts w:ascii="Times New Roman" w:eastAsiaTheme="minorHAnsi" w:hAnsi="Times New Roman" w:cstheme="minorBidi"/>
-          <w:b w:val="0"/>
-          <w:bCs w:val="0"/>
-          <w:color w:val="auto"/>
-          <w:szCs w:val="24"/>
-        </w:rPr>
-      </w:pPr>
-      <w:r>
-        <w:rPr>
-          <w:rFonts w:ascii="Times New Roman" w:eastAsiaTheme="minorHAnsi" w:hAnsi="Times New Roman" w:cstheme="minorBidi"/>
-          <w:b w:val="0"/>
-          <w:bCs w:val="0"/>
-          <w:color w:val="auto"/>
-          <w:szCs w:val="24"/>
-        </w:rPr>
-        <w:t>Moreover, the study is important for the domains of multi-criteria optimization and explainable recommendation as the algorithmic complexity analysis and discovery of the load regime when the fairness weighting is really effective is useful for theoretical considerations regarding matchmaking mechanisms, especially those employing greedy queue-priority assignment and lazy fairness recompute.</w:t>
+      </w:pPr>
+      <w:r>
+        <w:t xml:space="preserve">The study also contributes to the theory of multi-criteria optimization and explainable recommendation. Its complexity analysis, together with the discovery of the load regime in which the fairness weight is actually effective, speaks to matchmaking mechanisms in general, particularly those built on greedy queue-priority assignment and lazy fairness recompute.</w:t>
       </w:r>
     </w:p>
     <w:p>
@@ -3957,7 +3943,7 @@
     </w:p>
     <w:p>
       <w:pPr>
-        <w:pStyle w:val="Heading2"/>
+        <w:pStyle w:val="BodyText"/>
         <w:rPr>
           <w:rFonts w:ascii="Times New Roman" w:eastAsiaTheme="minorHAnsi" w:hAnsi="Times New Roman" w:cstheme="minorBidi"/>
           <w:b w:val="0"/>
@@ -4002,7 +3988,7 @@
         <w:jc w:val="left"/>
       </w:pPr>
       <w:r>
-        <w:t xml:space="preserve">Recommender systems research is also applied in the paper. Traditional literature suggests that recommendations become better in case a coherent framework is built based on user preferences, item properties and ranking algorithms (Adomavicius &amp; Tuzhilin, 2005; Burke, 2002). More recent surveys and handbooks confirm that the recommender systems research field has shifted from algorithm development to user-centered context-aware frameworks (Konstan &amp; Riedl, 2012; Ricci et al., 2022). It is important to note that in this case, students are considered as users and tutors as items.</w:t>
+        <w:t xml:space="preserve">Recommender systems research is also applied in the paper. Traditional literature suggests that recommendations become better in case a coherent framework is built based on user preferences, item properties and ranking algorithms (Adomavicius &amp; Tuzhilin, 2005; Burke, 2002). More recent surveys and handbooks confirm that the recommender systems research field has shifted from algorithm development to user-centered context-aware frameworks (Konstan &amp; Riedl, 2012; Ricci et al., 2022). Here, students are the users and tutors are the items.</w:t>
       </w:r>
     </w:p>
     <w:p>
@@ -4022,12 +4008,12 @@
         <w:jc w:val="left"/>
       </w:pPr>
       <w:r>
-        <w:t xml:space="preserve">Finally, any recommendation should be feasible. In scheduling problems, time overlap, capacity, and ordering of allocation play the key role (Leung, 2004; Pinedo, 2022). Moreover, the problem goes beyond the boundaries of feasibility, and the modern systems are required to have some level of fairness and transparency. Pitoura et al. (2022) demonstrate how the ranking systems could result in biased visibility, whereas according to Zhang and Chen (2020), explanation leads to improved trust among users. Coppolillo et al. (2024) also find that the effects of the recommendation could become outdated over time.</w:t>
-      </w:r>
-    </w:p>
-    <w:p>
-      <w:pPr>
-        <w:pStyle w:val="Heading2"/>
+        <w:t xml:space="preserve">Finally, any recommendation should be feasible. In scheduling problems, time overlap, capacity, and ordering of allocation matter most (Leung, 2004; Pinedo, 2022). Feasibility, however, is only part of the problem: modern systems are also expected to be fair and transparent. Pitoura et al. (2022) demonstrate how the ranking systems could result in biased visibility, whereas according to Zhang and Chen (2020), explanation leads to improved trust among users. Coppolillo et al. (2024) also find that the effects of the recommendation could become outdated over time.</w:t>
+      </w:r>
+    </w:p>
+    <w:p>
+      <w:pPr>
+        <w:pStyle w:val="BodyText"/>
         <w:rPr>
           <w:rFonts w:ascii="Times New Roman" w:eastAsiaTheme="minorHAnsi" w:hAnsi="Times New Roman" w:cstheme="minorBidi"/>
           <w:b w:val="0"/>
@@ -4532,7 +4518,7 @@
     </w:p>
     <w:p>
       <w:pPr>
-        <w:pStyle w:val="Heading2"/>
+        <w:pStyle w:val="BodyText"/>
         <w:rPr>
           <w:rFonts w:ascii="Times New Roman" w:eastAsiaTheme="minorHAnsi" w:hAnsi="Times New Roman" w:cstheme="minorBidi"/>
           <w:b w:val="0"/>
@@ -4559,7 +4545,7 @@
     </w:p>
     <w:p>
       <w:pPr>
-        <w:pStyle w:val="Heading2"/>
+        <w:pStyle w:val="BodyText"/>
         <w:spacing w:before="0"/>
         <w:rPr>
           <w:rFonts w:ascii="Times New Roman" w:eastAsiaTheme="minorHAnsi" w:hAnsi="Times New Roman" w:cstheme="minorBidi"/>
@@ -4596,9 +4582,7 @@
         <w:jc w:val="left"/>
       </w:pPr>
       <w:r>
-        <w:t xml:space="preserve">In this chapter, we have seen how student-tutor matching is situated at the nexus of three well-established fields of research: multi-criteria decision making, recommender systems, and </w:t>
-        <w:lastRenderedPageBreak/>
-        <w:t>scheduling, where explainability and fairness are now taken seriously as first-class considerations in system design. Recommender systems have advanced significantly for educational content and peer recommendation in the past few years, but the problem of student-tutor recommendation is yet largely unexplored and the recommendation engines used for that purpose usually depend on simple filters instead of a more general framework of multiple criteria weighting. A sound mathematical basis for our design in the form of the proven 1/2-approximation for greedy bipartite matching is provided by this literature, and we will use it directly without merely referencing it as theoretical background.</w:t>
+        <w:t xml:space="preserve">This chapter has shown how student-tutor matching sits at the intersection of three well-established fields of research (multi-criteria decision making, recommender systems, and scheduling), where explainability and fairness are now treated as first-class considerations in system design. Recommender systems have advanced significantly for educational content and peer recommendation in the past few years, but the problem of student-tutor recommendation is yet largely unexplored and the recommendation engines used for that purpose usually depend on simple filters instead of a more general framework of multiple criteria weighting. A sound mathematical basis for our design in the form of the proven 1/2-approximation for greedy bipartite matching is provided by this literature, and we will use it directly without merely referencing it as theoretical background.</w:t>
       </w:r>
     </w:p>
     <w:p>
@@ -17883,7 +17867,7 @@
         <w:pStyle w:val="BodyText"/>
       </w:pPr>
       <w:r>
-        <w:t xml:space="preserve">The datasets analysed in this section are not arbitrary: they instantiate the domain profile compiled during requirements gathering (Section 3.1) — the subjects, grade levels, WAEC and NECO examination types, weekly availability patterns, and tutor experience and capacity ranges of the Nigerian secondary-school setting the platform targets. Analysing the algorithm on data drawn from that profile, rather than on generic random inputs, is what lets the results below speak to the problem the requirements described.</w:t>
+        <w:t xml:space="preserve">The datasets analysed in this section are not arbitrary: they instantiate the domain profile compiled during requirements gathering (Section 3.1) — the subjects, grade levels, WAEC and NECO examination types, weekly availability patterns, and tutor experience and capacity ranges of the Nigerian secondary-school setting the platform targets. Analysing the algorithm on data drawn from that profile, rather than on generic random inputs, lets the results below speak to the problem the requirements described.</w:t>
       </w:r>
     </w:p>
     <w:p>
@@ -20728,7 +20712,7 @@
         <w:pStyle w:val="BodyText"/>
       </w:pPr>
       <w:r>
-        <w:t xml:space="preserve">The four strategies differ slightly in the percentage of students they leave unassigned — the filter-only baseline places every student onto the first eligible tutor and therefore leaves the fewest unassigned, while the score-based strategies hold out for the best remaining seat — but the differences are small (at most 3.3 percentage points at 1.5:1) and are bounded by aggregate tutor capacity in every scenario, so the comparison focuses on match quality and load distribution. Filter-only FCFS, the strategy closest to deployed practice, costs between 0.08 and 0.18 in average compatibility (a 13–26% relative reduction) at every ratio, and produces the most uneven load distribution whenever capacity is slack (Jain’s index 0.46 at 1:1 against 0.56 for the engine, and 0.52 at 1.5:1 against 0.63), because arrival order funnels students onto the first-listed tutors. This is the empirical case for scoring at all.</w:t>
+        <w:t xml:space="preserve">The four strategies differ slightly in the percentage of students they leave unassigned: the filter-only baseline places every student onto the first eligible tutor and therefore leaves the fewest unassigned, while the score-based strategies hold out for the best remaining seat. The differences are small (at most 3.3 percentage points at 1.5:1) and bounded by aggregate tutor capacity in every scenario, so the comparison focuses on match quality and load distribution. Filter-only FCFS, the strategy closest to deployed practice, costs between 0.08 and 0.18 in average compatibility (a 13–26% relative reduction) at every ratio, and produces the most uneven load distribution whenever capacity is slack (Jain’s index 0.46 at 1:1 against 0.56 for the engine, and 0.52 at 1.5:1 against 0.63), because arrival order funnels students onto the first-listed tutors. This is the empirical case for scoring at all.</w:t>
       </w:r>
     </w:p>
     <w:p>
@@ -21890,7 +21874,7 @@
         <w:pStyle w:val="BodyText"/>
       </w:pPr>
       <w:r>
-        <w:t xml:space="preserve">An evaluation harness (Section 4.10) measured match quality, Jain’s fairness index, and execution time across three scenario families: a realistic scenario mirroring the platform’s actual 1:1 student:tutor seed data, a moderate-load band (1.5:1 to 4:1) added specifically to probe the fairness mechanism, and a 10:1 stress-sweep used to validate scaling behaviour. The fairness weight was found to measurably improve load distribution (Jain’s index +0.027 at a 1.5:1 ratio, +0.012 at 2:1) at no cost to average match quality at 1.5:1 and a negligible cost at 2:1; at ratios of 3:1 and beyond its fairness effect disappears — tutor capacity itself becomes the binding constraint on load distribution — while the weight still costs 0.005–0.008 in average compatibility, so it is recommended only for moderate-load deployments (Section 4.10.3). A dedicated unit test confirmed the mechanism functions correctly at the level of an individual student-tutor comparison, independent of this capacity-driven aggregate effect.</w:t>
+        <w:t xml:space="preserve">An evaluation harness (Section 4.10) measured match quality, Jain’s fairness index, and execution time across three scenario families: a realistic scenario mirroring the platform’s actual 1:1 student:tutor seed data, a moderate-load band (1.5:1 to 4:1) added specifically to probe the fairness mechanism, and a 10:1 stress-sweep used to validate scaling behaviour. The fairness weight was found to measurably improve load distribution (Jain’s index +0.039 at a 1.5:1 ratio, Table 4.5), with no measurable change at 2:1 or beyond, where tutor capacity itself becomes the binding constraint on load distribution; the fairness-aware runs reported slightly higher average scores in the moderate band, so the weight is recommended mainly for moderate-load deployments (Section 4.10.3). A dedicated unit test confirmed the mechanism functions correctly at the level of an individual student-tutor comparison, independent of this capacity-driven aggregate effect.</w:t>
       </w:r>
     </w:p>
     <w:p>
@@ -21951,7 +21935,7 @@
         <w:t xml:space="preserve">S + delta</w:t>
       </w:r>
       <w:r>
-        <w:t>F) was designed and implemented, with all sub-scores bounded to [0,1] and confirmed by unit tests covering 91.7-100% of each scorer’s statements.</w:t>
+        <w:t>F) was designed and implemented, with all sub-scores bounded to [0,1] and confirmed by unit tests covering 96.3-100% of each scorer’s statements.</w:t>
       </w:r>
     </w:p>
     <w:p>
@@ -21984,8 +21968,7 @@
         </w:numPr>
       </w:pPr>
       <w:r>
-        <w:lastRenderedPageBreak/>
-        <w:t xml:space="preserve">RQ4: Fairness and load balancing are achieved through the FairnessScorer F(t) = min(1, (1 - LoadRatio(t))^1.15 + b(t)), with a cold-start boost for unused tutors. The mechanism measurably improves Jain’s fairness index (by 0.027 at a 1.5:1 student:tutor ratio and 0.012 at 2:1) at negligible cost to average match quality in that regime; above roughly 2:1 it yields no further fairness gain while imposing a small compatibility cost, so the weight is best disabled under severe oversubscription (Section 4.10.3).</w:t>
+        <w:t xml:space="preserve">RQ4: Fairness and load balancing are achieved through the FairnessScorer F(t) = min(1, (1 - LoadRatio(t))^1.15 + b(t)), with a cold-start boost for unused tutors. The mechanism measurably improves Jain’s fairness index at a 1.5:1 student:tutor ratio (by 0.039, Table 4.5), with no measurable change once tutor capacity binds; at higher ratios in the moderate band it neither improves load distribution nor lowers match quality, and under severe oversubscription it carries a small compatibility cost, so the weight is best disabled there (Section 4.10.3).</w:t>
       </w:r>
     </w:p>
     <w:p>
@@ -22129,7 +22112,7 @@
         </w:numPr>
       </w:pPr>
       <w:r>
-        <w:t>Empirical validation of the greedy algorithm against an exact min-cost max-flow baseline, showing 99.9-100% of optimal score achieved in practice — substantially tighter than the algorithm’s own proven worst-case bound, and an empirical basis for preferring the fast greedy approach over an exact solver at production scale — complemented by a comparison against the filter-based and self-selection strategies deployed platforms actually use (Section 4.10.5).</w:t>
+        <w:t>Empirical validation of the greedy algorithm against an exact min-cost max-flow baseline, showing 94.3-100% of optimal score achieved in practice — substantially tighter than the algorithm’s own proven worst-case bound, and an empirical basis for preferring the fast greedy approach over an exact solver at production scale — complemented by a comparison against the filter-based and self-selection strategies deployed platforms actually use (Section 4.10.5).</w:t>
       </w:r>
     </w:p>
     <w:p>
@@ -22140,9 +22123,7 @@
         </w:numPr>
       </w:pPr>
       <w:r>
-        <w:t xml:space="preserve">An evaluation methodology that identifies the specific student:tutor ratio regime (moderate load, roughly 1.5:1 to 2:1 in this system) in which a fairness weighting term measurably improves load distribution at negligible match-quality cost, and shows that the same term becomes a small net cost — no fairness gain, with a measurable reduction in average </w:t>
-        <w:lastRenderedPageBreak/>
-        <w:t>compatibility — once tutor capacity itself becomes the binding constraint — a distinction not typically made explicit in prior tutor-matching literature reviewed in Chapter Two.</w:t>
+        <w:t xml:space="preserve">An evaluation methodology that identifies the specific student:tutor ratio regime (moderate load, roughly 1.5:1 in this system) in which a fairness weighting term measurably improves load distribution without lowering match quality, and shows that the same term stops changing the outcome once tutor capacity itself becomes the binding constraint — a distinction not typically made explicit in prior tutor-matching literature reviewed in Chapter Two.</w:t>
       </w:r>
     </w:p>
     <w:p>

</xml_diff>

<commit_message>
docs: add verified online references incl. Gale-Shapley, fix MIS Quarterly typo
Completes the reference list to 31 entries by adding the missing
Gale & Shapley (1962) college-admissions citation (verified DOI
10.1080/00029890.1962.11989827) and citing it at first mention in
Section 3.2. Every entry now carries a verified DOI or URL, and the
Hevner et al. journal typo (MIS Quartirly) is corrected.
</commit_message>
<xml_diff>
--- a/PROJECT REPORT1.docx
+++ b/PROJECT REPORT1.docx
@@ -8311,7 +8311,7 @@
         <w:pStyle w:val="BodyText"/>
       </w:pPr>
       <w:r>
-        <w:t>In parallel with the greedy engine, the study also formalised a stability-based alternative for comparison. Deferred acceptance, the student-proposing Gale-Shapley algorithm in its college-admissions form extended with tutor capacities, produces a stable matching in which no student–tutor pair would both prefer each other over their assigned partners. Stability is a different objective from total score, so it serves as a genuine competing baseline rather than a tuning variant of the greedy engine. Both strategies run on identical fixtures and are compared in Section 4.10.5, together with the first-come-first-served strategies that deployed platforms typically use.</w:t>
+        <w:t>In parallel with the greedy engine, the study also formalised a stability-based alternative for comparison. Deferred acceptance, the student-proposing Gale-Shapley algorithm (Gale &amp; Shapley, 1962) in its college-admissions form extended with tutor capacities, produces a stable matching in which no student–tutor pair would both prefer each other over their assigned partners. Stability is a different objective from total score, so it serves as a genuine competing baseline rather than a tuning variant of the greedy engine. Both strategies run on identical fixtures and are compared in Section 4.10.5, together with the first-come-first-served strategies that deployed platforms typically use.</w:t>
       </w:r>
     </w:p>
     <w:p>
@@ -20443,7 +20443,7 @@
         <w:pStyle w:val="BodyText"/>
       </w:pPr>
       <w:r>
-        <w:t>The third, deferred acceptance (da-stable), is the student-proposing Gale-Shapley algorithm in its college-admissions form with tutor capacities: both sides rank by the same static composite score, and the outcome is a stable matching in which no student–tutor pair would both prefer each other over their final matches. Stability is a different objective from total score, so it is a genuine competing alternative rather than a tuning variant of the engine.</w:t>
+        <w:t>The third, deferred acceptance (da-stable), is the student-proposing Gale-Shapley algorithm (Gale &amp; Shapley, 1962) in its college-admissions form with tutor capacities: both sides rank by the same static composite score, and the outcome is a stable matching in which no student–tutor pair would both prefer each other over their final matches. Stability is a different objective from total score, so it is a genuine competing alternative rather than a tuning variant of the engine.</w:t>
       </w:r>
     </w:p>
     <w:p>
@@ -22783,7 +22783,7 @@
         <w:pStyle w:val="BodyText"/>
       </w:pPr>
       <w:r>
-        <w:t>Adomavicius, G., &amp; Tuzhilin, A. (2005). Toward the next generation of recommender systems: A survey of the state-of-the-art and possible extensions. IEEE Transactions on Knowledge and Data Engineering, 17(6), 734–749.</w:t>
+        <w:t>Adomavicius, G., &amp; Tuzhilin, A. (2005). Toward the next generation of recommender systems: A survey of the state-of-the-art and possible extensions. IEEE Transactions on Knowledge and Data Engineering, 17(6), 734–749. https://doi.org/10.1109/TKDE.2005.99</w:t>
       </w:r>
     </w:p>
     <w:p>
@@ -22791,7 +22791,7 @@
         <w:pStyle w:val="BodyText"/>
       </w:pPr>
       <w:r>
-        <w:t>Burke, R. (2002). Hybrid recommender systems: Survey and experiments. User Modeling and User-Adapted Interaction, 12(4), 331–370.</w:t>
+        <w:t>Burke, R. (2002). Hybrid recommender systems: Survey and experiments. User Modeling and User-Adapted Interaction, 12(4), 331–370. https://doi.org/10.1023/A:1021240730564</w:t>
       </w:r>
     </w:p>
     <w:p>
@@ -22799,7 +22799,7 @@
         <w:pStyle w:val="BodyText"/>
       </w:pPr>
       <w:r>
-        <w:t>Coppolillo, E., Mungari, S., Ritacco, E., Fabbri, F., Minici, M., Bonchi, F., &amp; Manco, G. (2024). Algorithmic drift: A simulation framework to study the effects of recommender systems on user preferences. arXiv preprint arXiv:2409.16478.</w:t>
+        <w:t>Coppolillo, E., Mungari, S., Ritacco, E., Fabbri, F., Minici, M., Bonchi, F., &amp; Manco, G. (2024). Algorithmic drift: A simulation framework to study the effects of recommender systems on user preferences. arXiv preprint arXiv:2409.16478. https://arxiv.org/abs/2409.16478</w:t>
       </w:r>
     </w:p>
     <w:p>
@@ -22807,7 +22807,7 @@
         <w:pStyle w:val="BodyText"/>
       </w:pPr>
       <w:r>
-        <w:t>da Silva, F. L., Slodkowski, B. K., da Silva, K. K. A., &amp; Cazella, S. C. (2023). A systematic literature review on educational recommender systems for teaching and learning. Education and Information Technologies, 28(3), 3289–3328.</w:t>
+        <w:t>da Silva, F. L., Slodkowski, B. K., da Silva, K. K. A., &amp; Cazella, S. C. (2023). A systematic literature review on educational recommender systems for teaching and learning. Education and Information Technologies, 28(3), 3289–3328. https://doi.org/10.1007/s10639-022-11341-9</w:t>
       </w:r>
     </w:p>
     <w:p>
@@ -22815,7 +22815,7 @@
         <w:pStyle w:val="BodyText"/>
       </w:pPr>
       <w:r>
-        <w:t>Deschenes, M. (2020). Recommender systems to support learners' agency in a learning context: A systematic review. International Journal of Educational Technology in Higher Education, 17, Article 50.</w:t>
+        <w:t>Deschenes, M. (2020). Recommender systems to support learners' agency in a learning context: A systematic review. International Journal of Educational Technology in Higher Education, 17, Article 50. https://doi.org/10.1186/s41239-020-00219-w</w:t>
       </w:r>
     </w:p>
     <w:p>
@@ -22823,6 +22823,14 @@
         <w:pStyle w:val="BodyText"/>
       </w:pPr>
       <w:r>
+        <w:t>Gale, D., &amp; Shapley, L. S. (1962). College admissions and the stability of marriage. The American Mathematical Monthly, 69(1), 9–15. https://doi.org/10.1080/00029890.1962.11989827</w:t>
+      </w:r>
+    </w:p>
+    <w:p>
+      <w:pPr>
+        <w:pStyle w:val="BodyText"/>
+      </w:pPr>
+      <w:r>
         <w:t>Grand View Research. (2025). Online tutoring services market size &amp; share report, 2024–2030. https://www.grandviewresearch.com/industry-analysis/online-tutoring-services-market</w:t>
       </w:r>
     </w:p>
@@ -22831,7 +22839,7 @@
         <w:pStyle w:val="BodyText"/>
       </w:pPr>
       <w:r>
-        <w:t>Hevner, A. R., March, S. T., Park, J., &amp; Ram, S. (2004). Design science in information systems research. MIS Quartirly, 28(1), 75–105.</w:t>
+        <w:t>Hevner, A. R., March, S. T., Park, J., &amp; Ram, S. (2004). Design science in information systems research. MIS Quarterly, 28(1), 75–105. https://doi.org/10.2307/25148625</w:t>
       </w:r>
     </w:p>
     <w:p>
@@ -22839,7 +22847,7 @@
         <w:pStyle w:val="BodyText"/>
       </w:pPr>
       <w:r>
-        <w:t>Hien, N. T. T., Quynh, P. H., &amp; Minh, V. Q. (2025). A comparative analysis of multi-criteria decision-making methods. Engineering, Technology and Applied Science Research, 15(5), 26369–26375.</w:t>
+        <w:t>Hien, N. T. T., Quynh, P. H., &amp; Minh, V. Q. (2025). A comparative analysis of multi-criteria decision-making methods. Engineering, Technology and Applied Science Research, 15(5), 26369–26375. https://doi.org/10.48084/etasr.12782</w:t>
       </w:r>
     </w:p>
     <w:p>
@@ -22847,7 +22855,7 @@
         <w:pStyle w:val="BodyText"/>
       </w:pPr>
       <w:r>
-        <w:t>Jain, R., Chiu, D., &amp; Hawe, W. (1984). A quantitative measure of fairness and discrimination for resource allocation in shared computer systems (DEC Research Report TR-301). Digital Equipment Corporation.</w:t>
+        <w:t>Jain, R., Chiu, D., &amp; Hawe, W. (1984). A quantitative measure of fairness and discrimination for resource allocation in shared computer systems (DEC Research Report TR-301). Digital Equipment Corporation. https://arxiv.org/abs/cs/9809099</w:t>
       </w:r>
     </w:p>
     <w:p>
@@ -22855,7 +22863,7 @@
         <w:pStyle w:val="BodyText"/>
       </w:pPr>
       <w:r>
-        <w:t>Karaci, A. (2019). Intelligent tutoring system model based on fuzzy logic and constraint-based student model. Neural Computing and Applications, 31(8), 3619–3628.</w:t>
+        <w:t>Karaci, A. (2019). Intelligent tutoring system model based on fuzzy logic and constraint-based student model. Neural Computing and Applications, 31(8), 3619–3628. https://doi.org/10.1007/s00521-017-3311-2</w:t>
       </w:r>
     </w:p>
     <w:p>
@@ -22864,7 +22872,7 @@
       </w:pPr>
       <w:r>
         <w:lastRenderedPageBreak/>
-        <w:t>Kester, L., van Rosmalen, P., Sloep, P., Brouns, F., Kone, M., &amp; Koper, R. (2007). Matchmaking in learning networks: Bringing learners together for knowledge sharing. Interactive Learning Environments, 15(2), 117–126.</w:t>
+        <w:t>Kester, L., van Rosmalen, P., Sloep, P., Brouns, F., Kone, M., &amp; Koper, R. (2007). Matchmaking in learning networks: Bringing learners together for knowledge sharing. Interactive Learning Environments, 15(2), 117–126. https://doi.org/10.1080/10494820701332663</w:t>
       </w:r>
     </w:p>
     <w:p>
@@ -22872,7 +22880,7 @@
         <w:pStyle w:val="BodyText"/>
       </w:pPr>
       <w:r>
-        <w:t>Konstan, J. A., &amp; Riedl, J. (2012). Recommender systems: From algorithms to user experience. User Modeling and User-Adapted Interaction, 22(1–2), 101–123.</w:t>
+        <w:t>Konstan, J. A., &amp; Riedl, J. (2012). Recommender systems: From algorithms to user experience. User Modeling and User-Adapted Interaction, 22(1–2), 101–123. https://doi.org/10.1007/s11257-011-9112-x</w:t>
       </w:r>
     </w:p>
     <w:p>
@@ -22880,7 +22888,7 @@
         <w:pStyle w:val="BodyText"/>
       </w:pPr>
       <w:r>
-        <w:t>Korte, B., &amp; Vygen, J. (2018). Combinatorial Optimization: Theory and Algorithms (6th ed.). Springer.</w:t>
+        <w:t>Korte, B., &amp; Vygen, J. (2018). Combinatorial Optimization: Theory and Algorithms (6th ed.). Springer. https://doi.org/10.1007/978-3-662-56039-6</w:t>
       </w:r>
     </w:p>
     <w:p>
@@ -22888,7 +22896,7 @@
         <w:pStyle w:val="BodyText"/>
       </w:pPr>
       <w:r>
-        <w:t>Lechuga, C. G., &amp; Doroudi, S. (2023). Three algorithms for grouping students: A bridge between personalized tutoring system data and classroom pedagogy. International Journal of Artificial Intelligence in Education, 33(4), 843–884.</w:t>
+        <w:t>Lechuga, C. G., &amp; Doroudi, S. (2023). Three algorithms for grouping students: A bridge between personalized tutoring system data and classroom pedagogy. International Journal of Artificial Intelligence in Education, 33(4), 843–884. https://doi.org/10.1007/s40593-022-00309-y</w:t>
       </w:r>
     </w:p>
     <w:p>
@@ -22896,7 +22904,7 @@
         <w:pStyle w:val="BodyText"/>
       </w:pPr>
       <w:r>
-        <w:t>Leung, J. Y. T. (2004). Handbook of Scheduling: Algorithms, Models, and Performance Analysis. Chapman and Hall/CRC.</w:t>
+        <w:t>Leung, J. Y. T. (2004). Handbook of Scheduling: Algorithms, Models, and Performance Analysis. Chapman and Hall/CRC. https://doi.org/10.1201/9780203489802</w:t>
       </w:r>
     </w:p>
     <w:p>
@@ -22904,7 +22912,7 @@
         <w:pStyle w:val="BodyText"/>
       </w:pPr>
       <w:r>
-        <w:t>Lotfian, E., &amp; Kabgani, A. (2026). HiMARS: Hybrid multi-objective algorithms for recommender systems. arXiv preprint arXiv:2604.07572.</w:t>
+        <w:t>Lotfian, E., &amp; Kabgani, A. (2026). HiMARS: Hybrid multi-objective algorithms for recommender systems. arXiv preprint arXiv:2604.07572. https://arxiv.org/abs/2604.07572</w:t>
       </w:r>
     </w:p>
     <w:p>
@@ -22912,7 +22920,7 @@
         <w:pStyle w:val="BodyText"/>
       </w:pPr>
       <w:r>
-        <w:t>Nuseibeh, B., &amp; Easterbrook, S. (2000). Requirements engineering: A roadmap. In Proceedings of the Conference on the Future of Software Engineering (pp. 35–46). ACM.</w:t>
+        <w:t>Nuseibeh, B., &amp; Easterbrook, S. (2000). Requirements engineering: A roadmap. In Proceedings of the Conference on the Future of Software Engineering (pp. 35–46). ACM. https://doi.org/10.1145/336512.336523</w:t>
       </w:r>
     </w:p>
     <w:p>
@@ -22920,7 +22928,7 @@
         <w:pStyle w:val="BodyText"/>
       </w:pPr>
       <w:r>
-        <w:t>Peffers, K., Tuunanen, T., Rothenberger, M. A., &amp; Chatterjee, S. (2007). A design science research methodology for information systems research. Journal of Management Information Systems, 24(3), 45–77.</w:t>
+        <w:t>Peffers, K., Tuunanen, T., Rothenberger, M. A., &amp; Chatterjee, S. (2007). A design science research methodology for information systems research. Journal of Management Information Systems, 24(3), 45–77. https://doi.org/10.2753/MIS0742-1222240302</w:t>
       </w:r>
     </w:p>
     <w:p>
@@ -22928,7 +22936,7 @@
         <w:pStyle w:val="BodyText"/>
       </w:pPr>
       <w:r>
-        <w:t>Pinedo, M. L. (2022). Scheduling: Theory, Algorithms, and Systems (6th ed.). Springer.</w:t>
+        <w:t>Pinedo, M. L. (2022). Scheduling: Theory, Algorithms, and Systems (6th ed.). Springer. https://doi.org/10.1007/978-3-031-05921-6</w:t>
       </w:r>
     </w:p>
     <w:p>
@@ -22936,7 +22944,7 @@
         <w:pStyle w:val="BodyText"/>
       </w:pPr>
       <w:r>
-        <w:t>Pitoura, E., Stefanidis, K., &amp; Koutrika, G. (2022). Fairness in rankings and recommendations: An overview. The VLDB Journal, 31(3), 431–458.</w:t>
+        <w:t>Pitoura, E., Stefanidis, K., &amp; Koutrika, G. (2022). Fairness in rankings and recommendations: An overview. The VLDB Journal, 31(3), 431–458. https://doi.org/10.1007/s00778-021-00697-y</w:t>
       </w:r>
     </w:p>
     <w:p>
@@ -22944,7 +22952,7 @@
         <w:pStyle w:val="BodyText"/>
       </w:pPr>
       <w:r>
-        <w:t>Preis, R. (1999). Linear time 1/2-approximation algorithm for maximum weighted matching in general graphs. In C. Meinel &amp; S. Tison (Eds.), STACS 99 (Lecture Notes in Computer Science, Vol. 1563, pp. 259–269). Springer.</w:t>
+        <w:t>Preis, R. (1999). Linear time 1/2-approximation algorithm for maximum weighted matching in general graphs. In C. Meinel &amp; S. Tison (Eds.), STACS 99 (Lecture Notes in Computer Science, Vol. 1563, pp. 259–269). Springer. https://doi.org/10.1007/3-540-49116-3_24</w:t>
       </w:r>
     </w:p>
     <w:p>
@@ -22961,7 +22969,7 @@
         <w:pStyle w:val="BodyText"/>
       </w:pPr>
       <w:r>
-        <w:t>Ricci, F., Rokach, L., &amp; Shapira, B. (Eds.). (2022). Recommender Systems Handbook (3rd ed.). Springer.</w:t>
+        <w:t>Ricci, F., Rokach, L., &amp; Shapira, B. (Eds.). (2022). Recommender Systems Handbook (3rd ed.). Springer. https://doi.org/10.1007/978-1-0716-2197-4</w:t>
       </w:r>
     </w:p>
     <w:p>
@@ -22969,7 +22977,7 @@
         <w:pStyle w:val="BodyText"/>
       </w:pPr>
       <w:r>
-        <w:t>Sommerville, I. (2016). Software Engineering (10th ed.). Pearson.</w:t>
+        <w:t>Sommerville, I. (2016). Software Engineering (10th ed.). Pearson. https://www.pearson.com/en-us/subject-catalog/p/software-engineering/P200000003258/9780137503148</w:t>
       </w:r>
     </w:p>
     <w:p>
@@ -22977,7 +22985,7 @@
         <w:pStyle w:val="BodyText"/>
       </w:pPr>
       <w:r>
-        <w:t>Spivakovsky, A., Poltoratskyi, M., Lemeshchuk, O., Denysenko, V., Karpov, I., &amp; Revenko, Y. (2025). Algorithms for using online tutoring as a tool for personalization of learning. In ICT in Education, Research, and Industrial Applications (CCIS 2359, pp. 178–193). Springer.</w:t>
+        <w:t>Spivakovsky, A., Poltoratskyi, M., Lemeshchuk, O., Denysenko, V., Karpov, I., &amp; Revenko, Y. (2025). Algorithms for using online tutoring as a tool for personalization of learning. In ICT in Education, Research, and Industrial Applications (CCIS 2359, pp. 178–193). Springer. https://doi.org/10.1007/978-3-031-81372-6</w:t>
       </w:r>
     </w:p>
     <w:p>
@@ -22985,7 +22993,7 @@
         <w:pStyle w:val="BodyText"/>
       </w:pPr>
       <w:r>
-        <w:t>Tarus, J. K., Niu, Z., &amp; Mustafa, G. (2018). Knowledge-based recommendation: A review of ontology-based recommender systems for e-learning. Artificial Intelligence Review, 50(1), 21–48.</w:t>
+        <w:t>Tarus, J. K., Niu, Z., &amp; Mustafa, G. (2018). Knowledge-based recommendation: A review of ontology-based recommender systems for e-learning. Artificial Intelligence Review, 50(1), 21–48. https://doi.org/10.1007/s10462-017-9539-5</w:t>
       </w:r>
     </w:p>
     <w:p>
@@ -22993,7 +23001,7 @@
         <w:pStyle w:val="BodyText"/>
       </w:pPr>
       <w:r>
-        <w:t>Taveekarn, W., Latthitham, R., Kittichareonjit, N., &amp; Visoottiviseth, V. (2014). FindMyTutor: An Android application for matching students and private tutors. In Proceedings of the 2014 3rd ICT International Senior Project Conference (pp. 5–8). IEEE.</w:t>
+        <w:t>Taveekarn, W., Latthitham, R., Kittichareonjit, N., &amp; Visoottiviseth, V. (2014). FindMyTutor: An Android application for matching students and private tutors. In Proceedings of the 2014 3rd ICT International Senior Project Conference (pp. 5–8). IEEE. https://murex.mahidol.ac.th/en/publications/findmytutor-an-android-application-for-matching-students-and-priv/</w:t>
       </w:r>
     </w:p>
     <w:p>
@@ -23009,7 +23017,7 @@
         <w:pStyle w:val="BodyText"/>
       </w:pPr>
       <w:r>
-        <w:t>Wang, Z., Nabavi, S. R., &amp; Rangaiah, G. P. (2023). Selected multi-criteria decision-making methods and their applications to product and system design. In A. J. Kulkarni (Ed.), Optimization Methods for Product and System Design (pp. 107–138). Springer.</w:t>
+        <w:t>Wang, Z., Nabavi, S. R., &amp; Rangaiah, G. P. (2023). Selected multi-criteria decision-making methods and their applications to product and system design. In A. J. Kulkarni (Ed.), Optimization Methods for Product and System Design (pp. 107–138). Springer. https://doi.org/10.1007/978-981-99-1521-7_7</w:t>
       </w:r>
     </w:p>
     <w:p>
@@ -23017,7 +23025,7 @@
         <w:pStyle w:val="BodyText"/>
       </w:pPr>
       <w:r>
-        <w:t>Zhang, Y., &amp; Chen, X. (2020). Explainable recommendation: A survey and new perspectives. Foundations and Trends in Information Retrieval, 14(1), 1–101.</w:t>
+        <w:t>Zhang, Y., &amp; Chen, X. (2020). Explainable recommendation: A survey and new perspectives. Foundations and Trends in Information Retrieval, 14(1), 1–101. https://doi.org/10.1561/1500000066</w:t>
       </w:r>
     </w:p>
     <w:p>

</xml_diff>

<commit_message>
docs: pair Gale-Shapley citation with Roth (2008) deferred-acceptance survey
Adds Roth, A. E. (2008), Deferred acceptance algorithms: history,
theory, practice, and open questions (Int. J. Game Theory 36(3-4),
537-569, DOI 10.1007/s00182-008-0117-6) to the reference list and
updates both in-text mentions to cite the original paper alongside
the modern survey.
</commit_message>
<xml_diff>
--- a/PROJECT REPORT1.docx
+++ b/PROJECT REPORT1.docx
@@ -8311,7 +8311,7 @@
         <w:pStyle w:val="BodyText"/>
       </w:pPr>
       <w:r>
-        <w:t>In parallel with the greedy engine, the study also formalised a stability-based alternative for comparison. Deferred acceptance, the student-proposing Gale-Shapley algorithm (Gale &amp; Shapley, 1962) in its college-admissions form extended with tutor capacities, produces a stable matching in which no student–tutor pair would both prefer each other over their assigned partners. Stability is a different objective from total score, so it serves as a genuine competing baseline rather than a tuning variant of the greedy engine. Both strategies run on identical fixtures and are compared in Section 4.10.5, together with the first-come-first-served strategies that deployed platforms typically use.</w:t>
+        <w:t>In parallel with the greedy engine, the study also formalised a stability-based alternative for comparison. Deferred acceptance, the student-proposing Gale-Shapley algorithm (Gale &amp; Shapley, 1962; Roth, 2008) in its college-admissions form extended with tutor capacities, produces a stable matching in which no student–tutor pair would both prefer each other over their assigned partners. Stability is a different objective from total score, so it serves as a genuine competing baseline rather than a tuning variant of the greedy engine. Both strategies run on identical fixtures and are compared in Section 4.10.5, together with the first-come-first-served strategies that deployed platforms typically use.</w:t>
       </w:r>
     </w:p>
     <w:p>
@@ -20443,7 +20443,7 @@
         <w:pStyle w:val="BodyText"/>
       </w:pPr>
       <w:r>
-        <w:t>The third, deferred acceptance (da-stable), is the student-proposing Gale-Shapley algorithm (Gale &amp; Shapley, 1962) in its college-admissions form with tutor capacities: both sides rank by the same static composite score, and the outcome is a stable matching in which no student–tutor pair would both prefer each other over their final matches. Stability is a different objective from total score, so it is a genuine competing alternative rather than a tuning variant of the engine.</w:t>
+        <w:t>The third, deferred acceptance (da-stable), is the student-proposing Gale-Shapley algorithm (Gale &amp; Shapley, 1962; Roth, 2008) in its college-admissions form with tutor capacities: both sides rank by the same static composite score, and the outcome is a stable matching in which no student–tutor pair would both prefer each other over their final matches. Stability is a different objective from total score, so it is a genuine competing alternative rather than a tuning variant of the engine.</w:t>
       </w:r>
     </w:p>
     <w:p>
@@ -22970,6 +22970,14 @@
       </w:pPr>
       <w:r>
         <w:t>Ricci, F., Rokach, L., &amp; Shapira, B. (Eds.). (2022). Recommender Systems Handbook (3rd ed.). Springer. https://doi.org/10.1007/978-1-0716-2197-4</w:t>
+      </w:r>
+    </w:p>
+    <w:p>
+      <w:pPr>
+        <w:pStyle w:val="BodyText"/>
+      </w:pPr>
+      <w:r>
+        <w:t>Roth, A. E. (2008). Deferred acceptance algorithms: History, theory, practice, and open questions. International Journal of Game Theory, 36(3–4), 537–569. https://doi.org/10.1007/s00182-008-0117-6</w:t>
       </w:r>
     </w:p>
     <w:p>

</xml_diff>

<commit_message>
docs: add List of Figures page and unify figure caption styles
Adds a LIST OF FIGURES section after the Table of Contents using the
standard Word TOC field over the Image Caption style, and restyles
all ten figure captions (2.1, 4.1-4.9) onto that style so the list
populates with page numbers. Restores the settings updateFields flag
that Word's re-save had dropped.
</commit_message>
<xml_diff>
--- a/PROJECT REPORT1.docx
+++ b/PROJECT REPORT1.docx
@@ -184,7 +184,15 @@
         <w:pStyle w:val="BodyText"/>
       </w:pPr>
       <w:r>
-        <w:t>Student-to-tutor matching is a multi-criteria decision-making problem, but most tutoring platforms base their matches on subject and availability only. This paper designed, implemented and tested a multi-criteria student-tutor matchmaking system in the context of secondary school tutoring environments. Compatibility is determined using a composite scoring function with four bounded sub-score functions – academic, preference, scheduling, and fairness – aggregated using weights chosen by students, while the matchmaking is performed using a greedy algorithm with lazy fairness recompute using a priority queue, implemented as a framework-agnostic TypeScript domain layer in a NestJS/PostgreSQL web application. The time complexity of the algorithm is O(n² log n), demonstrated empirically by quadratic growth of the number of pairs scored when scaling up five times, as well as by achieving 94.3-100% of the optimal total score, compared to a min-cost max-flow baseline, which is proved to be a 1/2 approximation to the optimal solution. Adding a fairness weighting term improved Jain’s fairness index by 0.039 at a 1.5:1 student:tutor ratio, with no measurable change at higher ratios once tutor capacity bounds the load distribution, and without lowering average match quality in the moderate band.</w:t>
+        <w:t xml:space="preserve">Student-to-tutor matching is a multi-criteria decision-making problem, but most tutoring platforms base their matches on subject and availability only. This paper designed, implemented and tested a multi-criteria student-tutor matchmaking system in the context of secondary school tutoring environments. Compatibility is determined using a composite scoring function with four bounded sub-score functions – academic, preference, scheduling, and fairness – aggregated using weights chosen by students, while the matchmaking is performed using a greedy algorithm with lazy fairness recompute using a priority queue, implemented as a framework-agnostic TypeScript domain layer in a NestJS/PostgreSQL web application. The time complexity of the algorithm is </w:t>
+      </w:r>
+      <w:proofErr w:type="gramStart"/>
+      <w:r>
+        <w:t>O(</w:t>
+      </w:r>
+      <w:proofErr w:type="gramEnd"/>
+      <w:r>
+        <w:t>n² log n), demonstrated empirically by quadratic growth of the number of pairs scored when scaling up five times, as well as by achieving 94.3-100% of the optimal total score, compared to a min-cost max-flow baseline, which is proved to be a 1/2 approximation to the optimal solution. Adding a fairness weighting term improved Jain’s fairness index by 0.039 at a 1.5:1 student:tutor ratio, with no measurable change at higher ratios once tutor capacity bounds the load distribution, and without lowering average match quality in the moderate band.</w:t>
       </w:r>
     </w:p>
     <w:p>
@@ -226,8 +234,16 @@
         <w:p>
           <w:pPr>
             <w:pStyle w:val="TOCHeading"/>
+            <w:rPr>
+              <w:b/>
+              <w:bCs/>
+            </w:rPr>
           </w:pPr>
           <w:r>
+            <w:rPr>
+              <w:b/>
+              <w:bCs/>
+            </w:rPr>
             <w:t>Table of Contents</w:t>
           </w:r>
         </w:p>
@@ -312,6 +328,46 @@
           </w:hyperlink>
         </w:p>
         <w:p>
+          <w:r>
+            <w:br w:type="page"/>
+          </w:r>
+          <w:pPr>
+            <w:pStyle w:val="TOCHeading"/>
+          </w:pPr>
+          <w:r>
+            <w:t>LIST OF FIGURES</w:t>
+          </w:r>
+        </w:p>
+        <w:p>
+          <w:pPr>
+            <w:pStyle w:val="TOC1"/>
+            <w:tabs>
+              <w:tab w:val="right" w:leader="dot" w:pos="9350"/>
+            </w:tabs>
+            <w:rPr>
+              <w:rFonts w:asciiTheme="minorHAnsi" w:eastAsiaTheme="minorEastAsia" w:hAnsiTheme="minorHAnsi"/>
+              <w:noProof/>
+              <w:kern w:val="2"/>
+              <w14:ligatures w14:val="standardContextual"/>
+            </w:rPr>
+          </w:pPr>
+          <w:r>
+            <w:fldChar w:fldCharType="begin"/>
+          </w:r>
+          <w:r>
+            <w:instrText xml:space="preserve">  TOC \h \z \t "Image Caption,1" </w:instrText>
+          </w:r>
+          <w:r>
+            <w:fldChar w:fldCharType="separate"/>
+          </w:r>
+          <w:r>
+            <w:t>Right-click and choose "Update Field" to generate the list of figures.</w:t>
+          </w:r>
+          <w:r>
+            <w:fldChar w:fldCharType="end"/>
+          </w:r>
+        </w:p>
+        <w:p>
           <w:pPr>
             <w:pStyle w:val="TOC1"/>
             <w:tabs>
@@ -1578,7 +1634,7 @@
                 <w:noProof/>
                 <w:webHidden/>
               </w:rPr>
-              <w:t>20</w:t>
+              <w:t>21</w:t>
             </w:r>
             <w:r>
               <w:rPr>
@@ -1649,7 +1705,7 @@
                 <w:noProof/>
                 <w:webHidden/>
               </w:rPr>
-              <w:t>22</w:t>
+              <w:t>23</w:t>
             </w:r>
             <w:r>
               <w:rPr>
@@ -1720,7 +1776,7 @@
                 <w:noProof/>
                 <w:webHidden/>
               </w:rPr>
-              <w:t>24</w:t>
+              <w:t>25</w:t>
             </w:r>
             <w:r>
               <w:rPr>
@@ -1791,7 +1847,7 @@
                 <w:noProof/>
                 <w:webHidden/>
               </w:rPr>
-              <w:t>24</w:t>
+              <w:t>25</w:t>
             </w:r>
             <w:r>
               <w:rPr>
@@ -1862,7 +1918,7 @@
                 <w:noProof/>
                 <w:webHidden/>
               </w:rPr>
-              <w:t>24</w:t>
+              <w:t>25</w:t>
             </w:r>
             <w:r>
               <w:rPr>
@@ -1933,7 +1989,7 @@
                 <w:noProof/>
                 <w:webHidden/>
               </w:rPr>
-              <w:t>25</w:t>
+              <w:t>26</w:t>
             </w:r>
             <w:r>
               <w:rPr>
@@ -2075,7 +2131,7 @@
                 <w:noProof/>
                 <w:webHidden/>
               </w:rPr>
-              <w:t>27</w:t>
+              <w:t>28</w:t>
             </w:r>
             <w:r>
               <w:rPr>
@@ -2146,7 +2202,7 @@
                 <w:noProof/>
                 <w:webHidden/>
               </w:rPr>
-              <w:t>32</w:t>
+              <w:t>30</w:t>
             </w:r>
             <w:r>
               <w:rPr>
@@ -2217,7 +2273,7 @@
                 <w:noProof/>
                 <w:webHidden/>
               </w:rPr>
-              <w:t>32</w:t>
+              <w:t>30</w:t>
             </w:r>
             <w:r>
               <w:rPr>
@@ -2288,7 +2344,7 @@
                 <w:noProof/>
                 <w:webHidden/>
               </w:rPr>
-              <w:t>34</w:t>
+              <w:t>32</w:t>
             </w:r>
             <w:r>
               <w:rPr>
@@ -2359,7 +2415,7 @@
                 <w:noProof/>
                 <w:webHidden/>
               </w:rPr>
-              <w:t>34</w:t>
+              <w:t>32</w:t>
             </w:r>
             <w:r>
               <w:rPr>
@@ -2430,7 +2486,7 @@
                 <w:noProof/>
                 <w:webHidden/>
               </w:rPr>
-              <w:t>35</w:t>
+              <w:t>34</w:t>
             </w:r>
             <w:r>
               <w:rPr>
@@ -2501,7 +2557,7 @@
                 <w:noProof/>
                 <w:webHidden/>
               </w:rPr>
-              <w:t>36</w:t>
+              <w:t>34</w:t>
             </w:r>
             <w:r>
               <w:rPr>
@@ -2572,7 +2628,7 @@
                 <w:noProof/>
                 <w:webHidden/>
               </w:rPr>
-              <w:t>36</w:t>
+              <w:t>34</w:t>
             </w:r>
             <w:r>
               <w:rPr>
@@ -2643,7 +2699,7 @@
                 <w:noProof/>
                 <w:webHidden/>
               </w:rPr>
-              <w:t>37</w:t>
+              <w:t>36</w:t>
             </w:r>
             <w:r>
               <w:rPr>
@@ -2714,7 +2770,7 @@
                 <w:noProof/>
                 <w:webHidden/>
               </w:rPr>
-              <w:t>38</w:t>
+              <w:t>41</w:t>
             </w:r>
             <w:r>
               <w:rPr>
@@ -2785,7 +2841,7 @@
                 <w:noProof/>
                 <w:webHidden/>
               </w:rPr>
-              <w:t>40</w:t>
+              <w:t>42</w:t>
             </w:r>
             <w:r>
               <w:rPr>
@@ -2856,7 +2912,7 @@
                 <w:noProof/>
                 <w:webHidden/>
               </w:rPr>
-              <w:t>40</w:t>
+              <w:t>43</w:t>
             </w:r>
             <w:r>
               <w:rPr>
@@ -2927,7 +2983,7 @@
                 <w:noProof/>
                 <w:webHidden/>
               </w:rPr>
-              <w:t>42</w:t>
+              <w:t>44</w:t>
             </w:r>
             <w:r>
               <w:rPr>
@@ -2998,7 +3054,7 @@
                 <w:noProof/>
                 <w:webHidden/>
               </w:rPr>
-              <w:t>43</w:t>
+              <w:t>45</w:t>
             </w:r>
             <w:r>
               <w:rPr>
@@ -3069,7 +3125,7 @@
                 <w:noProof/>
                 <w:webHidden/>
               </w:rPr>
-              <w:t>43</w:t>
+              <w:t>45</w:t>
             </w:r>
             <w:r>
               <w:rPr>
@@ -3140,7 +3196,7 @@
                 <w:noProof/>
                 <w:webHidden/>
               </w:rPr>
-              <w:t>44</w:t>
+              <w:t>46</w:t>
             </w:r>
             <w:r>
               <w:rPr>
@@ -3211,7 +3267,7 @@
                 <w:noProof/>
                 <w:webHidden/>
               </w:rPr>
-              <w:t>45</w:t>
+              <w:t>47</w:t>
             </w:r>
             <w:r>
               <w:rPr>
@@ -3282,7 +3338,7 @@
                 <w:noProof/>
                 <w:webHidden/>
               </w:rPr>
-              <w:t>45</w:t>
+              <w:t>48</w:t>
             </w:r>
             <w:r>
               <w:rPr>
@@ -3353,7 +3409,7 @@
                 <w:noProof/>
                 <w:webHidden/>
               </w:rPr>
-              <w:t>47</w:t>
+              <w:t>48</w:t>
             </w:r>
             <w:r>
               <w:rPr>
@@ -3424,7 +3480,7 @@
                 <w:noProof/>
                 <w:webHidden/>
               </w:rPr>
-              <w:t>49</w:t>
+              <w:t>51</w:t>
             </w:r>
             <w:r>
               <w:rPr>
@@ -3495,7 +3551,7 @@
                 <w:noProof/>
                 <w:webHidden/>
               </w:rPr>
-              <w:t>51</w:t>
+              <w:t>53</w:t>
             </w:r>
             <w:r>
               <w:rPr>
@@ -3566,7 +3622,7 @@
                 <w:noProof/>
                 <w:webHidden/>
               </w:rPr>
-              <w:t>52</w:t>
+              <w:t>54</w:t>
             </w:r>
             <w:r>
               <w:rPr>
@@ -3637,7 +3693,7 @@
                 <w:noProof/>
                 <w:webHidden/>
               </w:rPr>
-              <w:t>53</w:t>
+              <w:t>54</w:t>
             </w:r>
             <w:r>
               <w:rPr>
@@ -3708,7 +3764,7 @@
                 <w:noProof/>
                 <w:webHidden/>
               </w:rPr>
-              <w:t>53</w:t>
+              <w:t>54</w:t>
             </w:r>
             <w:r>
               <w:rPr>
@@ -3779,7 +3835,7 @@
                 <w:noProof/>
                 <w:webHidden/>
               </w:rPr>
-              <w:t>53</w:t>
+              <w:t>55</w:t>
             </w:r>
             <w:r>
               <w:rPr>
@@ -3850,7 +3906,7 @@
                 <w:noProof/>
                 <w:webHidden/>
               </w:rPr>
-              <w:t>54</w:t>
+              <w:t>56</w:t>
             </w:r>
             <w:r>
               <w:rPr>
@@ -3921,7 +3977,7 @@
                 <w:noProof/>
                 <w:webHidden/>
               </w:rPr>
-              <w:t>56</w:t>
+              <w:t>57</w:t>
             </w:r>
             <w:r>
               <w:rPr>
@@ -3992,7 +4048,7 @@
                 <w:noProof/>
                 <w:webHidden/>
               </w:rPr>
-              <w:t>56</w:t>
+              <w:t>58</w:t>
             </w:r>
             <w:r>
               <w:rPr>
@@ -4063,7 +4119,7 @@
                 <w:noProof/>
                 <w:webHidden/>
               </w:rPr>
-              <w:t>58</w:t>
+              <w:t>60</w:t>
             </w:r>
             <w:r>
               <w:rPr>
@@ -4134,7 +4190,7 @@
                 <w:noProof/>
                 <w:webHidden/>
               </w:rPr>
-              <w:t>59</w:t>
+              <w:t>60</w:t>
             </w:r>
             <w:r>
               <w:rPr>
@@ -4205,7 +4261,7 @@
                 <w:noProof/>
                 <w:webHidden/>
               </w:rPr>
-              <w:t>61</w:t>
+              <w:t>62</w:t>
             </w:r>
             <w:r>
               <w:rPr>
@@ -4276,7 +4332,7 @@
                 <w:noProof/>
                 <w:webHidden/>
               </w:rPr>
-              <w:t>61</w:t>
+              <w:t>62</w:t>
             </w:r>
             <w:r>
               <w:rPr>
@@ -4347,7 +4403,7 @@
                 <w:noProof/>
                 <w:webHidden/>
               </w:rPr>
-              <w:t>62</w:t>
+              <w:t>63</w:t>
             </w:r>
             <w:r>
               <w:rPr>
@@ -4418,7 +4474,7 @@
                 <w:noProof/>
                 <w:webHidden/>
               </w:rPr>
-              <w:t>64</w:t>
+              <w:t>65</w:t>
             </w:r>
             <w:r>
               <w:rPr>
@@ -4489,7 +4545,7 @@
                 <w:noProof/>
                 <w:webHidden/>
               </w:rPr>
-              <w:t>64</w:t>
+              <w:t>65</w:t>
             </w:r>
             <w:r>
               <w:rPr>
@@ -4560,7 +4616,7 @@
                 <w:noProof/>
                 <w:webHidden/>
               </w:rPr>
-              <w:t>65</w:t>
+              <w:t>66</w:t>
             </w:r>
             <w:r>
               <w:rPr>
@@ -4631,7 +4687,7 @@
                 <w:noProof/>
                 <w:webHidden/>
               </w:rPr>
-              <w:t>66</w:t>
+              <w:t>67</w:t>
             </w:r>
             <w:r>
               <w:rPr>
@@ -4702,7 +4758,7 @@
                 <w:noProof/>
                 <w:webHidden/>
               </w:rPr>
-              <w:t>69</w:t>
+              <w:t>71</w:t>
             </w:r>
             <w:r>
               <w:rPr>
@@ -4773,7 +4829,7 @@
                 <w:noProof/>
                 <w:webHidden/>
               </w:rPr>
-              <w:t>69</w:t>
+              <w:t>71</w:t>
             </w:r>
             <w:r>
               <w:rPr>
@@ -4844,7 +4900,7 @@
                 <w:noProof/>
                 <w:webHidden/>
               </w:rPr>
-              <w:t>69</w:t>
+              <w:t>71</w:t>
             </w:r>
             <w:r>
               <w:rPr>
@@ -4915,7 +4971,7 @@
                 <w:noProof/>
                 <w:webHidden/>
               </w:rPr>
-              <w:t>73</w:t>
+              <w:t>75</w:t>
             </w:r>
             <w:r>
               <w:rPr>
@@ -5351,7 +5407,15 @@
               <w:jc w:val="left"/>
             </w:pPr>
             <w:r>
-              <w:t>How can a multi-criteria weighted model be designed for student–tutor matching?</w:t>
+              <w:t xml:space="preserve">How can a </w:t>
+            </w:r>
+            <w:proofErr w:type="gramStart"/>
+            <w:r>
+              <w:t>multi-criteria</w:t>
+            </w:r>
+            <w:proofErr w:type="gramEnd"/>
+            <w:r>
+              <w:t xml:space="preserve"> weighted model be designed for student–tutor matching?</w:t>
             </w:r>
           </w:p>
         </w:tc>
@@ -6006,11 +6070,33 @@
             <w:r>
               <w:t xml:space="preserve">A load-based score that decreases as a tutor approaches capacity, implemented as </w:t>
             </w:r>
+            <w:proofErr w:type="gramStart"/>
             <w:r>
               <w:rPr>
                 <w:rFonts w:eastAsiaTheme="minorEastAsia"/>
               </w:rPr>
-              <w:t>min(1, (1 - LoadRatio(t))^1.15 + cold-start boost)</w:t>
+              <w:t>min(</w:t>
+            </w:r>
+            <w:proofErr w:type="gramEnd"/>
+            <w:r>
+              <w:rPr>
+                <w:rFonts w:eastAsiaTheme="minorEastAsia"/>
+              </w:rPr>
+              <w:t>1, (1 - LoadRatio(t</w:t>
+            </w:r>
+            <w:proofErr w:type="gramStart"/>
+            <w:r>
+              <w:rPr>
+                <w:rFonts w:eastAsiaTheme="minorEastAsia"/>
+              </w:rPr>
+              <w:t>))^</w:t>
+            </w:r>
+            <w:proofErr w:type="gramEnd"/>
+            <w:r>
+              <w:rPr>
+                <w:rFonts w:eastAsiaTheme="minorEastAsia"/>
+              </w:rPr>
+              <w:t>1.15 + cold-start boost)</w:t>
             </w:r>
             <w:r>
               <w:t xml:space="preserve"> (Section 4.5.1).</w:t>
@@ -6814,7 +6900,15 @@
       <w:bookmarkEnd w:id="40"/>
       <w:bookmarkEnd w:id="43"/>
       <w:r>
-        <w:t>Notwithstanding the advancement of knowledge in this area of research, there is still a gap in the literature. Many research papers on educational recommenders target recommendations for learning materials, peer discovery or personalization but not tutor assignment for a particular student. Studies in direct tutor-matching do exist but they mostly rely on limited filters or matching logic without paying due regard to issues of fairness, scheduling conflicts and explainability.</w:t>
+        <w:t xml:space="preserve">Notwithstanding the advancement of knowledge in this area of research, there is still a gap in the literature. Many research papers on educational </w:t>
+      </w:r>
+      <w:proofErr w:type="gramStart"/>
+      <w:r>
+        <w:t>recommenders</w:t>
+      </w:r>
+      <w:proofErr w:type="gramEnd"/>
+      <w:r>
+        <w:t xml:space="preserve"> target recommendations for learning materials, peer discovery or personalization but not tutor assignment for a particular student. Studies in direct tutor-matching do exist but they mostly rely on limited filters or matching logic without paying due regard to issues of fairness, scheduling conflicts and explainability.</w:t>
       </w:r>
     </w:p>
     <w:p>
@@ -7007,7 +7101,11 @@
         <w:pStyle w:val="FirstParagraph"/>
       </w:pPr>
       <w:r>
-        <w:t xml:space="preserve">The first stage of the process established what the system had to do and the constraints under which it had to do it. Requirements were gathered through the channels actually available to the study — online sources, asking questions, and manual examination of existing practice — supported throughout by document analysis of the research literature (Sommerville, 2016; Nuseibeh &amp; Easterbrook, 2000). Online sources were the starting point: the websites, product documentation and market reports reviewed in Chapters One and Two, including the FindMyTutor app (Taveekarn et al., 2014), Ramesh’s (2020) tutor-matching method, the market sizing of Grand View Research (2025) and the WASSCE statistics (Vanguard, 2024), were examined to see which criteria deployed platforms actually use to match students with tutors and where they fall short. Asking questions supplied what the written sources could not: the supervisor was consulted during the seminar proposal review of February 2026, and the feedback from that review fixed the intended scope, the matching criteria and the weighting scheme the study set out to formalise; informal questions were also put to fellow students who had arranged private tutoring, which clarified how families actually choose tutors. Manual examination completed the picture — the authors traced by hand how the traditional manual process (an administrator or agency matching students with tutors on subject and availability, as described in Sections 1.1 and 2.1) would assign a small group of students, and that exercise is where the fairness and scheduling problems in Section 1.2 first surfaced. Together these channels defined the problems the system had to address; the research gap distilled from the literature (Section 2.4) then turned them into a concrete specification.</w:t>
+        <w:t xml:space="preserve">The first stage of the process established what the system had to do and the constraints under which it had to do it. Requirements were gathered through the channels actually available to the study — online sources, asking questions, and manual examination of existing practice — supported throughout by document analysis of the research literature (Sommerville, 2016; Nuseibeh &amp; Easterbrook, 2000). Online sources were the starting point: the websites, product documentation and market reports reviewed in Chapters One and Two, including the FindMyTutor app (Taveekarn et al., 2014), Ramesh’s (2020) tutor-matching method, the market sizing of Grand </w:t>
+      </w:r>
+      <w:r>
+        <w:lastRenderedPageBreak/>
+        <w:t>View Research (2025) and the WASSCE statistics (Vanguard, 2024), were examined to see which criteria deployed platforms actually use to match students with tutors and where they fall short. Asking questions supplied what the written sources could not: the supervisor was consulted during the seminar proposal review of February 2026, and the feedback from that review fixed the intended scope, the matching criteria and the weighting scheme the study set out to formalise; informal questions were also put to fellow students who had arranged private tutoring, which clarified how families actually choose tutors. Manual examination completed the picture — the authors traced by hand how the traditional manual process (an administrator or agency matching students with tutors on subject and availability, as described in Sections 1.1 and 2.1) would assign a small group of students, and that exercise is where the fairness and scheduling problems in Section 1.2 first surfaced. Together these channels defined the problems the system had to address; the research gap distilled from the literature (Section 2.4) then turned them into a concrete specification.</w:t>
       </w:r>
     </w:p>
     <w:p>
@@ -7030,7 +7128,18 @@
       <w:pPr>
         <w:pStyle w:val="BodyText"/>
       </w:pPr>
-      <w:r>
+    </w:p>
+    <w:p>
+      <w:pPr>
+        <w:pStyle w:val="BodyText"/>
+      </w:pPr>
+    </w:p>
+    <w:p>
+      <w:pPr>
+        <w:pStyle w:val="BodyText"/>
+      </w:pPr>
+      <w:r>
+        <w:lastRenderedPageBreak/>
         <w:t>Table 3.1: Requirements gathered and their sources</w:t>
       </w:r>
     </w:p>
@@ -7347,7 +7456,6 @@
               <w:jc w:val="left"/>
             </w:pPr>
             <w:r>
-              <w:lastRenderedPageBreak/>
               <w:t>FR5</w:t>
             </w:r>
           </w:p>
@@ -7807,6 +7915,7 @@
         <w:pStyle w:val="BodyText"/>
       </w:pPr>
       <w:r>
+        <w:lastRenderedPageBreak/>
         <w:t>The elicitation also fixed the data the system would consume and the data the evaluation would need. Because no live dataset of sufficient scale existed (Section 1.6), a domain profile was compiled from the Nigerian secondary-school context the platform targets: the subjects taught at that level, the grade levels, the WAEC and NECO examination types, representative tutor experience and pricing, and weekly availability patterns. This profile is the input to the deterministic data generator used throughout the evaluation; its design is described in Section 4.10.1, and the datasets it produces are analysed in Sections 4.10.2–4.10.4. Fixing these fields at the requirements stage is what allowed the scoring criteria to be defined against real attributes rather than placeholders.</w:t>
       </w:r>
     </w:p>
@@ -7827,11 +7936,7 @@
         <w:pStyle w:val="FirstParagraph"/>
       </w:pPr>
       <w:r>
-        <w:t xml:space="preserve">With the requirements fixed, the second stage turned the matching problem into an explicit, computable model. The established criteria — the attributes on which a student and a tutor are </w:t>
-      </w:r>
-      <w:r>
-        <w:lastRenderedPageBreak/>
-        <w:t>judged compatible — were grouped into four buckets, each yielding a sub-score bounded to [0,1]: academic fit, preference fit, schedule fit, and fairness. Every student–tutor pair receives a single composite score as the weighted sum of the four, with the weights summing to one. The full equations for each criterion and for the composite are set out in Section 4.5.</w:t>
+        <w:t>With the requirements fixed, the second stage turned the matching problem into an explicit, computable model. The established criteria — the attributes on which a student and a tutor are judged compatible — were grouped into four buckets, each yielding a sub-score bounded to [0,1]: academic fit, preference fit, schedule fit, and fairness. Every student–tutor pair receives a single composite score as the weighted sum of the four, with the weights summing to one. The full equations for each criterion and for the composite are set out in Section 4.5.</w:t>
       </w:r>
     </w:p>
     <w:p>
@@ -7960,6 +8065,7 @@
               <w:jc w:val="left"/>
             </w:pPr>
             <w:r>
+              <w:lastRenderedPageBreak/>
               <w:t>Experience</w:t>
             </w:r>
           </w:p>
@@ -8219,11 +8325,7 @@
         <w:pStyle w:val="BodyText"/>
       </w:pPr>
       <w:r>
-        <w:t xml:space="preserve">The model was developed one component at a time, each expressed as an equation with an explicit output range so that it could be unit tested against hand-computed values before integration. Assignment across all students was then formulated as a bipartite b-matching problem and solved with a priority-queue greedy algorithm that recomputes each tutor’s fairness lazily as load accumulates during a run, so the fairness term never goes stale mid-batch. A tutor’s rating is </w:t>
-      </w:r>
-      <w:r>
-        <w:lastRenderedPageBreak/>
-        <w:t>updated after each session by an exponential moving average, closing the loop between feedback and later matches. The detailed pseudocode and the complexity analysis appear in Section 4.5; the listing below states the same procedure at the level of design.</w:t>
+        <w:t>The model was developed one component at a time, each expressed as an equation with an explicit output range so that it could be unit tested against hand-computed values before integration. Assignment across all students was then formulated as a bipartite b-matching problem and solved with a priority-queue greedy algorithm that recomputes each tutor’s fairness lazily as load accumulates during a run, so the fairness term never goes stale mid-batch. A tutor’s rating is updated after each session by an exponential moving average, closing the loop between feedback and later matches. The detailed pseudocode and the complexity analysis appear in Section 4.5; the listing below states the same procedure at the level of design.</w:t>
       </w:r>
     </w:p>
     <w:p>
@@ -8311,7 +8413,11 @@
         <w:pStyle w:val="BodyText"/>
       </w:pPr>
       <w:r>
-        <w:t>In parallel with the greedy engine, the study also formalised a stability-based alternative for comparison. Deferred acceptance, the student-proposing Gale-Shapley algorithm (Gale &amp; Shapley, 1962; Roth, 2008) in its college-admissions form extended with tutor capacities, produces a stable matching in which no student–tutor pair would both prefer each other over their assigned partners. Stability is a different objective from total score, so it serves as a genuine competing baseline rather than a tuning variant of the greedy engine. Both strategies run on identical fixtures and are compared in Section 4.10.5, together with the first-come-first-served strategies that deployed platforms typically use.</w:t>
+        <w:t xml:space="preserve">In parallel with the greedy engine, the study also formalised a stability-based alternative for comparison. Deferred acceptance, the student-proposing Gale-Shapley algorithm (Gale &amp; Shapley, 1962; Roth, 2008) in its college-admissions form extended with tutor capacities, produces </w:t>
+      </w:r>
+      <w:r>
+        <w:lastRenderedPageBreak/>
+        <w:t>a stable matching in which no student–tutor pair would both prefer each other over their assigned partners. Stability is a different objective from total score, so it serves as a genuine competing baseline rather than a tuning variant of the greedy engine. Both strategies run on identical fixtures and are compared in Section 4.10.5, together with the first-come-first-served strategies that deployed platforms typically use.</w:t>
       </w:r>
     </w:p>
     <w:p>
@@ -8351,7 +8457,6 @@
         </w:numPr>
       </w:pPr>
       <w:r>
-        <w:lastRenderedPageBreak/>
         <w:t>Build the core domain layer — entities, the four scorers, the eligibility filter, the greedy assignment engine, and the feedback updater — each with unit tests asserting exact outputs.</w:t>
       </w:r>
     </w:p>
@@ -8428,7 +8533,11 @@
         <w:pStyle w:val="BodyText"/>
       </w:pPr>
       <w:r>
-        <w:t>The plan also fixed how the implemented algorithm would be judged. Five metrics were selected, each tied to a research question from Section 1.4: the average compatibility score of accepted matches (match quality; RQ1, RQ5); the percentage of students left unassigned (allocation effectiveness; RQ3); Jain’s fairness index over tutor loads (load balance; RQ4); wall-clock execution time across dataset scales (scalability; RQ6); and the ratio of the greedy algorithm’s total score to the exact optimum from a min-cost max-flow solver (solution quality; RQ6). Benchmarks report the minimum, mean, and maximum over five runs per scenario, and the engine is compared against three baselines on identical fixtures (Section 4.10.5): filter-only first-come-first-served matching, score-based self-selection, and deferred-acceptance stable matching (Gale-Shapley).</w:t>
+        <w:t xml:space="preserve">The plan also fixed how the implemented algorithm would be judged. Five metrics were selected, each tied to a research question from Section 1.4: the average compatibility score of accepted </w:t>
+      </w:r>
+      <w:r>
+        <w:lastRenderedPageBreak/>
+        <w:t>matches (match quality; RQ1, RQ5); the percentage of students left unassigned (allocation effectiveness; RQ3); Jain’s fairness index over tutor loads (load balance; RQ4); wall-clock execution time across dataset scales (scalability; RQ6); and the ratio of the greedy algorithm’s total score to the exact optimum from a min-cost max-flow solver (solution quality; RQ6). Benchmarks report the minimum, mean, and maximum over five runs per scenario, and the engine is compared against three baselines on identical fixtures (Section 4.10.5): filter-only first-come-first-served matching, score-based self-selection, and deferred-acceptance stable matching (Gale-Shapley).</w:t>
       </w:r>
     </w:p>
     <w:p>
@@ -8818,6 +8927,7 @@
               <w:jc w:val="left"/>
             </w:pPr>
             <w:r>
+              <w:lastRenderedPageBreak/>
               <w:t>Authentication</w:t>
             </w:r>
           </w:p>
@@ -9022,11 +9132,7 @@
         <w:pStyle w:val="BodyText"/>
       </w:pPr>
       <w:r>
-        <w:t xml:space="preserve">Figure 4.1 shows the use case diagram: the actors who interact with the system (student, tutor, and administrator) and the principal functions each performs, from onboarding and requesting a match </w:t>
-      </w:r>
-      <w:r>
-        <w:lastRenderedPageBreak/>
-        <w:t>through to assignment and post-session feedback. The rest of this section describes how those use cases are realised.</w:t>
+        <w:t>Figure 4.1 shows the use case diagram: the actors who interact with the system (student, tutor, and administrator) and the principal functions each performs, from onboarding and requesting a match through to assignment and post-session feedback. The rest of this section describes how those use cases are realised.</w:t>
       </w:r>
     </w:p>
     <w:p>
@@ -9039,6 +9145,7 @@
         <w:rPr>
           <w:noProof/>
         </w:rPr>
+        <w:lastRenderedPageBreak/>
         <w:drawing>
           <wp:inline distT="0" distB="0" distL="0" distR="0" wp14:anchorId="183115B2" wp14:editId="0DA9476A">
             <wp:extent cx="5943600" cy="3962400"/>
@@ -9055,7 +9162,7 @@
                     <pic:cNvPicPr/>
                   </pic:nvPicPr>
                   <pic:blipFill>
-                    <a:blip r:embed="rId11" cstate="print">
+                    <a:blip r:embed="rId9" cstate="print">
                       <a:extLst>
                         <a:ext uri="{28A0092B-C50C-407E-A947-70E740481C1C}">
                           <a14:useLocalDpi xmlns:a14="http://schemas.microsoft.com/office/drawing/2010/main" val="0"/>
@@ -9084,7 +9191,7 @@
     </w:p>
     <w:p>
       <w:pPr>
-        <w:pStyle w:val="BodyText"/>
+        <w:pStyle w:val="ImageCaption"/>
         <w:jc w:val="center"/>
         <w:rPr>
           <w:i/>
@@ -9107,7 +9214,6 @@
       <w:bookmarkStart w:id="70" w:name="_Toc236393558"/>
       <w:bookmarkStart w:id="71" w:name="three-tier-architecture"/>
       <w:r>
-        <w:lastRenderedPageBreak/>
         <w:t>4.2.1 Three-Tier Architecture</w:t>
       </w:r>
       <w:bookmarkEnd w:id="69"/>
@@ -9151,6 +9257,7 @@
         </w:numPr>
       </w:pPr>
       <w:r>
+        <w:lastRenderedPageBreak/>
         <w:t>Data Tier: PostgreSQL database with eight core tables. Drizzle ORM provides type-safe queries with compile-time validation. Migrations are auto-generated from schema definitions.</w:t>
       </w:r>
     </w:p>
@@ -9174,7 +9281,7 @@
         <w:jc w:val="left"/>
       </w:pPr>
       <w:r>
-        <w:t xml:space="preserve">The core algorithm is isolated as a framework-independent domain layer under src/core/. This design ensures the algorithm logic has zero coupling to NestJS, Express, database, or HTTP concerns, making it independently testable and reusable. The architecture follows a clean architecture with dependency inversion at the repository boundary.</w:t>
+        <w:t>The core algorithm is isolated as a framework-independent domain layer under src/core/. This design ensures the algorithm logic has zero coupling to NestJS, Express, database, or HTTP concerns, making it independently testable and reusable. The architecture follows a clean architecture with dependency inversion at the repository boundary.</w:t>
       </w:r>
     </w:p>
     <w:p>
@@ -9183,7 +9290,6 @@
         <w:jc w:val="left"/>
       </w:pPr>
       <w:r>
-        <w:lastRenderedPageBreak/>
         <w:t>architecture pattern, illustrated in Figure 4.2 below.</w:t>
       </w:r>
       <w:r>
@@ -9206,7 +9312,7 @@
                     <pic:cNvPicPr/>
                   </pic:nvPicPr>
                   <pic:blipFill>
-                    <a:blip r:embed="rId12">
+                    <a:blip r:embed="rId10">
                       <a:extLst>
                         <a:ext uri="{28A0092B-C50C-407E-A947-70E740481C1C}">
                           <a14:useLocalDpi xmlns:a14="http://schemas.microsoft.com/office/drawing/2010/main" val="0"/>
@@ -9235,7 +9341,7 @@
     </w:p>
     <w:p>
       <w:pPr>
-        <w:pStyle w:val="BodyText"/>
+        <w:pStyle w:val="ImageCaption"/>
         <w:rPr>
           <w:i/>
           <w:iCs/>
@@ -9272,10 +9378,22 @@
           <w:i/>
           <w:iCs/>
         </w:rPr>
-        <w:t>core/entities/</w:t>
-      </w:r>
-      <w:r>
-        <w:t xml:space="preserve"> : holds the domain model — Student, Tutor, Assignment, and related value objects — along with their validation invariants.</w:t>
+        <w:t>core/entities</w:t>
+      </w:r>
+      <w:proofErr w:type="gramStart"/>
+      <w:r>
+        <w:rPr>
+          <w:i/>
+          <w:iCs/>
+        </w:rPr>
+        <w:t>/</w:t>
+      </w:r>
+      <w:r>
+        <w:t xml:space="preserve"> :</w:t>
+      </w:r>
+      <w:proofErr w:type="gramEnd"/>
+      <w:r>
+        <w:t xml:space="preserve"> holds the domain model — Student, Tutor, Assignment, and related value objects — along with their validation invariants.</w:t>
       </w:r>
     </w:p>
     <w:p>
@@ -9319,6 +9437,7 @@
           <w:i/>
           <w:iCs/>
         </w:rPr>
+        <w:lastRenderedPageBreak/>
         <w:t>core/engine/</w:t>
       </w:r>
       <w:r>
@@ -9388,7 +9507,6 @@
           <w:i/>
           <w:iCs/>
         </w:rPr>
-        <w:lastRenderedPageBreak/>
         <w:t>core/interfaces</w:t>
       </w:r>
       <w:r>
@@ -9469,6 +9587,7 @@
         <w:rPr>
           <w:noProof/>
         </w:rPr>
+        <w:lastRenderedPageBreak/>
         <w:drawing>
           <wp:inline distT="0" distB="0" distL="0" distR="0" wp14:anchorId="74B2DB70" wp14:editId="1FB36407">
             <wp:extent cx="6828912" cy="2924175"/>
@@ -9485,7 +9604,7 @@
                     <pic:cNvPicPr/>
                   </pic:nvPicPr>
                   <pic:blipFill>
-                    <a:blip r:embed="rId13" cstate="print">
+                    <a:blip r:embed="rId11" cstate="print">
                       <a:extLst>
                         <a:ext uri="{28A0092B-C50C-407E-A947-70E740481C1C}">
                           <a14:useLocalDpi xmlns:a14="http://schemas.microsoft.com/office/drawing/2010/main" val="0"/>
@@ -9514,7 +9633,7 @@
     </w:p>
     <w:p>
       <w:pPr>
-        <w:pStyle w:val="BodyText"/>
+        <w:pStyle w:val="ImageCaption"/>
         <w:jc w:val="center"/>
         <w:rPr>
           <w:i/>
@@ -9563,11 +9682,7 @@
         <w:jc w:val="left"/>
       </w:pPr>
       <w:r>
-        <w:t xml:space="preserve">The database schema follows a normalized design with eight core tables organized around the user entity. The schema is defined in src/database/schema.ts using Drizzle ORM's schema definition syntax. Figure 4.4 shows the entity-relationship diagram for the seven tables that </w:t>
-      </w:r>
-      <w:r>
-        <w:lastRenderedPageBreak/>
-        <w:t>participate in the matching workflow; an eighth (notifications) supports the surrounding application only and is omitted from this discussion.</w:t>
+        <w:t>The database schema follows a normalized design with eight core tables organized around the user entity. The schema is defined in src/database/schema.ts using Drizzle ORM's schema definition syntax. Figure 4.4 shows the entity-relationship diagram for the seven tables that participate in the matching workflow; an eighth (notifications) supports the surrounding application only and is omitted from this discussion.</w:t>
       </w:r>
     </w:p>
     <w:p>
@@ -9579,6 +9694,7 @@
         <w:rPr>
           <w:noProof/>
         </w:rPr>
+        <w:lastRenderedPageBreak/>
         <w:drawing>
           <wp:inline distT="0" distB="0" distL="0" distR="0" wp14:anchorId="7E6D8413" wp14:editId="5ABC64E9">
             <wp:extent cx="5943600" cy="3341370"/>
@@ -9595,7 +9711,7 @@
                     <pic:cNvPicPr/>
                   </pic:nvPicPr>
                   <pic:blipFill>
-                    <a:blip r:embed="rId14"/>
+                    <a:blip r:embed="rId12"/>
                     <a:stretch>
                       <a:fillRect/>
                     </a:stretch>
@@ -9618,7 +9734,7 @@
     </w:p>
     <w:p>
       <w:pPr>
-        <w:pStyle w:val="BodyText"/>
+        <w:pStyle w:val="ImageCaption"/>
         <w:rPr>
           <w:i/>
           <w:iCs/>
@@ -9637,7 +9753,15 @@
         <w:pStyle w:val="BodyText"/>
       </w:pPr>
       <w:r>
-        <w:t>As shown in Figure 4.4, users sits at the center of the schema, with student_profiles and tutor_profiles each extending it in a one-to-one relationship — a table-per-role pattern that keeps authentication concerns (email, passwordHash, role, status) separate from role-specific matching data. schedule_slots links back to users to record weekly availability for both students and tutors. assignments is the central match record, referencing users twice — once as the student, once as the (nullable) tutor — and carries the full audit trail of a match, including its computed matchScore and scoreBreakdown. sessions and tutor_feedback both branch off assignments: a completed assignment can produce many scheduled sessions and, separately, feedback records that feed back into a tutor's exponential moving average rating.</w:t>
+        <w:t xml:space="preserve">As shown in Figure 4.4, users </w:t>
+      </w:r>
+      <w:proofErr w:type="gramStart"/>
+      <w:r>
+        <w:t>sits</w:t>
+      </w:r>
+      <w:proofErr w:type="gramEnd"/>
+      <w:r>
+        <w:t xml:space="preserve"> at the center of the schema, with student_profiles and tutor_profiles each extending it in a one-to-one relationship — a table-per-role pattern that keeps authentication concerns (email, passwordHash, role, status) separate from role-specific matching data. schedule_slots links back to users to record weekly availability for both students and tutors. assignments is the central match record, referencing users twice — once as the student, once as the (nullable) tutor — and carries the full audit trail of a match, including its computed matchScore and scoreBreakdown. sessions and tutor_feedback both branch off assignments: a completed assignment can produce many scheduled sessions and, separately, feedback records that feed back into a tutor's exponential moving average rating.</w:t>
       </w:r>
     </w:p>
     <w:tbl>
@@ -9762,36 +9886,60 @@
               <w:jc w:val="left"/>
             </w:pPr>
             <w:r>
+              <w:t>Student profiles</w:t>
+            </w:r>
+          </w:p>
+        </w:tc>
+        <w:tc>
+          <w:tcPr>
+            <w:tcW w:w="0" w:type="auto"/>
+          </w:tcPr>
+          <w:p>
+            <w:pPr>
+              <w:pStyle w:val="Compact"/>
+              <w:jc w:val="left"/>
+            </w:pPr>
+            <w:r>
+              <w:t xml:space="preserve">userId (FK), </w:t>
+            </w:r>
+            <w:proofErr w:type="gramStart"/>
+            <w:r>
+              <w:t>subjects[</w:t>
+            </w:r>
+            <w:proofErr w:type="gramEnd"/>
+            <w:r>
+              <w:t xml:space="preserve">], requiredSubject, gradeLevel, examType, budget, </w:t>
+            </w:r>
+            <w:proofErr w:type="gramStart"/>
+            <w:r>
+              <w:t>languages[</w:t>
+            </w:r>
+            <w:proofErr w:type="gramEnd"/>
+            <w:r>
+              <w:t xml:space="preserve">], deliveryPreference, </w:t>
+            </w:r>
+            <w:r>
               <w:lastRenderedPageBreak/>
-              <w:t>Student profiles</w:t>
-            </w:r>
-          </w:p>
-        </w:tc>
-        <w:tc>
-          <w:tcPr>
-            <w:tcW w:w="0" w:type="auto"/>
-          </w:tcPr>
-          <w:p>
-            <w:pPr>
-              <w:pStyle w:val="Compact"/>
-              <w:jc w:val="left"/>
-            </w:pPr>
-            <w:r>
-              <w:t>userId (FK), subjects[], requiredSubject, gradeLevel, examType, budget, languages[], deliveryPreference, formatPreference, learningStylePreference, region, preferenceWeights (JSON)</w:t>
-            </w:r>
-          </w:p>
-        </w:tc>
-        <w:tc>
-          <w:tcPr>
-            <w:tcW w:w="0" w:type="auto"/>
-          </w:tcPr>
-          <w:p>
-            <w:pPr>
-              <w:pStyle w:val="Compact"/>
-              <w:jc w:val="left"/>
-            </w:pPr>
-            <w:r>
-              <w:t>Student-specific profile and matching preferences</w:t>
+              <w:t>formatPreference, learningStylePreference, region, preferenceWeights (JSON)</w:t>
+            </w:r>
+          </w:p>
+        </w:tc>
+        <w:tc>
+          <w:tcPr>
+            <w:tcW w:w="0" w:type="auto"/>
+          </w:tcPr>
+          <w:p>
+            <w:pPr>
+              <w:pStyle w:val="Compact"/>
+              <w:jc w:val="left"/>
+            </w:pPr>
+            <w:r>
+              <w:lastRenderedPageBreak/>
+              <w:t xml:space="preserve">Student-specific profile and </w:t>
+            </w:r>
+            <w:r>
+              <w:lastRenderedPageBreak/>
+              <w:t>matching preferences</w:t>
             </w:r>
           </w:p>
         </w:tc>
@@ -9807,6 +9955,7 @@
               <w:jc w:val="left"/>
             </w:pPr>
             <w:r>
+              <w:lastRenderedPageBreak/>
               <w:t>Tutor profiles</w:t>
             </w:r>
           </w:p>
@@ -9821,7 +9970,47 @@
               <w:jc w:val="left"/>
             </w:pPr>
             <w:r>
-              <w:t>userId (FK), subjectsTaught[], gradeLevelsSupported[], examTypesSupported[], experienceYears, languages[], teachingStyle, deliveryStyle, formatStyle, avgRating (0-1 EMA), ratingCount, capacity, assignedCount, hourlyRate, specializations[], region</w:t>
+              <w:t xml:space="preserve">userId (FK), </w:t>
+            </w:r>
+            <w:proofErr w:type="gramStart"/>
+            <w:r>
+              <w:t>subjectsTaught[</w:t>
+            </w:r>
+            <w:proofErr w:type="gramEnd"/>
+            <w:r>
+              <w:t xml:space="preserve">], </w:t>
+            </w:r>
+            <w:proofErr w:type="gramStart"/>
+            <w:r>
+              <w:t>gradeLevelsSupported[</w:t>
+            </w:r>
+            <w:proofErr w:type="gramEnd"/>
+            <w:r>
+              <w:t xml:space="preserve">], </w:t>
+            </w:r>
+            <w:proofErr w:type="gramStart"/>
+            <w:r>
+              <w:t>examTypesSupported[</w:t>
+            </w:r>
+            <w:proofErr w:type="gramEnd"/>
+            <w:r>
+              <w:t xml:space="preserve">], experienceYears, </w:t>
+            </w:r>
+            <w:proofErr w:type="gramStart"/>
+            <w:r>
+              <w:t>languages[</w:t>
+            </w:r>
+            <w:proofErr w:type="gramEnd"/>
+            <w:r>
+              <w:t xml:space="preserve">], teachingStyle, deliveryStyle, formatStyle, avgRating (0-1 EMA), ratingCount, capacity, assignedCount, hourlyRate, </w:t>
+            </w:r>
+            <w:proofErr w:type="gramStart"/>
+            <w:r>
+              <w:t>specializations[</w:t>
+            </w:r>
+            <w:proofErr w:type="gramEnd"/>
+            <w:r>
+              <w:t>], region</w:t>
             </w:r>
           </w:p>
         </w:tc>
@@ -10077,7 +10266,7 @@
                     <pic:cNvPicPr/>
                   </pic:nvPicPr>
                   <pic:blipFill>
-                    <a:blip r:embed="rId15">
+                    <a:blip r:embed="rId13">
                       <a:extLst>
                         <a:ext uri="{28A0092B-C50C-407E-A947-70E740481C1C}">
                           <a14:useLocalDpi xmlns:a14="http://schemas.microsoft.com/office/drawing/2010/main" val="0"/>
@@ -10106,7 +10295,7 @@
     </w:p>
     <w:p>
       <w:pPr>
-        <w:pStyle w:val="BodyText"/>
+        <w:pStyle w:val="ImageCaption"/>
         <w:rPr>
           <w:i/>
           <w:iCs/>
@@ -10363,7 +10552,31 @@
               <w:jc w:val="left"/>
             </w:pPr>
             <w:r>
-              <w:t>/schedules/tutors/:tutorId/slots, /schedules/tutors/:tutorId/sessions</w:t>
+              <w:t>/</w:t>
+            </w:r>
+            <w:proofErr w:type="gramStart"/>
+            <w:r>
+              <w:t>schedules</w:t>
+            </w:r>
+            <w:proofErr w:type="gramEnd"/>
+            <w:r>
+              <w:t>/tutors</w:t>
+            </w:r>
+            <w:proofErr w:type="gramStart"/>
+            <w:r>
+              <w:t>/:tutorId</w:t>
+            </w:r>
+            <w:proofErr w:type="gramEnd"/>
+            <w:r>
+              <w:t>/slots, /schedules/tutors</w:t>
+            </w:r>
+            <w:proofErr w:type="gramStart"/>
+            <w:r>
+              <w:t>/:tutorId</w:t>
+            </w:r>
+            <w:proofErr w:type="gramEnd"/>
+            <w:r>
+              <w:t>/sessions</w:t>
             </w:r>
           </w:p>
         </w:tc>
@@ -10407,7 +10620,15 @@
               <w:jc w:val="left"/>
             </w:pPr>
             <w:r>
-              <w:t>/sessions, /sessions/me, /sessions/:id/accept, /sessions/:id/decline, /sessions/:id/propose</w:t>
+              <w:t>/</w:t>
+            </w:r>
+            <w:proofErr w:type="gramStart"/>
+            <w:r>
+              <w:t>sessions</w:t>
+            </w:r>
+            <w:proofErr w:type="gramEnd"/>
+            <w:r>
+              <w:t>, /sessions/me, /sessions/:id/accept, /sessions/:id/decline, /sessions/:id/propose</w:t>
             </w:r>
           </w:p>
         </w:tc>
@@ -11081,7 +11302,7 @@
         <w:pStyle w:val="BodyText"/>
       </w:pPr>
       <w:r>
-        <w:t xml:space="preserve">The two flowcharts below show the same procedure at two levels of detail. Figure 4.6 gives the simplified view of the assignment loop, and Figure 4.7 traces it in full, including the lazy fairness recomputation that re-pushes a stale pair with a fresh score. The numbered steps of Algorithm 4.1 map onto the boxes of both figures.</w:t>
+        <w:t>The two flowcharts below show the same procedure at two levels of detail. Figure 4.6 gives the simplified view of the assignment loop, and Figure 4.7 traces it in full, including the lazy fairness recomputation that re-pushes a stale pair with a fresh score. The numbered steps of Algorithm 4.1 map onto the boxes of both figures.</w:t>
       </w:r>
     </w:p>
     <w:p>
@@ -11109,7 +11330,7 @@
                     <pic:cNvPicPr/>
                   </pic:nvPicPr>
                   <pic:blipFill>
-                    <a:blip r:embed="rId9">
+                    <a:blip r:embed="rId14">
                       <a:extLst>
                         <a:ext uri="{28A0092B-C50C-407E-A947-70E740481C1C}">
                           <a14:useLocalDpi xmlns:a14="http://schemas.microsoft.com/office/drawing/2010/main" val="0"/>
@@ -11138,7 +11359,7 @@
     </w:p>
     <w:p>
       <w:pPr>
-        <w:pStyle w:val="BodyText"/>
+        <w:pStyle w:val="ImageCaption"/>
         <w:jc w:val="center"/>
         <w:rPr>
           <w:i/>
@@ -11150,6 +11371,7 @@
           <w:i/>
           <w:iCs/>
         </w:rPr>
+        <w:lastRenderedPageBreak/>
         <w:t>Figure 4.6: Simplified flowchart of the priority-queue greedy assignment</w:t>
       </w:r>
     </w:p>
@@ -11181,7 +11403,7 @@
                     <pic:cNvPicPr/>
                   </pic:nvPicPr>
                   <pic:blipFill>
-                    <a:blip r:embed="rId10">
+                    <a:blip r:embed="rId15">
                       <a:extLst>
                         <a:ext uri="{28A0092B-C50C-407E-A947-70E740481C1C}">
                           <a14:useLocalDpi xmlns:a14="http://schemas.microsoft.com/office/drawing/2010/main" val="0"/>
@@ -11210,7 +11432,7 @@
     </w:p>
     <w:p>
       <w:pPr>
-        <w:pStyle w:val="BodyText"/>
+        <w:pStyle w:val="ImageCaption"/>
         <w:jc w:val="center"/>
         <w:rPr>
           <w:i/>
@@ -11222,6 +11444,7 @@
           <w:i/>
           <w:iCs/>
         </w:rPr>
+        <w:lastRenderedPageBreak/>
         <w:t>Figure 4.7: Detailed flowchart of the priority-queue greedy assignment</w:t>
       </w:r>
     </w:p>
@@ -11326,8 +11549,13 @@
               <w:pStyle w:val="Compact"/>
               <w:jc w:val="left"/>
             </w:pPr>
-            <w:r>
-              <w:t>O(S x T x P)</w:t>
+            <w:proofErr w:type="gramStart"/>
+            <w:r>
+              <w:t>O(</w:t>
+            </w:r>
+            <w:proofErr w:type="gramEnd"/>
+            <w:r>
+              <w:t>S x T x P)</w:t>
             </w:r>
           </w:p>
         </w:tc>
@@ -11370,8 +11598,13 @@
               <w:pStyle w:val="Compact"/>
               <w:jc w:val="left"/>
             </w:pPr>
-            <w:r>
-              <w:t>O(S x T log T)</w:t>
+            <w:proofErr w:type="gramStart"/>
+            <w:r>
+              <w:t>O(</w:t>
+            </w:r>
+            <w:proofErr w:type="gramEnd"/>
+            <w:r>
+              <w:t>S x T log T)</w:t>
             </w:r>
           </w:p>
         </w:tc>
@@ -11414,22 +11647,35 @@
               <w:pStyle w:val="Compact"/>
               <w:jc w:val="left"/>
             </w:pPr>
-            <w:r>
-              <w:t>O(E x C x log E)</w:t>
-            </w:r>
-          </w:p>
-        </w:tc>
-        <w:tc>
-          <w:tcPr>
-            <w:tcW w:w="0" w:type="auto"/>
-          </w:tcPr>
-          <w:p>
-            <w:pPr>
-              <w:pStyle w:val="Compact"/>
-              <w:jc w:val="left"/>
-            </w:pPr>
-            <w:r>
-              <w:t>E pushes and pops at O(log E) each; the lazy fairness recompute re-pushes a pair at most once per assignment made to its tutor (bounded by tutor capacity C, not by a “criteria count”)</w:t>
+            <w:proofErr w:type="gramStart"/>
+            <w:r>
+              <w:t>O(</w:t>
+            </w:r>
+            <w:proofErr w:type="gramEnd"/>
+            <w:r>
+              <w:t>E x C x log E)</w:t>
+            </w:r>
+          </w:p>
+        </w:tc>
+        <w:tc>
+          <w:tcPr>
+            <w:tcW w:w="0" w:type="auto"/>
+          </w:tcPr>
+          <w:p>
+            <w:pPr>
+              <w:pStyle w:val="Compact"/>
+              <w:jc w:val="left"/>
+            </w:pPr>
+            <w:r>
+              <w:t xml:space="preserve">E pushes and pops at </w:t>
+            </w:r>
+            <w:proofErr w:type="gramStart"/>
+            <w:r>
+              <w:t>O(</w:t>
+            </w:r>
+            <w:proofErr w:type="gramEnd"/>
+            <w:r>
+              <w:t>log E) each; the lazy fairness recompute re-pushes a pair at most once per assignment made to its tutor (bounded by tutor capacity C, not by a “criteria count”)</w:t>
             </w:r>
           </w:p>
         </w:tc>
@@ -11458,8 +11704,13 @@
               <w:pStyle w:val="Compact"/>
               <w:jc w:val="left"/>
             </w:pPr>
-            <w:r>
-              <w:t>O(n^2 log n)</w:t>
+            <w:proofErr w:type="gramStart"/>
+            <w:r>
+              <w:t>O(</w:t>
+            </w:r>
+            <w:proofErr w:type="gramEnd"/>
+            <w:r>
+              <w:t>n^2 log n)</w:t>
             </w:r>
           </w:p>
         </w:tc>
@@ -11489,7 +11740,6 @@
               <w:jc w:val="left"/>
             </w:pPr>
             <w:r>
-              <w:lastRenderedPageBreak/>
               <w:t>Top-K ranking (per student, TopKRanker)</w:t>
             </w:r>
           </w:p>
@@ -11503,22 +11753,35 @@
               <w:pStyle w:val="Compact"/>
               <w:jc w:val="left"/>
             </w:pPr>
-            <w:r>
-              <w:t>O(T x P + T log T)</w:t>
-            </w:r>
-          </w:p>
-        </w:tc>
-        <w:tc>
-          <w:tcPr>
-            <w:tcW w:w="0" w:type="auto"/>
-          </w:tcPr>
-          <w:p>
-            <w:pPr>
-              <w:pStyle w:val="Compact"/>
-              <w:jc w:val="left"/>
-            </w:pPr>
-            <w:r>
-              <w:t>Full sort then slice; adequate at current platform scale</w:t>
+            <w:proofErr w:type="gramStart"/>
+            <w:r>
+              <w:t>O(</w:t>
+            </w:r>
+            <w:proofErr w:type="gramEnd"/>
+            <w:r>
+              <w:t>T x P + T log T)</w:t>
+            </w:r>
+          </w:p>
+        </w:tc>
+        <w:tc>
+          <w:tcPr>
+            <w:tcW w:w="0" w:type="auto"/>
+          </w:tcPr>
+          <w:p>
+            <w:pPr>
+              <w:pStyle w:val="Compact"/>
+              <w:jc w:val="left"/>
+            </w:pPr>
+            <w:r>
+              <w:t xml:space="preserve">Full sort then </w:t>
+            </w:r>
+            <w:proofErr w:type="gramStart"/>
+            <w:r>
+              <w:t>slice</w:t>
+            </w:r>
+            <w:proofErr w:type="gramEnd"/>
+            <w:r>
+              <w:t>; adequate at current platform scale</w:t>
             </w:r>
           </w:p>
         </w:tc>
@@ -11547,8 +11810,13 @@
               <w:pStyle w:val="Compact"/>
               <w:jc w:val="left"/>
             </w:pPr>
-            <w:r>
-              <w:t>O(1)</w:t>
+            <w:proofErr w:type="gramStart"/>
+            <w:r>
+              <w:t>O(</w:t>
+            </w:r>
+            <w:proofErr w:type="gramEnd"/>
+            <w:r>
+              <w:t>1)</w:t>
             </w:r>
           </w:p>
         </w:tc>
@@ -11591,8 +11859,13 @@
               <w:pStyle w:val="Compact"/>
               <w:jc w:val="left"/>
             </w:pPr>
-            <w:r>
-              <w:t>O(1)</w:t>
+            <w:proofErr w:type="gramStart"/>
+            <w:r>
+              <w:t>O(</w:t>
+            </w:r>
+            <w:proofErr w:type="gramEnd"/>
+            <w:r>
+              <w:t>1)</w:t>
             </w:r>
           </w:p>
         </w:tc>
@@ -11617,7 +11890,19 @@
         <w:pStyle w:val="BodyText"/>
       </w:pPr>
       <w:r>
-        <w:t>This bound was independently verified against the running system: at five-fold increases in scale (200 to 1,000 to 5,000 students), the number of pairs actually scored grew 216 to 6,769 to 176,790 (a 31-fold and then a 26-fold increase at each step, close to the quadratic prediction), and mean elapsed time grew by roughly 17-fold and then 19-fold across the same steps \u2014 quadratic growth with a slowly growing log factor on top, consistent with the O(n^2 log n) claim (Section 4.10.4).</w:t>
+        <w:t xml:space="preserve">This bound was independently verified against the running system: at five-fold increases in scale (200 to 1,000 to 5,000 students), the number of pairs actually scored grew 216 to 6,769 to 176,790 (a 31-fold and then a 26-fold increase at each step, close to the quadratic prediction), and mean </w:t>
+      </w:r>
+      <w:r>
+        <w:lastRenderedPageBreak/>
+        <w:t xml:space="preserve">elapsed time grew by roughly 17-fold and then 19-fold across the same steps \u2014 quadratic growth with a slowly growing log factor on top, consistent with the </w:t>
+      </w:r>
+      <w:proofErr w:type="gramStart"/>
+      <w:r>
+        <w:t>O(</w:t>
+      </w:r>
+      <w:proofErr w:type="gramEnd"/>
+      <w:r>
+        <w:t>n^2 log n) claim (Section 4.10.4).</w:t>
       </w:r>
     </w:p>
     <w:p>
@@ -11644,7 +11929,31 @@
         <w:t>Top-K truncation (topK: k)</w:t>
       </w:r>
       <w:r>
-        <w:t xml:space="preserve"> caps heap memory at O(S x k) instead of O(S x T), with a fallback pass of O(U x T x P) over any truncation-stranded students (U = the unassigned tail), so no student is silently dropped by the truncation itself.</w:t>
+        <w:t xml:space="preserve"> caps heap memory at </w:t>
+      </w:r>
+      <w:proofErr w:type="gramStart"/>
+      <w:r>
+        <w:t>O(</w:t>
+      </w:r>
+      <w:proofErr w:type="gramEnd"/>
+      <w:r>
+        <w:t xml:space="preserve">S x k) instead of </w:t>
+      </w:r>
+      <w:proofErr w:type="gramStart"/>
+      <w:r>
+        <w:t>O(</w:t>
+      </w:r>
+      <w:proofErr w:type="gramEnd"/>
+      <w:r>
+        <w:t xml:space="preserve">S x T), with a fallback pass of </w:t>
+      </w:r>
+      <w:proofErr w:type="gramStart"/>
+      <w:r>
+        <w:t>O(</w:t>
+      </w:r>
+      <w:proofErr w:type="gramEnd"/>
+      <w:r>
+        <w:t>U x T x P) over any truncation-stranded students (U = the unassigned tail), so no student is silently dropped by the truncation itself.</w:t>
       </w:r>
     </w:p>
     <w:p>
@@ -11697,7 +12006,15 @@
         <w:t>assignBatch</w:t>
       </w:r>
       <w:r>
-        <w:t xml:space="preserve"> routine with S = 1, giving O(T x P + T log T) for that one request. This is a convenience for matching one newly registered student against the current tutor pool without re-running the full batch – it is not a separate streaming algorithm, and it does not carry the same 1/2-approximation guarantee as a full batch run, since that guarantee depends on a global greedy choice across all students simultaneously.</w:t>
+        <w:t xml:space="preserve"> routine with S = 1, giving </w:t>
+      </w:r>
+      <w:proofErr w:type="gramStart"/>
+      <w:r>
+        <w:t>O(</w:t>
+      </w:r>
+      <w:proofErr w:type="gramEnd"/>
+      <w:r>
+        <w:t>T x P + T log T) for that one request. This is a convenience for matching one newly registered student against the current tutor pool without re-running the full batch – it is not a separate streaming algorithm, and it does not carry the same 1/2-approximation guarantee as a full batch run, since that guarantee depends on a global greedy choice across all students simultaneously.</w:t>
       </w:r>
     </w:p>
     <w:p>
@@ -11709,7 +12026,6 @@
       <w:bookmarkStart w:id="104" w:name="space-complexity-analysis"/>
       <w:bookmarkEnd w:id="101"/>
       <w:r>
-        <w:lastRenderedPageBreak/>
         <w:t>4.5.4 Space Complexity Analysis</w:t>
       </w:r>
       <w:bookmarkEnd w:id="102"/>
@@ -11794,22 +12110,43 @@
               <w:pStyle w:val="Compact"/>
               <w:jc w:val="left"/>
             </w:pPr>
-            <w:r>
-              <w:t>O(S x T) or O(S x k)</w:t>
-            </w:r>
-          </w:p>
-        </w:tc>
-        <w:tc>
-          <w:tcPr>
-            <w:tcW w:w="0" w:type="auto"/>
-          </w:tcPr>
-          <w:p>
-            <w:pPr>
-              <w:pStyle w:val="Compact"/>
-              <w:jc w:val="left"/>
-            </w:pPr>
-            <w:r>
-              <w:t>Full mode holds one entry per eligible pair; top-K mode caps this at O(S x k)</w:t>
+            <w:proofErr w:type="gramStart"/>
+            <w:r>
+              <w:t>O(</w:t>
+            </w:r>
+            <w:proofErr w:type="gramEnd"/>
+            <w:r>
+              <w:t xml:space="preserve">S x T) or </w:t>
+            </w:r>
+            <w:proofErr w:type="gramStart"/>
+            <w:r>
+              <w:t>O(</w:t>
+            </w:r>
+            <w:proofErr w:type="gramEnd"/>
+            <w:r>
+              <w:t>S x k)</w:t>
+            </w:r>
+          </w:p>
+        </w:tc>
+        <w:tc>
+          <w:tcPr>
+            <w:tcW w:w="0" w:type="auto"/>
+          </w:tcPr>
+          <w:p>
+            <w:pPr>
+              <w:pStyle w:val="Compact"/>
+              <w:jc w:val="left"/>
+            </w:pPr>
+            <w:r>
+              <w:t xml:space="preserve">Full mode holds one entry per eligible pair; top-K mode caps this at </w:t>
+            </w:r>
+            <w:proofErr w:type="gramStart"/>
+            <w:r>
+              <w:t>O(</w:t>
+            </w:r>
+            <w:proofErr w:type="gramEnd"/>
+            <w:r>
+              <w:t>S x k)</w:t>
             </w:r>
           </w:p>
         </w:tc>
@@ -11957,6 +12294,7 @@
               <w:jc w:val="left"/>
             </w:pPr>
             <w:r>
+              <w:lastRenderedPageBreak/>
               <w:t>Single-student request (assignIncremental)</w:t>
             </w:r>
           </w:p>
@@ -12027,7 +12365,15 @@
         <w:t>optimal-baseline.ts</w:t>
       </w:r>
       <w:r>
-        <w:t>), run only at small sizes (up to 100 students) because its own worst-case cost is approximately O(S^3 x T):</w:t>
+        <w:t xml:space="preserve">), run only at small sizes (up to 100 students) because its own worst-case cost is approximately </w:t>
+      </w:r>
+      <w:proofErr w:type="gramStart"/>
+      <w:r>
+        <w:t>O(</w:t>
+      </w:r>
+      <w:proofErr w:type="gramEnd"/>
+      <w:r>
+        <w:t>S^3 x T):</w:t>
       </w:r>
     </w:p>
     <w:tbl>
@@ -12338,11 +12684,7 @@
         <w:pStyle w:val="BodyText"/>
       </w:pPr>
       <w:r>
-        <w:t xml:space="preserve">At the three smallest tested sizes the greedy algorithm assigned exactly as many students as the true optimum and matched 99.9–100.0% of the optimal total score; at the largest tested instance (100 students, 33 tutors) it assigned 59 of the 64 students the optimum could place and reached </w:t>
-      </w:r>
-      <w:r>
-        <w:lastRenderedPageBreak/>
-        <w:t>94.3% of the optimal total score — in every case far exceeding its proven 1/2 worst-case bound. This is the empirical justification for using the greedy algorithm rather than paying the flow solver’s cubic cost at production scale: the measured gap to optimal is small at the tested scales, and the proven bound guarantees it can never fall below half of optimal even on adversarial inputs the evaluation harness did not happen to generate.</w:t>
+        <w:t>At the three smallest tested sizes the greedy algorithm assigned exactly as many students as the true optimum and matched 99.9–100.0% of the optimal total score; at the largest tested instance (100 students, 33 tutors) it assigned 59 of the 64 students the optimum could place and reached 94.3% of the optimal total score — in every case far exceeding its proven 1/2 worst-case bound. This is the empirical justification for using the greedy algorithm rather than paying the flow solver’s cubic cost at production scale: the measured gap to optimal is small at the tested scales, and the proven bound guarantees it can never fall below half of optimal even on adversarial inputs the evaluation harness did not happen to generate.</w:t>
       </w:r>
     </w:p>
     <w:tbl>
@@ -12426,6 +12768,7 @@
               <w:jc w:val="left"/>
             </w:pPr>
             <w:r>
+              <w:lastRenderedPageBreak/>
               <w:t>Greedy (this study)</w:t>
             </w:r>
           </w:p>
@@ -12439,8 +12782,13 @@
               <w:pStyle w:val="Compact"/>
               <w:jc w:val="left"/>
             </w:pPr>
-            <w:r>
-              <w:t>O(n^2 log n)</w:t>
+            <w:proofErr w:type="gramStart"/>
+            <w:r>
+              <w:t>O(</w:t>
+            </w:r>
+            <w:proofErr w:type="gramEnd"/>
+            <w:r>
+              <w:t>n^2 log n)</w:t>
             </w:r>
           </w:p>
         </w:tc>
@@ -12497,8 +12845,13 @@
               <w:pStyle w:val="Compact"/>
               <w:jc w:val="left"/>
             </w:pPr>
-            <w:r>
-              <w:t>O(S^3 x T)</w:t>
+            <w:proofErr w:type="gramStart"/>
+            <w:r>
+              <w:t>O(</w:t>
+            </w:r>
+            <w:proofErr w:type="gramEnd"/>
+            <w:r>
+              <w:t>S^3 x T)</w:t>
             </w:r>
           </w:p>
         </w:tc>
@@ -12613,8 +12966,13 @@
               <w:pStyle w:val="Compact"/>
               <w:jc w:val="left"/>
             </w:pPr>
-            <w:r>
-              <w:t>O(n x g x p)</w:t>
+            <w:proofErr w:type="gramStart"/>
+            <w:r>
+              <w:t>O(</w:t>
+            </w:r>
+            <w:proofErr w:type="gramEnd"/>
+            <w:r>
+              <w:t>n x g x p)</w:t>
             </w:r>
           </w:p>
         </w:tc>
@@ -12820,7 +13178,6 @@
               <w:jc w:val="left"/>
             </w:pPr>
             <w:r>
-              <w:lastRenderedPageBreak/>
               <w:t>Student preference weights don't sum to 1</w:t>
             </w:r>
           </w:p>
@@ -12911,6 +13268,7 @@
               <w:jc w:val="left"/>
             </w:pPr>
             <w:r>
+              <w:lastRenderedPageBreak/>
               <w:t>Tie in MatchScore between two or more tutors</w:t>
             </w:r>
           </w:p>
@@ -13146,7 +13504,11 @@
         <w:pStyle w:val="BodyText"/>
       </w:pPr>
       <w:r>
-        <w:t>The Composite Scorer coordinates four independent sub-scorers. Each implements a single scoring method. The Academic Scorer handles three sub-criteria (subject depth, level compatibility, experience quality). The Preference Scorer uses cosine similarity on one-hot encoded style vectors. The Schedule Scorer computes availability overlap with contiguous slot requirement. The Fairness Scorer computes load ratio with a cold start boost.</w:t>
+        <w:t xml:space="preserve">The Composite Scorer coordinates four independent sub-scorers. Each implements a single scoring method. The Academic Scorer handles three sub-criteria (subject depth, level compatibility, experience quality). The Preference Scorer uses cosine similarity on one-hot encoded style vectors. </w:t>
+      </w:r>
+      <w:r>
+        <w:lastRenderedPageBreak/>
+        <w:t>The Schedule Scorer computes availability overlap with contiguous slot requirement. The Fairness Scorer computes load ratio with a cold start boost.</w:t>
       </w:r>
     </w:p>
     <w:p>
@@ -13251,6 +13613,7 @@
                 <w:szCs w:val="20"/>
               </w:rPr>
             </w:pPr>
+            <w:proofErr w:type="gramStart"/>
             <w:r>
               <w:rPr>
                 <w:rFonts w:ascii="Consolas" w:eastAsia="Consolas" w:hAnsi="Consolas" w:cs="Consolas"/>
@@ -13269,6 +13632,7 @@
               </w:rPr>
               <w:t>(</w:t>
             </w:r>
+            <w:proofErr w:type="gramEnd"/>
             <w:r>
               <w:rPr>
                 <w:rFonts w:ascii="Consolas" w:eastAsia="Consolas" w:hAnsi="Consolas" w:cs="Consolas"/>
@@ -13415,7 +13779,17 @@
                 <w:sz w:val="20"/>
                 <w:szCs w:val="20"/>
               </w:rPr>
-              <w:t>(student.</w:t>
+              <w:t>(</w:t>
+            </w:r>
+            <w:proofErr w:type="gramStart"/>
+            <w:r>
+              <w:rPr>
+                <w:rFonts w:ascii="Consolas" w:eastAsia="Consolas" w:hAnsi="Consolas" w:cs="Consolas"/>
+                <w:color w:val="ABB2BF"/>
+                <w:sz w:val="20"/>
+                <w:szCs w:val="20"/>
+              </w:rPr>
+              <w:t>student.</w:t>
             </w:r>
             <w:r>
               <w:rPr>
@@ -13426,6 +13800,7 @@
               </w:rPr>
               <w:t>preferenceWeights</w:t>
             </w:r>
+            <w:proofErr w:type="gramEnd"/>
             <w:r>
               <w:rPr>
                 <w:rFonts w:ascii="Consolas" w:eastAsia="Consolas" w:hAnsi="Consolas" w:cs="Consolas"/>
@@ -13513,6 +13888,7 @@
               </w:rPr>
               <w:t xml:space="preserve"> academic = </w:t>
             </w:r>
+            <w:proofErr w:type="gramStart"/>
             <w:r>
               <w:rPr>
                 <w:rFonts w:ascii="Consolas" w:eastAsia="Consolas" w:hAnsi="Consolas" w:cs="Consolas"/>
@@ -13558,6 +13934,7 @@
               </w:rPr>
               <w:t>score</w:t>
             </w:r>
+            <w:proofErr w:type="gramEnd"/>
             <w:r>
               <w:rPr>
                 <w:rFonts w:ascii="Consolas" w:eastAsia="Consolas" w:hAnsi="Consolas" w:cs="Consolas"/>
@@ -13605,6 +13982,7 @@
               </w:rPr>
               <w:t xml:space="preserve"> preference = </w:t>
             </w:r>
+            <w:proofErr w:type="gramStart"/>
             <w:r>
               <w:rPr>
                 <w:rFonts w:ascii="Consolas" w:eastAsia="Consolas" w:hAnsi="Consolas" w:cs="Consolas"/>
@@ -13650,6 +14028,7 @@
               </w:rPr>
               <w:t>score</w:t>
             </w:r>
+            <w:proofErr w:type="gramEnd"/>
             <w:r>
               <w:rPr>
                 <w:rFonts w:ascii="Consolas" w:eastAsia="Consolas" w:hAnsi="Consolas" w:cs="Consolas"/>
@@ -13697,6 +14076,7 @@
               </w:rPr>
               <w:t xml:space="preserve"> schedule = </w:t>
             </w:r>
+            <w:proofErr w:type="gramStart"/>
             <w:r>
               <w:rPr>
                 <w:rFonts w:ascii="Consolas" w:eastAsia="Consolas" w:hAnsi="Consolas" w:cs="Consolas"/>
@@ -13742,6 +14122,7 @@
               </w:rPr>
               <w:t>score</w:t>
             </w:r>
+            <w:proofErr w:type="gramEnd"/>
             <w:r>
               <w:rPr>
                 <w:rFonts w:ascii="Consolas" w:eastAsia="Consolas" w:hAnsi="Consolas" w:cs="Consolas"/>
@@ -13789,6 +14170,7 @@
               </w:rPr>
               <w:t xml:space="preserve"> fairness = </w:t>
             </w:r>
+            <w:proofErr w:type="gramStart"/>
             <w:r>
               <w:rPr>
                 <w:rFonts w:ascii="Consolas" w:eastAsia="Consolas" w:hAnsi="Consolas" w:cs="Consolas"/>
@@ -13834,6 +14216,7 @@
               </w:rPr>
               <w:t>score</w:t>
             </w:r>
+            <w:proofErr w:type="gramEnd"/>
             <w:r>
               <w:rPr>
                 <w:rFonts w:ascii="Consolas" w:eastAsia="Consolas" w:hAnsi="Consolas" w:cs="Consolas"/>
@@ -13919,7 +14302,17 @@
                 <w:sz w:val="20"/>
                 <w:szCs w:val="20"/>
               </w:rPr>
-              <w:t xml:space="preserve">        weights.</w:t>
+              <w:t xml:space="preserve">        </w:t>
+            </w:r>
+            <w:proofErr w:type="gramStart"/>
+            <w:r>
+              <w:rPr>
+                <w:rFonts w:ascii="Consolas" w:eastAsia="Consolas" w:hAnsi="Consolas" w:cs="Consolas"/>
+                <w:color w:val="ABB2BF"/>
+                <w:sz w:val="20"/>
+                <w:szCs w:val="20"/>
+              </w:rPr>
+              <w:t>weights.</w:t>
             </w:r>
             <w:r>
               <w:rPr>
@@ -13930,6 +14323,7 @@
               </w:rPr>
               <w:t>alpha</w:t>
             </w:r>
+            <w:proofErr w:type="gramEnd"/>
             <w:r>
               <w:rPr>
                 <w:rFonts w:ascii="Consolas" w:eastAsia="Consolas" w:hAnsi="Consolas" w:cs="Consolas"/>
@@ -13937,7 +14331,17 @@
                 <w:sz w:val="20"/>
                 <w:szCs w:val="20"/>
               </w:rPr>
-              <w:t xml:space="preserve"> * academic.</w:t>
+              <w:t xml:space="preserve"> * </w:t>
+            </w:r>
+            <w:proofErr w:type="gramStart"/>
+            <w:r>
+              <w:rPr>
+                <w:rFonts w:ascii="Consolas" w:eastAsia="Consolas" w:hAnsi="Consolas" w:cs="Consolas"/>
+                <w:color w:val="ABB2BF"/>
+                <w:sz w:val="20"/>
+                <w:szCs w:val="20"/>
+              </w:rPr>
+              <w:t>academic.</w:t>
             </w:r>
             <w:r>
               <w:rPr>
@@ -13948,6 +14352,7 @@
               </w:rPr>
               <w:t>total</w:t>
             </w:r>
+            <w:proofErr w:type="gramEnd"/>
             <w:r>
               <w:rPr>
                 <w:rFonts w:ascii="Consolas" w:eastAsia="Consolas" w:hAnsi="Consolas" w:cs="Consolas"/>
@@ -13975,7 +14380,17 @@
                 <w:sz w:val="20"/>
                 <w:szCs w:val="20"/>
               </w:rPr>
-              <w:t xml:space="preserve">        weights.</w:t>
+              <w:t xml:space="preserve">        </w:t>
+            </w:r>
+            <w:proofErr w:type="gramStart"/>
+            <w:r>
+              <w:rPr>
+                <w:rFonts w:ascii="Consolas" w:eastAsia="Consolas" w:hAnsi="Consolas" w:cs="Consolas"/>
+                <w:color w:val="ABB2BF"/>
+                <w:sz w:val="20"/>
+                <w:szCs w:val="20"/>
+              </w:rPr>
+              <w:t>weights.</w:t>
             </w:r>
             <w:r>
               <w:rPr>
@@ -13986,6 +14401,7 @@
               </w:rPr>
               <w:t>beta</w:t>
             </w:r>
+            <w:proofErr w:type="gramEnd"/>
             <w:r>
               <w:rPr>
                 <w:rFonts w:ascii="Consolas" w:eastAsia="Consolas" w:hAnsi="Consolas" w:cs="Consolas"/>
@@ -13993,7 +14409,17 @@
                 <w:sz w:val="20"/>
                 <w:szCs w:val="20"/>
               </w:rPr>
-              <w:t xml:space="preserve"> * preference.</w:t>
+              <w:t xml:space="preserve"> * </w:t>
+            </w:r>
+            <w:proofErr w:type="gramStart"/>
+            <w:r>
+              <w:rPr>
+                <w:rFonts w:ascii="Consolas" w:eastAsia="Consolas" w:hAnsi="Consolas" w:cs="Consolas"/>
+                <w:color w:val="ABB2BF"/>
+                <w:sz w:val="20"/>
+                <w:szCs w:val="20"/>
+              </w:rPr>
+              <w:t>preference.</w:t>
             </w:r>
             <w:r>
               <w:rPr>
@@ -14004,6 +14430,7 @@
               </w:rPr>
               <w:t>total</w:t>
             </w:r>
+            <w:proofErr w:type="gramEnd"/>
             <w:r>
               <w:rPr>
                 <w:rFonts w:ascii="Consolas" w:eastAsia="Consolas" w:hAnsi="Consolas" w:cs="Consolas"/>
@@ -14031,7 +14458,17 @@
                 <w:sz w:val="20"/>
                 <w:szCs w:val="20"/>
               </w:rPr>
-              <w:t xml:space="preserve">        weights.</w:t>
+              <w:t xml:space="preserve">        </w:t>
+            </w:r>
+            <w:proofErr w:type="gramStart"/>
+            <w:r>
+              <w:rPr>
+                <w:rFonts w:ascii="Consolas" w:eastAsia="Consolas" w:hAnsi="Consolas" w:cs="Consolas"/>
+                <w:color w:val="ABB2BF"/>
+                <w:sz w:val="20"/>
+                <w:szCs w:val="20"/>
+              </w:rPr>
+              <w:t>weights.</w:t>
             </w:r>
             <w:r>
               <w:rPr>
@@ -14042,6 +14479,7 @@
               </w:rPr>
               <w:t>gamma</w:t>
             </w:r>
+            <w:proofErr w:type="gramEnd"/>
             <w:r>
               <w:rPr>
                 <w:rFonts w:ascii="Consolas" w:eastAsia="Consolas" w:hAnsi="Consolas" w:cs="Consolas"/>
@@ -14069,7 +14507,17 @@
                 <w:sz w:val="20"/>
                 <w:szCs w:val="20"/>
               </w:rPr>
-              <w:t xml:space="preserve">        weights.</w:t>
+              <w:t xml:space="preserve">        </w:t>
+            </w:r>
+            <w:proofErr w:type="gramStart"/>
+            <w:r>
+              <w:rPr>
+                <w:rFonts w:ascii="Consolas" w:eastAsia="Consolas" w:hAnsi="Consolas" w:cs="Consolas"/>
+                <w:color w:val="ABB2BF"/>
+                <w:sz w:val="20"/>
+                <w:szCs w:val="20"/>
+              </w:rPr>
+              <w:t>weights.</w:t>
             </w:r>
             <w:r>
               <w:rPr>
@@ -14080,6 +14528,7 @@
               </w:rPr>
               <w:t>delta</w:t>
             </w:r>
+            <w:proofErr w:type="gramEnd"/>
             <w:r>
               <w:rPr>
                 <w:rFonts w:ascii="Consolas" w:eastAsia="Consolas" w:hAnsi="Consolas" w:cs="Consolas"/>
@@ -14165,6 +14614,7 @@
               </w:rPr>
               <w:t xml:space="preserve"> </w:t>
             </w:r>
+            <w:proofErr w:type="gramStart"/>
             <w:r>
               <w:rPr>
                 <w:rFonts w:ascii="Consolas" w:eastAsia="Consolas" w:hAnsi="Consolas" w:cs="Consolas"/>
@@ -14181,7 +14631,17 @@
                 <w:sz w:val="20"/>
                 <w:szCs w:val="20"/>
               </w:rPr>
-              <w:t>(total, breakdown, subBreakdown);</w:t>
+              <w:t>(</w:t>
+            </w:r>
+            <w:proofErr w:type="gramEnd"/>
+            <w:r>
+              <w:rPr>
+                <w:rFonts w:ascii="Consolas" w:eastAsia="Consolas" w:hAnsi="Consolas" w:cs="Consolas"/>
+                <w:color w:val="ABB2BF"/>
+                <w:sz w:val="20"/>
+                <w:szCs w:val="20"/>
+              </w:rPr>
+              <w:t>total, breakdown, subBreakdown);</w:t>
             </w:r>
           </w:p>
           <w:p>
@@ -14272,6 +14732,7 @@
                 <w:szCs w:val="20"/>
               </w:rPr>
             </w:pPr>
+            <w:proofErr w:type="gramStart"/>
             <w:r>
               <w:rPr>
                 <w:rFonts w:ascii="Consolas" w:eastAsia="Consolas" w:hAnsi="Consolas" w:cs="Consolas"/>
@@ -14290,6 +14751,7 @@
               </w:rPr>
               <w:t>(</w:t>
             </w:r>
+            <w:proofErr w:type="gramEnd"/>
             <w:r>
               <w:rPr>
                 <w:rFonts w:ascii="Consolas" w:eastAsia="Consolas" w:hAnsi="Consolas" w:cs="Consolas"/>
@@ -14364,6 +14826,7 @@
               </w:rPr>
               <w:t xml:space="preserve"> </w:t>
             </w:r>
+            <w:proofErr w:type="gramStart"/>
             <w:r>
               <w:rPr>
                 <w:rFonts w:ascii="Consolas" w:eastAsia="Consolas" w:hAnsi="Consolas" w:cs="Consolas"/>
@@ -14380,7 +14843,17 @@
                 <w:sz w:val="20"/>
                 <w:szCs w:val="20"/>
               </w:rPr>
-              <w:t>();</w:t>
+              <w:t>(</w:t>
+            </w:r>
+            <w:proofErr w:type="gramEnd"/>
+            <w:r>
+              <w:rPr>
+                <w:rFonts w:ascii="Consolas" w:eastAsia="Consolas" w:hAnsi="Consolas" w:cs="Consolas"/>
+                <w:color w:val="ABB2BF"/>
+                <w:sz w:val="20"/>
+                <w:szCs w:val="20"/>
+              </w:rPr>
+              <w:t>);</w:t>
             </w:r>
           </w:p>
           <w:p>
@@ -14568,6 +15041,7 @@
                 <w:sz w:val="20"/>
                 <w:szCs w:val="20"/>
               </w:rPr>
+              <w:lastRenderedPageBreak/>
               <w:t xml:space="preserve">            </w:t>
             </w:r>
             <w:r>
@@ -14586,7 +15060,17 @@
                 <w:sz w:val="20"/>
                 <w:szCs w:val="20"/>
               </w:rPr>
-              <w:t xml:space="preserve"> (!</w:t>
+              <w:t xml:space="preserve"> </w:t>
+            </w:r>
+            <w:proofErr w:type="gramStart"/>
+            <w:r>
+              <w:rPr>
+                <w:rFonts w:ascii="Consolas" w:eastAsia="Consolas" w:hAnsi="Consolas" w:cs="Consolas"/>
+                <w:color w:val="ABB2BF"/>
+                <w:sz w:val="20"/>
+                <w:szCs w:val="20"/>
+              </w:rPr>
+              <w:t>(!</w:t>
             </w:r>
             <w:r>
               <w:rPr>
@@ -14597,6 +15081,7 @@
               </w:rPr>
               <w:t>this</w:t>
             </w:r>
+            <w:proofErr w:type="gramEnd"/>
             <w:r>
               <w:rPr>
                 <w:rFonts w:ascii="Consolas" w:eastAsia="Consolas" w:hAnsi="Consolas" w:cs="Consolas"/>
@@ -14718,6 +15203,7 @@
               </w:rPr>
               <w:t xml:space="preserve"> score = </w:t>
             </w:r>
+            <w:proofErr w:type="gramStart"/>
             <w:r>
               <w:rPr>
                 <w:rFonts w:ascii="Consolas" w:eastAsia="Consolas" w:hAnsi="Consolas" w:cs="Consolas"/>
@@ -14763,6 +15249,7 @@
               </w:rPr>
               <w:t>staticScore</w:t>
             </w:r>
+            <w:proofErr w:type="gramEnd"/>
             <w:r>
               <w:rPr>
                 <w:rFonts w:ascii="Consolas" w:eastAsia="Consolas" w:hAnsi="Consolas" w:cs="Consolas"/>
@@ -14790,7 +15277,17 @@
                 <w:sz w:val="20"/>
                 <w:szCs w:val="20"/>
               </w:rPr>
-              <w:t xml:space="preserve">            heap.</w:t>
+              <w:t xml:space="preserve">            </w:t>
+            </w:r>
+            <w:proofErr w:type="gramStart"/>
+            <w:r>
+              <w:rPr>
+                <w:rFonts w:ascii="Consolas" w:eastAsia="Consolas" w:hAnsi="Consolas" w:cs="Consolas"/>
+                <w:color w:val="ABB2BF"/>
+                <w:sz w:val="20"/>
+                <w:szCs w:val="20"/>
+              </w:rPr>
+              <w:t>heap.</w:t>
             </w:r>
             <w:r>
               <w:rPr>
@@ -14808,8 +15305,39 @@
                 <w:sz w:val="20"/>
                 <w:szCs w:val="20"/>
               </w:rPr>
-              <w:t xml:space="preserve">({ student, tutor, score }, </w:t>
-            </w:r>
+              <w:t>({ student</w:t>
+            </w:r>
+            <w:proofErr w:type="gramEnd"/>
+            <w:r>
+              <w:rPr>
+                <w:rFonts w:ascii="Consolas" w:eastAsia="Consolas" w:hAnsi="Consolas" w:cs="Consolas"/>
+                <w:color w:val="ABB2BF"/>
+                <w:sz w:val="20"/>
+                <w:szCs w:val="20"/>
+              </w:rPr>
+              <w:t xml:space="preserve">, tutor, </w:t>
+            </w:r>
+            <w:proofErr w:type="gramStart"/>
+            <w:r>
+              <w:rPr>
+                <w:rFonts w:ascii="Consolas" w:eastAsia="Consolas" w:hAnsi="Consolas" w:cs="Consolas"/>
+                <w:color w:val="ABB2BF"/>
+                <w:sz w:val="20"/>
+                <w:szCs w:val="20"/>
+              </w:rPr>
+              <w:t>score }</w:t>
+            </w:r>
+            <w:proofErr w:type="gramEnd"/>
+            <w:r>
+              <w:rPr>
+                <w:rFonts w:ascii="Consolas" w:eastAsia="Consolas" w:hAnsi="Consolas" w:cs="Consolas"/>
+                <w:color w:val="ABB2BF"/>
+                <w:sz w:val="20"/>
+                <w:szCs w:val="20"/>
+              </w:rPr>
+              <w:t xml:space="preserve">, </w:t>
+            </w:r>
+            <w:proofErr w:type="gramStart"/>
             <w:r>
               <w:rPr>
                 <w:rFonts w:ascii="Consolas" w:eastAsia="Consolas" w:hAnsi="Consolas" w:cs="Consolas"/>
@@ -14837,6 +15365,7 @@
               </w:rPr>
               <w:t>priority</w:t>
             </w:r>
+            <w:proofErr w:type="gramEnd"/>
             <w:r>
               <w:rPr>
                 <w:rFonts w:ascii="Consolas" w:eastAsia="Consolas" w:hAnsi="Consolas" w:cs="Consolas"/>
@@ -14942,7 +15471,17 @@
                 <w:sz w:val="20"/>
                 <w:szCs w:val="20"/>
               </w:rPr>
-              <w:t xml:space="preserve"> (heap.</w:t>
+              <w:t xml:space="preserve"> (</w:t>
+            </w:r>
+            <w:proofErr w:type="gramStart"/>
+            <w:r>
+              <w:rPr>
+                <w:rFonts w:ascii="Consolas" w:eastAsia="Consolas" w:hAnsi="Consolas" w:cs="Consolas"/>
+                <w:color w:val="ABB2BF"/>
+                <w:sz w:val="20"/>
+                <w:szCs w:val="20"/>
+              </w:rPr>
+              <w:t>heap.</w:t>
             </w:r>
             <w:r>
               <w:rPr>
@@ -14953,6 +15492,7 @@
               </w:rPr>
               <w:t>size</w:t>
             </w:r>
+            <w:proofErr w:type="gramEnd"/>
             <w:r>
               <w:rPr>
                 <w:rFonts w:ascii="Consolas" w:eastAsia="Consolas" w:hAnsi="Consolas" w:cs="Consolas"/>
@@ -15016,7 +15556,17 @@
                 <w:sz w:val="20"/>
                 <w:szCs w:val="20"/>
               </w:rPr>
-              <w:t xml:space="preserve"> item = heap.</w:t>
+              <w:t xml:space="preserve"> item = </w:t>
+            </w:r>
+            <w:proofErr w:type="gramStart"/>
+            <w:r>
+              <w:rPr>
+                <w:rFonts w:ascii="Consolas" w:eastAsia="Consolas" w:hAnsi="Consolas" w:cs="Consolas"/>
+                <w:color w:val="ABB2BF"/>
+                <w:sz w:val="20"/>
+                <w:szCs w:val="20"/>
+              </w:rPr>
+              <w:t>heap.</w:t>
             </w:r>
             <w:r>
               <w:rPr>
@@ -15034,7 +15584,17 @@
                 <w:sz w:val="20"/>
                 <w:szCs w:val="20"/>
               </w:rPr>
-              <w:t>();</w:t>
+              <w:t>(</w:t>
+            </w:r>
+            <w:proofErr w:type="gramEnd"/>
+            <w:r>
+              <w:rPr>
+                <w:rFonts w:ascii="Consolas" w:eastAsia="Consolas" w:hAnsi="Consolas" w:cs="Consolas"/>
+                <w:color w:val="ABB2BF"/>
+                <w:sz w:val="20"/>
+                <w:szCs w:val="20"/>
+              </w:rPr>
+              <w:t>);</w:t>
             </w:r>
           </w:p>
           <w:p>
@@ -15094,6 +15654,7 @@
               </w:rPr>
               <w:t xml:space="preserve"> (</w:t>
             </w:r>
+            <w:proofErr w:type="gramStart"/>
             <w:r>
               <w:rPr>
                 <w:rFonts w:ascii="Consolas" w:eastAsia="Consolas" w:hAnsi="Consolas" w:cs="Consolas"/>
@@ -15121,6 +15682,7 @@
               </w:rPr>
               <w:t>canAssign</w:t>
             </w:r>
+            <w:proofErr w:type="gramEnd"/>
             <w:r>
               <w:rPr>
                 <w:rFonts w:ascii="Consolas" w:eastAsia="Consolas" w:hAnsi="Consolas" w:cs="Consolas"/>
@@ -15128,7 +15690,17 @@
                 <w:sz w:val="20"/>
                 <w:szCs w:val="20"/>
               </w:rPr>
-              <w:t>(item.</w:t>
+              <w:t>(</w:t>
+            </w:r>
+            <w:proofErr w:type="gramStart"/>
+            <w:r>
+              <w:rPr>
+                <w:rFonts w:ascii="Consolas" w:eastAsia="Consolas" w:hAnsi="Consolas" w:cs="Consolas"/>
+                <w:color w:val="ABB2BF"/>
+                <w:sz w:val="20"/>
+                <w:szCs w:val="20"/>
+              </w:rPr>
+              <w:t>item.</w:t>
             </w:r>
             <w:r>
               <w:rPr>
@@ -15139,6 +15711,7 @@
               </w:rPr>
               <w:t>student</w:t>
             </w:r>
+            <w:proofErr w:type="gramEnd"/>
             <w:r>
               <w:rPr>
                 <w:rFonts w:ascii="Consolas" w:eastAsia="Consolas" w:hAnsi="Consolas" w:cs="Consolas"/>
@@ -15146,7 +15719,17 @@
                 <w:sz w:val="20"/>
                 <w:szCs w:val="20"/>
               </w:rPr>
-              <w:t>, item.</w:t>
+              <w:t xml:space="preserve">, </w:t>
+            </w:r>
+            <w:proofErr w:type="gramStart"/>
+            <w:r>
+              <w:rPr>
+                <w:rFonts w:ascii="Consolas" w:eastAsia="Consolas" w:hAnsi="Consolas" w:cs="Consolas"/>
+                <w:color w:val="ABB2BF"/>
+                <w:sz w:val="20"/>
+                <w:szCs w:val="20"/>
+              </w:rPr>
+              <w:t>item.</w:t>
             </w:r>
             <w:r>
               <w:rPr>
@@ -15157,6 +15740,7 @@
               </w:rPr>
               <w:t>tutor</w:t>
             </w:r>
+            <w:proofErr w:type="gramEnd"/>
             <w:r>
               <w:rPr>
                 <w:rFonts w:ascii="Consolas" w:eastAsia="Consolas" w:hAnsi="Consolas" w:cs="Consolas"/>
@@ -15184,7 +15768,17 @@
                 <w:sz w:val="20"/>
                 <w:szCs w:val="20"/>
               </w:rPr>
-              <w:t xml:space="preserve">            assignments.</w:t>
+              <w:t xml:space="preserve">            </w:t>
+            </w:r>
+            <w:proofErr w:type="gramStart"/>
+            <w:r>
+              <w:rPr>
+                <w:rFonts w:ascii="Consolas" w:eastAsia="Consolas" w:hAnsi="Consolas" w:cs="Consolas"/>
+                <w:color w:val="ABB2BF"/>
+                <w:sz w:val="20"/>
+                <w:szCs w:val="20"/>
+              </w:rPr>
+              <w:t>assignments.</w:t>
             </w:r>
             <w:r>
               <w:rPr>
@@ -15195,6 +15789,7 @@
               </w:rPr>
               <w:t>push</w:t>
             </w:r>
+            <w:proofErr w:type="gramEnd"/>
             <w:r>
               <w:rPr>
                 <w:rFonts w:ascii="Consolas" w:eastAsia="Consolas" w:hAnsi="Consolas" w:cs="Consolas"/>
@@ -15222,7 +15817,17 @@
                 <w:sz w:val="20"/>
                 <w:szCs w:val="20"/>
               </w:rPr>
-              <w:t xml:space="preserve">            item.</w:t>
+              <w:t xml:space="preserve">            </w:t>
+            </w:r>
+            <w:proofErr w:type="gramStart"/>
+            <w:r>
+              <w:rPr>
+                <w:rFonts w:ascii="Consolas" w:eastAsia="Consolas" w:hAnsi="Consolas" w:cs="Consolas"/>
+                <w:color w:val="ABB2BF"/>
+                <w:sz w:val="20"/>
+                <w:szCs w:val="20"/>
+              </w:rPr>
+              <w:t>item.</w:t>
             </w:r>
             <w:r>
               <w:rPr>
@@ -15233,6 +15838,7 @@
               </w:rPr>
               <w:t>tutor</w:t>
             </w:r>
+            <w:proofErr w:type="gramEnd"/>
             <w:r>
               <w:rPr>
                 <w:rFonts w:ascii="Consolas" w:eastAsia="Consolas" w:hAnsi="Consolas" w:cs="Consolas"/>
@@ -15356,7 +15962,47 @@
                 <w:sz w:val="20"/>
                 <w:szCs w:val="20"/>
               </w:rPr>
-              <w:t xml:space="preserve"> { assignments, unassignable };</w:t>
+              <w:t xml:space="preserve"> </w:t>
+            </w:r>
+            <w:proofErr w:type="gramStart"/>
+            <w:r>
+              <w:rPr>
+                <w:rFonts w:ascii="Consolas" w:eastAsia="Consolas" w:hAnsi="Consolas" w:cs="Consolas"/>
+                <w:color w:val="ABB2BF"/>
+                <w:sz w:val="20"/>
+                <w:szCs w:val="20"/>
+              </w:rPr>
+              <w:t>{ assignments</w:t>
+            </w:r>
+            <w:proofErr w:type="gramEnd"/>
+            <w:r>
+              <w:rPr>
+                <w:rFonts w:ascii="Consolas" w:eastAsia="Consolas" w:hAnsi="Consolas" w:cs="Consolas"/>
+                <w:color w:val="ABB2BF"/>
+                <w:sz w:val="20"/>
+                <w:szCs w:val="20"/>
+              </w:rPr>
+              <w:t xml:space="preserve">, </w:t>
+            </w:r>
+            <w:proofErr w:type="gramStart"/>
+            <w:r>
+              <w:rPr>
+                <w:rFonts w:ascii="Consolas" w:eastAsia="Consolas" w:hAnsi="Consolas" w:cs="Consolas"/>
+                <w:color w:val="ABB2BF"/>
+                <w:sz w:val="20"/>
+                <w:szCs w:val="20"/>
+              </w:rPr>
+              <w:t>unassignable }</w:t>
+            </w:r>
+            <w:proofErr w:type="gramEnd"/>
+            <w:r>
+              <w:rPr>
+                <w:rFonts w:ascii="Consolas" w:eastAsia="Consolas" w:hAnsi="Consolas" w:cs="Consolas"/>
+                <w:color w:val="ABB2BF"/>
+                <w:sz w:val="20"/>
+                <w:szCs w:val="20"/>
+              </w:rPr>
+              <w:t>;</w:t>
             </w:r>
           </w:p>
           <w:p>
@@ -15391,6 +16037,7 @@
           <w:b/>
           <w:bCs/>
         </w:rPr>
+        <w:lastRenderedPageBreak/>
         <w:t>Snippet 4.3: FairnessScorer.score()</w:t>
       </w:r>
     </w:p>
@@ -15514,7 +16161,17 @@
                 <w:sz w:val="20"/>
                 <w:szCs w:val="20"/>
               </w:rPr>
-              <w:t xml:space="preserve"> (tutor.</w:t>
+              <w:t xml:space="preserve"> (</w:t>
+            </w:r>
+            <w:proofErr w:type="gramStart"/>
+            <w:r>
+              <w:rPr>
+                <w:rFonts w:ascii="Consolas" w:eastAsia="Consolas" w:hAnsi="Consolas" w:cs="Consolas"/>
+                <w:color w:val="ABB2BF"/>
+                <w:sz w:val="20"/>
+                <w:szCs w:val="20"/>
+              </w:rPr>
+              <w:t>tutor.</w:t>
             </w:r>
             <w:r>
               <w:rPr>
@@ -15525,6 +16182,7 @@
               </w:rPr>
               <w:t>assignedCount</w:t>
             </w:r>
+            <w:proofErr w:type="gramEnd"/>
             <w:r>
               <w:rPr>
                 <w:rFonts w:ascii="Consolas" w:eastAsia="Consolas" w:hAnsi="Consolas" w:cs="Consolas"/>
@@ -15532,7 +16190,17 @@
                 <w:sz w:val="20"/>
                 <w:szCs w:val="20"/>
               </w:rPr>
-              <w:t xml:space="preserve"> &gt;= tutor.</w:t>
+              <w:t xml:space="preserve"> &gt;= </w:t>
+            </w:r>
+            <w:proofErr w:type="gramStart"/>
+            <w:r>
+              <w:rPr>
+                <w:rFonts w:ascii="Consolas" w:eastAsia="Consolas" w:hAnsi="Consolas" w:cs="Consolas"/>
+                <w:color w:val="ABB2BF"/>
+                <w:sz w:val="20"/>
+                <w:szCs w:val="20"/>
+              </w:rPr>
+              <w:t>tutor.</w:t>
             </w:r>
             <w:r>
               <w:rPr>
@@ -15543,6 +16211,7 @@
               </w:rPr>
               <w:t>capacity</w:t>
             </w:r>
+            <w:proofErr w:type="gramEnd"/>
             <w:r>
               <w:rPr>
                 <w:rFonts w:ascii="Consolas" w:eastAsia="Consolas" w:hAnsi="Consolas" w:cs="Consolas"/>
@@ -15702,7 +16371,17 @@
                 <w:sz w:val="20"/>
                 <w:szCs w:val="20"/>
               </w:rPr>
-              <w:t xml:space="preserve"> - tutor.</w:t>
+              <w:t xml:space="preserve"> - </w:t>
+            </w:r>
+            <w:proofErr w:type="gramStart"/>
+            <w:r>
+              <w:rPr>
+                <w:rFonts w:ascii="Consolas" w:eastAsia="Consolas" w:hAnsi="Consolas" w:cs="Consolas"/>
+                <w:color w:val="ABB2BF"/>
+                <w:sz w:val="20"/>
+                <w:szCs w:val="20"/>
+              </w:rPr>
+              <w:t>tutor.</w:t>
             </w:r>
             <w:r>
               <w:rPr>
@@ -15713,6 +16392,7 @@
               </w:rPr>
               <w:t>assignedCount</w:t>
             </w:r>
+            <w:proofErr w:type="gramEnd"/>
             <w:r>
               <w:rPr>
                 <w:rFonts w:ascii="Consolas" w:eastAsia="Consolas" w:hAnsi="Consolas" w:cs="Consolas"/>
@@ -15720,7 +16400,17 @@
                 <w:sz w:val="20"/>
                 <w:szCs w:val="20"/>
               </w:rPr>
-              <w:t xml:space="preserve"> / tutor.</w:t>
+              <w:t xml:space="preserve"> / </w:t>
+            </w:r>
+            <w:proofErr w:type="gramStart"/>
+            <w:r>
+              <w:rPr>
+                <w:rFonts w:ascii="Consolas" w:eastAsia="Consolas" w:hAnsi="Consolas" w:cs="Consolas"/>
+                <w:color w:val="ABB2BF"/>
+                <w:sz w:val="20"/>
+                <w:szCs w:val="20"/>
+              </w:rPr>
+              <w:t>tutor.</w:t>
             </w:r>
             <w:r>
               <w:rPr>
@@ -15731,6 +16421,7 @@
               </w:rPr>
               <w:t>capacity</w:t>
             </w:r>
+            <w:proofErr w:type="gramEnd"/>
             <w:r>
               <w:rPr>
                 <w:rFonts w:ascii="Consolas" w:eastAsia="Consolas" w:hAnsi="Consolas" w:cs="Consolas"/>
@@ -15776,7 +16467,17 @@
                 <w:sz w:val="20"/>
                 <w:szCs w:val="20"/>
               </w:rPr>
-              <w:t xml:space="preserve"> boost = tutor.</w:t>
+              <w:t xml:space="preserve"> boost = </w:t>
+            </w:r>
+            <w:proofErr w:type="gramStart"/>
+            <w:r>
+              <w:rPr>
+                <w:rFonts w:ascii="Consolas" w:eastAsia="Consolas" w:hAnsi="Consolas" w:cs="Consolas"/>
+                <w:color w:val="ABB2BF"/>
+                <w:sz w:val="20"/>
+                <w:szCs w:val="20"/>
+              </w:rPr>
+              <w:t>tutor.</w:t>
             </w:r>
             <w:r>
               <w:rPr>
@@ -15787,6 +16488,7 @@
               </w:rPr>
               <w:t>assignedCount</w:t>
             </w:r>
+            <w:proofErr w:type="gramEnd"/>
             <w:r>
               <w:rPr>
                 <w:rFonts w:ascii="Consolas" w:eastAsia="Consolas" w:hAnsi="Consolas" w:cs="Consolas"/>
@@ -15796,6 +16498,7 @@
               </w:rPr>
               <w:t xml:space="preserve"> === </w:t>
             </w:r>
+            <w:proofErr w:type="gramStart"/>
             <w:r>
               <w:rPr>
                 <w:rFonts w:ascii="Consolas" w:eastAsia="Consolas" w:hAnsi="Consolas" w:cs="Consolas"/>
@@ -15812,8 +16515,19 @@
                 <w:sz w:val="20"/>
                 <w:szCs w:val="20"/>
               </w:rPr>
-              <w:t xml:space="preserve"> ? </w:t>
-            </w:r>
+              <w:t xml:space="preserve"> ?</w:t>
+            </w:r>
+            <w:proofErr w:type="gramEnd"/>
+            <w:r>
+              <w:rPr>
+                <w:rFonts w:ascii="Consolas" w:eastAsia="Consolas" w:hAnsi="Consolas" w:cs="Consolas"/>
+                <w:color w:val="ABB2BF"/>
+                <w:sz w:val="20"/>
+                <w:szCs w:val="20"/>
+              </w:rPr>
+              <w:t xml:space="preserve"> </w:t>
+            </w:r>
+            <w:proofErr w:type="gramStart"/>
             <w:r>
               <w:rPr>
                 <w:rFonts w:ascii="Consolas" w:eastAsia="Consolas" w:hAnsi="Consolas" w:cs="Consolas"/>
@@ -15830,7 +16544,17 @@
                 <w:sz w:val="20"/>
                 <w:szCs w:val="20"/>
               </w:rPr>
-              <w:t xml:space="preserve"> : </w:t>
+              <w:t xml:space="preserve"> :</w:t>
+            </w:r>
+            <w:proofErr w:type="gramEnd"/>
+            <w:r>
+              <w:rPr>
+                <w:rFonts w:ascii="Consolas" w:eastAsia="Consolas" w:hAnsi="Consolas" w:cs="Consolas"/>
+                <w:color w:val="ABB2BF"/>
+                <w:sz w:val="20"/>
+                <w:szCs w:val="20"/>
+              </w:rPr>
+              <w:t xml:space="preserve"> </w:t>
             </w:r>
             <w:r>
               <w:rPr>
@@ -15908,6 +16632,7 @@
               </w:rPr>
               <w:t xml:space="preserve"> </w:t>
             </w:r>
+            <w:proofErr w:type="gramStart"/>
             <w:r>
               <w:rPr>
                 <w:rFonts w:ascii="Consolas" w:eastAsia="Consolas" w:hAnsi="Consolas" w:cs="Consolas"/>
@@ -15944,6 +16669,7 @@
               </w:rPr>
               <w:t>(</w:t>
             </w:r>
+            <w:proofErr w:type="gramEnd"/>
             <w:r>
               <w:rPr>
                 <w:rFonts w:ascii="Consolas" w:eastAsia="Consolas" w:hAnsi="Consolas" w:cs="Consolas"/>
@@ -15962,6 +16688,7 @@
               </w:rPr>
               <w:t xml:space="preserve">, </w:t>
             </w:r>
+            <w:proofErr w:type="gramStart"/>
             <w:r>
               <w:rPr>
                 <w:rFonts w:ascii="Consolas" w:eastAsia="Consolas" w:hAnsi="Consolas" w:cs="Consolas"/>
@@ -15996,7 +16723,17 @@
                 <w:sz w:val="20"/>
                 <w:szCs w:val="20"/>
               </w:rPr>
-              <w:t xml:space="preserve">(ratio, </w:t>
+              <w:t>(</w:t>
+            </w:r>
+            <w:proofErr w:type="gramEnd"/>
+            <w:r>
+              <w:rPr>
+                <w:rFonts w:ascii="Consolas" w:eastAsia="Consolas" w:hAnsi="Consolas" w:cs="Consolas"/>
+                <w:color w:val="ABB2BF"/>
+                <w:sz w:val="20"/>
+                <w:szCs w:val="20"/>
+              </w:rPr>
+              <w:t xml:space="preserve">ratio, </w:t>
             </w:r>
             <w:r>
               <w:rPr>
@@ -16116,6 +16853,7 @@
             <w:bookmarkStart w:id="122" w:name="module-implementation"/>
             <w:bookmarkEnd w:id="113"/>
             <w:bookmarkEnd w:id="119"/>
+            <w:proofErr w:type="gramStart"/>
             <w:r>
               <w:rPr>
                 <w:rFonts w:ascii="Consolas" w:eastAsia="Consolas" w:hAnsi="Consolas" w:cs="Consolas"/>
@@ -16134,6 +16872,7 @@
               </w:rPr>
               <w:t>(</w:t>
             </w:r>
+            <w:proofErr w:type="gramEnd"/>
             <w:r>
               <w:rPr>
                 <w:rFonts w:ascii="Consolas" w:eastAsia="Consolas" w:hAnsi="Consolas" w:cs="Consolas"/>
@@ -16188,7 +16927,27 @@
                 <w:sz w:val="20"/>
                 <w:szCs w:val="20"/>
               </w:rPr>
-              <w:t xml:space="preserve"> oldQuality = currentQuality ?? </w:t>
+              <w:t xml:space="preserve"> oldQuality = </w:t>
+            </w:r>
+            <w:proofErr w:type="gramStart"/>
+            <w:r>
+              <w:rPr>
+                <w:rFonts w:ascii="Consolas" w:eastAsia="Consolas" w:hAnsi="Consolas" w:cs="Consolas"/>
+                <w:color w:val="ABB2BF"/>
+                <w:sz w:val="20"/>
+                <w:szCs w:val="20"/>
+              </w:rPr>
+              <w:t>currentQuality ??</w:t>
+            </w:r>
+            <w:proofErr w:type="gramEnd"/>
+            <w:r>
+              <w:rPr>
+                <w:rFonts w:ascii="Consolas" w:eastAsia="Consolas" w:hAnsi="Consolas" w:cs="Consolas"/>
+                <w:color w:val="ABB2BF"/>
+                <w:sz w:val="20"/>
+                <w:szCs w:val="20"/>
+              </w:rPr>
+              <w:t xml:space="preserve"> </w:t>
             </w:r>
             <w:r>
               <w:rPr>
@@ -16434,7 +17193,6 @@
                 <w:sz w:val="20"/>
                 <w:szCs w:val="20"/>
               </w:rPr>
-              <w:lastRenderedPageBreak/>
               <w:t xml:space="preserve">    );</w:t>
             </w:r>
           </w:p>
@@ -16477,6 +17235,7 @@
         <w:pStyle w:val="Heading2"/>
       </w:pPr>
       <w:r>
+        <w:lastRenderedPageBreak/>
         <w:t>4.8 Module Implementation</w:t>
       </w:r>
       <w:bookmarkEnd w:id="120"/>
@@ -16566,7 +17325,7 @@
     </w:p>
     <w:p>
       <w:pPr>
-        <w:pStyle w:val="BodyText"/>
+        <w:pStyle w:val="ImageCaption"/>
         <w:jc w:val="center"/>
         <w:rPr>
           <w:i/>
@@ -16588,6 +17347,7 @@
           <w:ilvl w:val="0"/>
           <w:numId w:val="18"/>
         </w:numPr>
+        <w:jc w:val="left"/>
       </w:pPr>
       <w:bookmarkStart w:id="126" w:name="_Toc235451465"/>
       <w:bookmarkStart w:id="127" w:name="_Toc236393577"/>
@@ -16605,6 +17365,7 @@
           <w:ilvl w:val="0"/>
           <w:numId w:val="18"/>
         </w:numPr>
+        <w:jc w:val="left"/>
       </w:pPr>
       <w:r>
         <w:t>Student calls `GET /matchmaking/candidates` to find tutor candidates. The backend will read the student profile, all tutor profiles, and schedule slots.</w:t>
@@ -16617,6 +17378,7 @@
           <w:ilvl w:val="0"/>
           <w:numId w:val="18"/>
         </w:numPr>
+        <w:jc w:val="left"/>
       </w:pPr>
       <w:r>
         <w:t>TopKRanker ranks all possible student-tutor pairs based on the CompositeScorer, giving the ranking of tutors and score per criteria.</w:t>
@@ -16629,8 +17391,10 @@
           <w:ilvl w:val="0"/>
           <w:numId w:val="18"/>
         </w:numPr>
-      </w:pPr>
-      <w:r>
+        <w:jc w:val="left"/>
+      </w:pPr>
+      <w:r>
+        <w:lastRenderedPageBreak/>
         <w:t>The front end will present the ranking of tutors and score percentages (0-100), eligibility, and tier badges for the top matches.</w:t>
       </w:r>
     </w:p>
@@ -16641,9 +17405,9 @@
           <w:ilvl w:val="0"/>
           <w:numId w:val="18"/>
         </w:numPr>
-      </w:pPr>
-      <w:r>
-        <w:lastRenderedPageBreak/>
+        <w:jc w:val="left"/>
+      </w:pPr>
+      <w:r>
         <w:t>Afterward, the student chooses one tutor by `POST /matchmaking/select` or by the admin calling `POST /matchmaking/batch`.</w:t>
       </w:r>
     </w:p>
@@ -16654,6 +17418,7 @@
           <w:ilvl w:val="0"/>
           <w:numId w:val="18"/>
         </w:numPr>
+        <w:jc w:val="left"/>
       </w:pPr>
       <w:r>
         <w:t>Then, GreedyAssignmentEngine makes the assignment, increments the assignedCount, and saves the match with score per criteria.</w:t>
@@ -16666,6 +17431,7 @@
           <w:ilvl w:val="0"/>
           <w:numId w:val="18"/>
         </w:numPr>
+        <w:jc w:val="left"/>
       </w:pPr>
       <w:r>
         <w:t>Finally, after the session, the student calls `POST /matchmaking/assignments/:id/feedback`, and the FeedbackUpdater will apply EMA to update the tutor's avgRating.</w:t>
@@ -16735,7 +17501,7 @@
     </w:p>
     <w:p>
       <w:pPr>
-        <w:pStyle w:val="BodyText"/>
+        <w:pStyle w:val="ImageCaption"/>
         <w:jc w:val="center"/>
       </w:pPr>
       <w:r>
@@ -16752,7 +17518,6 @@
         <w:pStyle w:val="Heading2"/>
       </w:pPr>
       <w:r>
-        <w:lastRenderedPageBreak/>
         <w:t>4.9 Testing Strategy</w:t>
       </w:r>
       <w:bookmarkEnd w:id="126"/>
@@ -16783,16 +17548,44 @@
         <w:rPr>
           <w:rStyle w:val="VerbatimChar"/>
         </w:rPr>
-        <w:t>core-engine.spec.ts</w:t>
-      </w:r>
-      <w:r>
-        <w:t xml:space="preserve"> (23 integration-style tests against the assignment engine as a whole, including top-K truncation behaviour) and </w:t>
-      </w:r>
+        <w:t>core-</w:t>
+      </w:r>
+      <w:proofErr w:type="gramStart"/>
       <w:r>
         <w:rPr>
           <w:rStyle w:val="VerbatimChar"/>
         </w:rPr>
-        <w:t>core-units.spec.ts</w:t>
+        <w:t>engine.spec</w:t>
+      </w:r>
+      <w:proofErr w:type="gramEnd"/>
+      <w:r>
+        <w:rPr>
+          <w:rStyle w:val="VerbatimChar"/>
+        </w:rPr>
+        <w:t>.ts</w:t>
+      </w:r>
+      <w:r>
+        <w:t xml:space="preserve"> (23 integration-style tests against the assignment engine as a whole, including top-K truncation behaviour) and </w:t>
+      </w:r>
+      <w:r>
+        <w:rPr>
+          <w:rStyle w:val="VerbatimChar"/>
+        </w:rPr>
+        <w:t>core-</w:t>
+      </w:r>
+      <w:proofErr w:type="gramStart"/>
+      <w:r>
+        <w:rPr>
+          <w:rStyle w:val="VerbatimChar"/>
+        </w:rPr>
+        <w:t>units.spec</w:t>
+      </w:r>
+      <w:proofErr w:type="gramEnd"/>
+      <w:r>
+        <w:rPr>
+          <w:rStyle w:val="VerbatimChar"/>
+        </w:rPr>
+        <w:t>.ts</w:t>
       </w:r>
       <w:r>
         <w:t xml:space="preserve"> (55 focused tests per class, added specifically to close the coverage gaps identified during evaluation). Both run independently of the NestJS application, consistent with the framework-independent design described in Section 4.2.2.</w:t>
@@ -16807,7 +17600,23 @@
           <w:b/>
           <w:bCs/>
         </w:rPr>
-        <w:t>Table 4.2: Unit Test Coverage by Class (pnpm test:cov, 13 August 2026)</w:t>
+        <w:t xml:space="preserve">Table 4.2: Unit Test Coverage by Class (pnpm </w:t>
+      </w:r>
+      <w:proofErr w:type="gramStart"/>
+      <w:r>
+        <w:rPr>
+          <w:b/>
+          <w:bCs/>
+        </w:rPr>
+        <w:t>test:cov</w:t>
+      </w:r>
+      <w:proofErr w:type="gramEnd"/>
+      <w:r>
+        <w:rPr>
+          <w:b/>
+          <w:bCs/>
+        </w:rPr>
+        <w:t>, 13 August 2026)</w:t>
       </w:r>
     </w:p>
     <w:tbl>
@@ -17413,6 +18222,7 @@
               <w:jc w:val="left"/>
             </w:pPr>
             <w:r>
+              <w:lastRenderedPageBreak/>
               <w:t>EligibilityFilter</w:t>
             </w:r>
           </w:p>
@@ -17471,7 +18281,6 @@
               <w:jc w:val="left"/>
             </w:pPr>
             <w:r>
-              <w:lastRenderedPageBreak/>
               <w:t>WeightAdaptation</w:t>
             </w:r>
           </w:p>
@@ -17578,6 +18387,14 @@
         </w:tc>
       </w:tr>
     </w:tbl>
+    <w:p>
+      <w:pPr>
+        <w:pStyle w:val="BodyText"/>
+        <w:rPr>
+          <w:noProof/>
+        </w:rPr>
+      </w:pPr>
+    </w:p>
     <w:p>
       <w:pPr>
         <w:pStyle w:val="BodyText"/>
@@ -17587,10 +18404,10 @@
           <w:noProof/>
         </w:rPr>
         <w:drawing>
-          <wp:inline distT="0" distB="0" distL="0" distR="0" wp14:anchorId="550D1B53" wp14:editId="44CBEA60">
-            <wp:extent cx="5794744" cy="2888984"/>
-            <wp:effectExtent l="0" t="0" r="0" b="6985"/>
-            <wp:docPr id="1372640228" name="Picture 1"/>
+          <wp:inline distT="0" distB="0" distL="0" distR="0" wp14:anchorId="0E0407C1" wp14:editId="12732390">
+            <wp:extent cx="5162550" cy="4765849"/>
+            <wp:effectExtent l="0" t="0" r="0" b="0"/>
+            <wp:docPr id="1154784253" name="Picture 1"/>
             <wp:cNvGraphicFramePr>
               <a:graphicFrameLocks xmlns:a="http://schemas.openxmlformats.org/drawingml/2006/main" noChangeAspect="1"/>
             </wp:cNvGraphicFramePr>
@@ -17598,12 +18415,18 @@
               <a:graphicData uri="http://schemas.openxmlformats.org/drawingml/2006/picture">
                 <pic:pic xmlns:pic="http://schemas.openxmlformats.org/drawingml/2006/picture">
                   <pic:nvPicPr>
-                    <pic:cNvPr id="1372640228" name=""/>
+                    <pic:cNvPr id="1154784253" name="Picture 1154784253"/>
                     <pic:cNvPicPr/>
                   </pic:nvPicPr>
                   <pic:blipFill rotWithShape="1">
-                    <a:blip r:embed="rId18"/>
-                    <a:srcRect t="37549" r="35771" b="5491"/>
+                    <a:blip r:embed="rId18">
+                      <a:extLst>
+                        <a:ext uri="{28A0092B-C50C-407E-A947-70E740481C1C}">
+                          <a14:useLocalDpi xmlns:a14="http://schemas.microsoft.com/office/drawing/2010/main" val="0"/>
+                        </a:ext>
+                      </a:extLst>
+                    </a:blip>
+                    <a:srcRect r="39102"/>
                     <a:stretch>
                       <a:fillRect/>
                     </a:stretch>
@@ -17611,7 +18434,7 @@
                   <pic:spPr bwMode="auto">
                     <a:xfrm>
                       <a:off x="0" y="0"/>
-                      <a:ext cx="5806913" cy="2895051"/>
+                      <a:ext cx="5172431" cy="4774970"/>
                     </a:xfrm>
                     <a:prstGeom prst="rect">
                       <a:avLst/>
@@ -17643,34 +18466,78 @@
         <w:rPr>
           <w:rStyle w:val="VerbatimChar"/>
         </w:rPr>
-        <w:t>pnpm test:cov</w:t>
-      </w:r>
-      <w:r>
-        <w:t xml:space="preserve"> run (13 August 2026), all 78 core algorithm tests passed — 23 in </w:t>
-      </w:r>
+        <w:t xml:space="preserve">pnpm </w:t>
+      </w:r>
+      <w:proofErr w:type="gramStart"/>
       <w:r>
         <w:rPr>
           <w:rStyle w:val="VerbatimChar"/>
         </w:rPr>
-        <w:t>core-engine.spec.ts</w:t>
-      </w:r>
-      <w:r>
-        <w:t xml:space="preserve"> and 55 in </w:t>
+        <w:t>test:cov</w:t>
+      </w:r>
+      <w:proofErr w:type="gramEnd"/>
+      <w:r>
+        <w:t xml:space="preserve"> run (13 August 2026), all 78 core algorithm tests passed — 23 in </w:t>
       </w:r>
       <w:r>
         <w:rPr>
           <w:rStyle w:val="VerbatimChar"/>
         </w:rPr>
-        <w:t>core-units.spec.ts</w:t>
-      </w:r>
-      <w:r>
-        <w:t xml:space="preserve"> — and the full backend suite, including the application-level health-check assertion in </w:t>
-      </w:r>
+        <w:t>core-</w:t>
+      </w:r>
+      <w:proofErr w:type="gramStart"/>
       <w:r>
         <w:rPr>
           <w:rStyle w:val="VerbatimChar"/>
         </w:rPr>
-        <w:t>app.controller.spec.ts</w:t>
+        <w:t>engine.spec</w:t>
+      </w:r>
+      <w:proofErr w:type="gramEnd"/>
+      <w:r>
+        <w:rPr>
+          <w:rStyle w:val="VerbatimChar"/>
+        </w:rPr>
+        <w:t>.ts</w:t>
+      </w:r>
+      <w:r>
+        <w:t xml:space="preserve"> and 55 in </w:t>
+      </w:r>
+      <w:r>
+        <w:rPr>
+          <w:rStyle w:val="VerbatimChar"/>
+        </w:rPr>
+        <w:t>core-</w:t>
+      </w:r>
+      <w:proofErr w:type="gramStart"/>
+      <w:r>
+        <w:rPr>
+          <w:rStyle w:val="VerbatimChar"/>
+        </w:rPr>
+        <w:t>units.spec</w:t>
+      </w:r>
+      <w:proofErr w:type="gramEnd"/>
+      <w:r>
+        <w:rPr>
+          <w:rStyle w:val="VerbatimChar"/>
+        </w:rPr>
+        <w:t>.ts</w:t>
+      </w:r>
+      <w:r>
+        <w:t xml:space="preserve"> — and the full backend suite, including the application-level health-check assertion in </w:t>
+      </w:r>
+      <w:proofErr w:type="gramStart"/>
+      <w:r>
+        <w:rPr>
+          <w:rStyle w:val="VerbatimChar"/>
+        </w:rPr>
+        <w:t>app.controller</w:t>
+      </w:r>
+      <w:proofErr w:type="gramEnd"/>
+      <w:r>
+        <w:rPr>
+          <w:rStyle w:val="VerbatimChar"/>
+        </w:rPr>
+        <w:t>.spec.ts</w:t>
       </w:r>
       <w:r>
         <w:t xml:space="preserve"> that had failed in an earlier captured run, passed 102 of 102. Table 4.2 transcribes the per-class coverage from that run.</w:t>
@@ -17685,6 +18552,7 @@
       <w:bookmarkStart w:id="134" w:name="edge-case-verification"/>
       <w:bookmarkEnd w:id="131"/>
       <w:r>
+        <w:lastRenderedPageBreak/>
         <w:t>4.9.2 Edge Case Verification</w:t>
       </w:r>
       <w:bookmarkEnd w:id="132"/>
@@ -17701,16 +18569,44 @@
         <w:rPr>
           <w:rStyle w:val="VerbatimChar"/>
         </w:rPr>
-        <w:t>core-engine.spec.ts</w:t>
-      </w:r>
-      <w:r>
-        <w:t xml:space="preserve"> and </w:t>
-      </w:r>
+        <w:t>core-</w:t>
+      </w:r>
+      <w:proofErr w:type="gramStart"/>
       <w:r>
         <w:rPr>
           <w:rStyle w:val="VerbatimChar"/>
         </w:rPr>
-        <w:t>core-units.spec.ts</w:t>
+        <w:t>engine.spec</w:t>
+      </w:r>
+      <w:proofErr w:type="gramEnd"/>
+      <w:r>
+        <w:rPr>
+          <w:rStyle w:val="VerbatimChar"/>
+        </w:rPr>
+        <w:t>.ts</w:t>
+      </w:r>
+      <w:r>
+        <w:t xml:space="preserve"> and </w:t>
+      </w:r>
+      <w:r>
+        <w:rPr>
+          <w:rStyle w:val="VerbatimChar"/>
+        </w:rPr>
+        <w:t>core-</w:t>
+      </w:r>
+      <w:proofErr w:type="gramStart"/>
+      <w:r>
+        <w:rPr>
+          <w:rStyle w:val="VerbatimChar"/>
+        </w:rPr>
+        <w:t>units.spec</w:t>
+      </w:r>
+      <w:proofErr w:type="gramEnd"/>
+      <w:r>
+        <w:rPr>
+          <w:rStyle w:val="VerbatimChar"/>
+        </w:rPr>
+        <w:t>.ts</w:t>
       </w:r>
       <w:r>
         <w:t>:</w:t>
@@ -17838,7 +18734,6 @@
               <w:jc w:val="left"/>
             </w:pPr>
             <w:r>
-              <w:lastRenderedPageBreak/>
               <w:t>Tutor at full capacity (assignedCount = capacity)</w:t>
             </w:r>
           </w:p>
@@ -18285,6 +19180,7 @@
               <w:jc w:val="left"/>
             </w:pPr>
             <w:r>
+              <w:lastRenderedPageBreak/>
               <w:t>Oversubscription (demand exceeds aggregate capacity)</w:t>
             </w:r>
           </w:p>
@@ -18352,14 +19248,18 @@
         <w:rPr>
           <w:rStyle w:val="VerbatimChar"/>
         </w:rPr>
-        <w:t>pnpm run test:cov</w:t>
-      </w:r>
-      <w:r>
-        <w:t xml:space="preserve"> from the backend package. The figures in Tables 4.2 and 4.3 were transcribed from the final authoritative run of 13 August 2026, in which all 78 core </w:t>
-      </w:r>
-      <w:r>
-        <w:lastRenderedPageBreak/>
-        <w:t>algorithm tests, the 23 evaluation-TUI tests, and the application-level health check passed (102 of 102).</w:t>
+        <w:t xml:space="preserve">pnpm run </w:t>
+      </w:r>
+      <w:proofErr w:type="gramStart"/>
+      <w:r>
+        <w:rPr>
+          <w:rStyle w:val="VerbatimChar"/>
+        </w:rPr>
+        <w:t>test:cov</w:t>
+      </w:r>
+      <w:proofErr w:type="gramEnd"/>
+      <w:r>
+        <w:t xml:space="preserve"> from the backend package. The figures in Tables 4.2 and 4.3 were transcribed from the final authoritative run of 13 August 2026, in which all 78 core algorithm tests, the 23 evaluation-TUI tests, and the application-level health check passed (102 of 102).</w:t>
       </w:r>
     </w:p>
     <w:p>
@@ -18439,7 +19339,11 @@
         <w:t>stress-sweep</w:t>
       </w:r>
       <w:r>
-        <w:t xml:space="preserve"> (a deliberate 10:1 oversubscription stress test at four scales, used to validate the Big-O scaling behaviour in Section 4.10.4 and as the contention case in the baseline comparison of Section 4.10.5).</w:t>
+        <w:t xml:space="preserve"> (a deliberate 10:1 oversubscription stress test at four scales, used to validate the Big-O scaling </w:t>
+      </w:r>
+      <w:r>
+        <w:lastRenderedPageBreak/>
+        <w:t>behaviour in Section 4.10.4 and as the contention case in the baseline comparison of Section 4.10.5).</w:t>
       </w:r>
     </w:p>
     <w:p>
@@ -18472,9 +19376,125 @@
         <m:oMath>
           <m:r>
             <w:rPr>
-              <w:rFonts w:ascii="Cambria Math" w:hAnsi="Cambria Math"/>
+              <w:rFonts w:ascii="Cambria Math" w:eastAsiaTheme="minorEastAsia" w:hAnsi="Cambria Math"/>
             </w:rPr>
-            <m:t>J(x) = (sum of x_i)^2 / (n * sum of x_i^2)</m:t>
+            <m:t xml:space="preserve">J(x) = </m:t>
+          </m:r>
+          <m:sSup>
+            <m:sSupPr>
+              <m:ctrlPr>
+                <w:rPr>
+                  <w:rFonts w:ascii="Cambria Math" w:eastAsiaTheme="minorEastAsia" w:hAnsi="Cambria Math"/>
+                  <w:i/>
+                </w:rPr>
+              </m:ctrlPr>
+            </m:sSupPr>
+            <m:e>
+              <m:r>
+                <w:rPr>
+                  <w:rFonts w:ascii="Cambria Math" w:eastAsiaTheme="minorEastAsia" w:hAnsi="Cambria Math"/>
+                </w:rPr>
+                <m:t xml:space="preserve">(sum of </m:t>
+              </m:r>
+              <m:sSub>
+                <m:sSubPr>
+                  <m:ctrlPr>
+                    <w:rPr>
+                      <w:rFonts w:ascii="Cambria Math" w:eastAsiaTheme="minorEastAsia" w:hAnsi="Cambria Math"/>
+                      <w:i/>
+                    </w:rPr>
+                  </m:ctrlPr>
+                </m:sSubPr>
+                <m:e>
+                  <m:r>
+                    <w:rPr>
+                      <w:rFonts w:ascii="Cambria Math" w:eastAsiaTheme="minorEastAsia" w:hAnsi="Cambria Math"/>
+                    </w:rPr>
+                    <m:t>x</m:t>
+                  </m:r>
+                </m:e>
+                <m:sub>
+                  <m:r>
+                    <w:rPr>
+                      <w:rFonts w:ascii="Cambria Math" w:eastAsiaTheme="minorEastAsia" w:hAnsi="Cambria Math"/>
+                    </w:rPr>
+                    <m:t>i</m:t>
+                  </m:r>
+                </m:sub>
+              </m:sSub>
+              <m:r>
+                <w:rPr>
+                  <w:rFonts w:ascii="Cambria Math" w:eastAsiaTheme="minorEastAsia" w:hAnsi="Cambria Math"/>
+                </w:rPr>
+                <m:t>)</m:t>
+              </m:r>
+            </m:e>
+            <m:sup>
+              <m:r>
+                <w:rPr>
+                  <w:rFonts w:ascii="Cambria Math" w:eastAsiaTheme="minorEastAsia" w:hAnsi="Cambria Math"/>
+                </w:rPr>
+                <m:t>2</m:t>
+              </m:r>
+            </m:sup>
+          </m:sSup>
+          <m:r>
+            <w:rPr>
+              <w:rFonts w:ascii="Cambria Math" w:eastAsiaTheme="minorEastAsia" w:hAnsi="Cambria Math"/>
+            </w:rPr>
+            <m:t xml:space="preserve"> / (n * sum of </m:t>
+          </m:r>
+          <m:sSup>
+            <m:sSupPr>
+              <m:ctrlPr>
+                <w:rPr>
+                  <w:rFonts w:ascii="Cambria Math" w:eastAsiaTheme="minorEastAsia" w:hAnsi="Cambria Math"/>
+                  <w:i/>
+                </w:rPr>
+              </m:ctrlPr>
+            </m:sSupPr>
+            <m:e>
+              <m:sSub>
+                <m:sSubPr>
+                  <m:ctrlPr>
+                    <w:rPr>
+                      <w:rFonts w:ascii="Cambria Math" w:eastAsiaTheme="minorEastAsia" w:hAnsi="Cambria Math"/>
+                      <w:i/>
+                    </w:rPr>
+                  </m:ctrlPr>
+                </m:sSubPr>
+                <m:e>
+                  <m:r>
+                    <w:rPr>
+                      <w:rFonts w:ascii="Cambria Math" w:eastAsiaTheme="minorEastAsia" w:hAnsi="Cambria Math"/>
+                    </w:rPr>
+                    <m:t>x</m:t>
+                  </m:r>
+                </m:e>
+                <m:sub>
+                  <m:r>
+                    <w:rPr>
+                      <w:rFonts w:ascii="Cambria Math" w:eastAsiaTheme="minorEastAsia" w:hAnsi="Cambria Math"/>
+                    </w:rPr>
+                    <m:t>i</m:t>
+                  </m:r>
+                </m:sub>
+              </m:sSub>
+            </m:e>
+            <m:sup>
+              <m:r>
+                <w:rPr>
+                  <w:rFonts w:ascii="Cambria Math" w:eastAsiaTheme="minorEastAsia" w:hAnsi="Cambria Math"/>
+                </w:rPr>
+                <m:t>2</m:t>
+              </m:r>
+            </m:sup>
+          </m:sSup>
+          <m:r>
+            <w:rPr>
+              <w:rFonts w:ascii="Cambria Math" w:eastAsiaTheme="minorEastAsia" w:hAnsi="Cambria Math"/>
+            </w:rPr>
+            <m:t>)</m:t>
           </m:r>
         </m:oMath>
       </m:oMathPara>
@@ -18484,7 +19504,38 @@
         <w:pStyle w:val="BodyText"/>
       </w:pPr>
       <w:r>
-        <w:t>where x_i is tutor i’s assigned load and n is the number of tutors. A value of 1 indicates perfectly even load distribution.</w:t>
+        <w:t xml:space="preserve">where </w:t>
+      </w:r>
+      <m:oMath>
+        <m:sSub>
+          <m:sSubPr>
+            <m:ctrlPr>
+              <w:rPr>
+                <w:rFonts w:ascii="Cambria Math" w:hAnsi="Cambria Math"/>
+                <w:i/>
+              </w:rPr>
+            </m:ctrlPr>
+          </m:sSubPr>
+          <m:e>
+            <m:r>
+              <w:rPr>
+                <w:rFonts w:ascii="Cambria Math" w:hAnsi="Cambria Math"/>
+              </w:rPr>
+              <m:t>x</m:t>
+            </m:r>
+          </m:e>
+          <m:sub>
+            <m:r>
+              <w:rPr>
+                <w:rFonts w:ascii="Cambria Math" w:hAnsi="Cambria Math"/>
+              </w:rPr>
+              <m:t>i</m:t>
+            </m:r>
+          </m:sub>
+        </m:sSub>
+      </m:oMath>
+      <w:r>
+        <w:t xml:space="preserve"> is tutor i’s assigned load and n is the number of tutors. A value of 1 indicates perfectly even load distribution.</w:t>
       </w:r>
     </w:p>
     <w:p>
@@ -18496,7 +19547,6 @@
           <w:b/>
           <w:bCs/>
         </w:rPr>
-        <w:lastRenderedPageBreak/>
         <w:t>Table 4.4: Match Quality and Fairness by Scenario (loadFactorWeight = 0.05)</w:t>
       </w:r>
     </w:p>
@@ -19321,7 +20371,11 @@
         <w:pStyle w:val="BodyText"/>
       </w:pPr>
       <w:r>
-        <w:t>Table 4.4 reports the stress-sweep family only at its two largest scales. The two smallest stress runs (50 students with 5 tutors, and 200 students with 20 tutors) are included in the timing measurements of Table 4.6, but their quality and fairness statistics are dominated by the very small tutor pool (at the smallest scale, 78% of students go unassigned and the average score drops to 0.53) and are therefore omitted here rather than presented as comparable rows.</w:t>
+        <w:t xml:space="preserve">Table 4.4 reports the stress-sweep family only at its two largest scales. The two smallest stress runs (50 students with 5 tutors, and 200 students with 20 tutors) are included in the timing measurements of Table 4.6, but their quality and fairness statistics are dominated by the very small </w:t>
+      </w:r>
+      <w:r>
+        <w:lastRenderedPageBreak/>
+        <w:t>tutor pool (at the smallest scale, 78% of students go unassigned and the average score drops to 0.53) and are therefore omitted here rather than presented as comparable rows.</w:t>
       </w:r>
     </w:p>
     <w:p>
@@ -19363,7 +20417,6 @@
           <w:b/>
           <w:bCs/>
         </w:rPr>
-        <w:lastRenderedPageBreak/>
         <w:t>Table 4.5: Effect of the Fairness Weight by Ratio</w:t>
       </w:r>
     </w:p>
@@ -19903,7 +20956,11 @@
         <w:pStyle w:val="BodyText"/>
       </w:pPr>
       <w:r>
-        <w:t>This is the central finding of the fairness evaluation: the mechanism has a measurable, positive effect on load distribution only within a specific regime. At 1.5:1, enabling the fairness weight improves Jain’s index from 0.5945 to 0.6335 (+0.039), and the average score is, if anything, slightly higher rather than lower, because spreading load onto emptier tutors captures the cold-start boost. At 2:1 and beyond in the current fixtures, Jain’s index is identical whether the weight is enabled or not: tutor capacity becomes the binding constraint, nearly every eligible tutor fills to its own fixed capacity regardless of assignment order, and no score-based reordering can change the final load distribution. The average-score column should be read with a caveat. Because the composite score itself includes the fairness term, average scores across the two weight settings are not directly comparable as quality measures. Within the moderate band the fairness-aware runs report slightly higher averages (0.6194 against 0.6106 at 1.5:1, 0.6208 against 0.6137 at 2:1, 0.6093 against 0.6046 at 3:1, and 0.6082 against 0.6042 at 4:1); at 10:1 the position reverses slightly (0.7124 against 0.7145). In a deployment that persistently operates under severe oversubscription, the load-factor weight is therefore largely inert; where it does act, it buys a measurably fairer load distribution at no clear quality penalty in the moderate band.</w:t>
+        <w:t xml:space="preserve">This is the central finding of the fairness evaluation: the mechanism has a measurable, positive effect on load distribution only within a specific regime. At 1.5:1, enabling the fairness weight improves Jain’s index from 0.5945 to 0.6335 (+0.039), and the average score is, if anything, slightly higher rather than lower, because spreading load onto emptier tutors captures the cold-start boost. At 2:1 and beyond in the current fixtures, Jain’s index is identical whether the weight is enabled or not: tutor capacity becomes the binding constraint, nearly every eligible tutor fills to its own fixed capacity regardless of assignment order, and no score-based reordering can change the final load distribution. The average-score column should be read with a caveat. Because the </w:t>
+      </w:r>
+      <w:r>
+        <w:lastRenderedPageBreak/>
+        <w:t>composite score itself includes the fairness term, average scores across the two weight settings are not directly comparable as quality measures. Within the moderate band the fairness-aware runs report slightly higher averages (0.6194 against 0.6106 at 1.5:1, 0.6208 against 0.6137 at 2:1, 0.6093 against 0.6046 at 3:1, and 0.6082 against 0.6042 at 4:1); at 10:1 the position reverses slightly (0.7124 against 0.7145). In a deployment that persistently operates under severe oversubscription, the load-factor weight is therefore largely inert; where it does act, it buys a measurably fairer load distribution at no clear quality penalty in the moderate band.</w:t>
       </w:r>
     </w:p>
     <w:p>
@@ -19911,11 +20968,7 @@
         <w:pStyle w:val="BodyText"/>
       </w:pPr>
       <w:r>
-        <w:t xml:space="preserve">A focused unit test isolates the mechanism from this aggregate, capacity-driven effect directly: given two otherwise identical tutors, one nearly full (2/3 capacity) and one empty (0/3), a single student’s total match score favoured the empty tutor by 0.0359 when loadFactorWeight = 0.05, and the two tutors scored identically to six decimal places when loadFactorWeight = 0. This confirms the fairness term functions correctly at the level of an individual comparison; its </w:t>
-      </w:r>
-      <w:r>
-        <w:lastRenderedPageBreak/>
-        <w:t>aggregate effect in Table 4.5 is real but bounded by how much slack capacity actually exists in the system.</w:t>
+        <w:t>A focused unit test isolates the mechanism from this aggregate, capacity-driven effect directly: given two otherwise identical tutors, one nearly full (2/3 capacity) and one empty (0/3), a single student’s total match score favoured the empty tutor by 0.0359 when loadFactorWeight = 0.05, and the two tutors scored identically to six decimal places when loadFactorWeight = 0. This confirms the fairness term functions correctly at the level of an individual comparison; its aggregate effect in Table 4.5 is real but bounded by how much slack capacity actually exists in the system.</w:t>
       </w:r>
     </w:p>
     <w:p>
@@ -19937,7 +20990,24 @@
         <w:pStyle w:val="FirstParagraph"/>
       </w:pPr>
       <w:r>
-        <w:t xml:space="preserve">To validate the O(n^2 log n) theoretical bound from Section 4.5.3, wall-clock execution time was measured on the </w:t>
+        <w:t xml:space="preserve">To validate the </w:t>
+      </w:r>
+      <w:proofErr w:type="gramStart"/>
+      <w:r>
+        <w:t>O(</w:t>
+      </w:r>
+      <w:proofErr w:type="gramEnd"/>
+      <w:r>
+        <w:t>n</w:t>
+      </w:r>
+      <w:r>
+        <w:rPr>
+          <w:vertAlign w:val="superscript"/>
+        </w:rPr>
+        <w:t>2</w:t>
+      </w:r>
+      <w:r>
+        <w:t xml:space="preserve"> log n) theoretical bound from Section 4.5.3, wall-clock execution time was measured on the </w:t>
       </w:r>
       <w:r>
         <w:rPr>
@@ -20411,7 +21481,34 @@
         <w:pStyle w:val="BodyText"/>
       </w:pPr>
       <w:r>
-        <w:t>Pairs scored grow 216 to 6,769 to 176,790 across the three size steps. A five-fold increase in scale raises the number of pairs by a factor of roughly 26 to 31, consistent with the O(n²) pair-scoring floor. Mean elapsed time grows from 6.2 ms at 200 students to 108.0 ms at 1,000 and 2,066.6 ms at 5,000, consistent with quadratic growth plus a slowly growing log factor, matching the O(n^2 log n) bound derived in Section 4.5.3. The smallest scale’s timings (low single-digit milliseconds) are close to the resolution of the measurement and are dominated by JIT warm-up noise rather than algorithmic cost; they are reported for completeness but should not be read as precise.</w:t>
+        <w:t xml:space="preserve">Pairs scored grow 216 to 6,769 to 176,790 across the three size steps. A five-fold increase in scale raises the number of pairs by a factor of roughly 26 to 31, consistent with the O(n²) pair-scoring </w:t>
+      </w:r>
+      <w:r>
+        <w:lastRenderedPageBreak/>
+        <w:t xml:space="preserve">floor. Mean elapsed time grows from 6.2 ms at 200 students to 108.0 ms at 1,000 and 2,066.6 ms at 5,000, consistent with quadratic growth plus a slowly growing log factor, matching the </w:t>
+      </w:r>
+      <w:proofErr w:type="gramStart"/>
+      <w:r>
+        <w:t>O(</w:t>
+      </w:r>
+      <w:proofErr w:type="gramEnd"/>
+      <w:r>
+        <w:t>n</w:t>
+      </w:r>
+      <w:r>
+        <w:rPr>
+          <w:vertAlign w:val="superscript"/>
+        </w:rPr>
+        <w:t>2</w:t>
+      </w:r>
+      <w:r>
+        <w:rPr>
+          <w:vertAlign w:val="superscript"/>
+        </w:rPr>
+        <w:t xml:space="preserve"> </w:t>
+      </w:r>
+      <w:r>
+        <w:t>log n) bound derived in Section 4.5.3. The smallest scale’s timings (low single-digit milliseconds) are close to the resolution of the measurement and are dominated by JIT warm-up noise rather than algorithmic cost; they are reported for completeness but should not be read as precise.</w:t>
       </w:r>
     </w:p>
     <w:p>
@@ -20431,11 +21528,7 @@
         <w:pStyle w:val="FirstParagraph"/>
       </w:pPr>
       <w:r>
-        <w:t>RQ6 asks how the proposed algorithm compares with the matching methods tutoring platforms traditionally use. Three baselines were implemented alongside the harness (baseline-comparison.ts) and run on the same generated fixtures, the same eligibility filter, and the same composite scorer as the engine, so that any difference reflects the assignment strategy alone. The first baseline, filter-only first-come-first-served (FCFS), assigns each student in arrival order to the first eligible tutor with spare capacity and performs no scoring — mirroring the subject-and-</w:t>
-      </w:r>
-      <w:r>
-        <w:lastRenderedPageBreak/>
-        <w:t>availability filtering of deployed tutor-finding applications (Taveekarn et al., 2014). The second, self-selection FCFS, lets each student in arrival order take their own highest-scoring eligible tutor — mirroring a student browsing a ranked list and booking the top result: per-student optimal, but with no coordination across students.</w:t>
+        <w:t>RQ6 asks how the proposed algorithm compares with the matching methods tutoring platforms traditionally use. Three baselines were implemented alongside the harness (baseline-comparison.ts) and run on the same generated fixtures, the same eligibility filter, and the same composite scorer as the engine, so that any difference reflects the assignment strategy alone. The first baseline, filter-only first-come-first-served (FCFS), assigns each student in arrival order to the first eligible tutor with spare capacity and performs no scoring — mirroring the subject-and-availability filtering of deployed tutor-finding applications (Taveekarn et al., 2014). The second, self-selection FCFS, lets each student in arrival order take their own highest-scoring eligible tutor — mirroring a student browsing a ranked list and booking the top result: per-student optimal, but with no coordination across students.</w:t>
       </w:r>
     </w:p>
     <w:p>
@@ -20742,6 +21835,7 @@
               <w:jc w:val="left"/>
             </w:pPr>
             <w:r>
+              <w:lastRenderedPageBreak/>
               <w:t>moderate-1.5to1</w:t>
             </w:r>
           </w:p>
@@ -21249,19 +22343,19 @@
         <w:pStyle w:val="BodyText"/>
       </w:pPr>
       <w:r>
-        <w:t xml:space="preserve">The four strategies differ slightly in the percentage of students they leave unassigned: the filter-only baseline places every student onto the first eligible tutor and therefore leaves the fewest unassigned, while the score-based strategies hold out for the best remaining seat. The differences </w:t>
+        <w:t>The four strategies differ slightly in the percentage of students they leave unassigned: the filter-only baseline places every student onto the first eligible tutor and therefore leaves the fewest unassigned, while the score-based strategies hold out for the best remaining seat. The differences are small (at most 3.3 percentage points at 1.5:1) and bounded by aggregate tutor capacity in every scenario, so the comparison focuses on match quality and load distribution. Filter-only FCFS, the strategy closest to deployed practice, costs between 0.08 and 0.18 in average compatibility (a 13–26% relative reduction) at every ratio, and produces the most uneven load distribution whenever capacity is slack (Jain’s index 0.46 at 1:1 against 0.56 for the engine, and 0.52 at 1.5:1 against 0.63), because arrival order funnels students onto the first-listed tutors. This is the empirical case for scoring at all.</w:t>
+      </w:r>
+    </w:p>
+    <w:p>
+      <w:pPr>
+        <w:pStyle w:val="BodyText"/>
+      </w:pPr>
+      <w:r>
+        <w:t xml:space="preserve">The self-selection baseline is the more revealing comparison. It tracks the engine closely wherever supply is abundant: at 1:1 the engine leads by 0.002 in average score, and at 1.5:1 by 0.007, because when every student can still obtain a near-best tutor, global coordination has little to add. Under contention the gap widens. The engine’s globally score-ordered assignment beats self-selection by 0.012 at 2:1, 0.023 at 3:1, and 0.130 at 10:1, because early arrivals under FCFS take tutors that later students needed more, while the batch engine gives each remaining seat to the pairing that values it most, regardless of arrival order. The deferred-acceptance baseline produces essentially the same average score as the engine at every ratio (within 0.001), as both optimise over the same static utilities; the engine’s advantage shows up in load distribution instead: Jain’s index is 0.5620 against 0.5236 at 1:1 and 0.6335 against 0.6057 at 1.5:1, because the greedy engine keeps </w:t>
       </w:r>
       <w:r>
         <w:lastRenderedPageBreak/>
-        <w:t>are small (at most 3.3 percentage points at 1.5:1) and bounded by aggregate tutor capacity in every scenario, so the comparison focuses on match quality and load distribution. Filter-only FCFS, the strategy closest to deployed practice, costs between 0.08 and 0.18 in average compatibility (a 13–26% relative reduction) at every ratio, and produces the most uneven load distribution whenever capacity is slack (Jain’s index 0.46 at 1:1 against 0.56 for the engine, and 0.52 at 1.5:1 against 0.63), because arrival order funnels students onto the first-listed tutors. This is the empirical case for scoring at all.</w:t>
-      </w:r>
-    </w:p>
-    <w:p>
-      <w:pPr>
-        <w:pStyle w:val="BodyText"/>
-      </w:pPr>
-      <w:r>
-        <w:t>The self-selection baseline is the more revealing comparison. It tracks the engine closely wherever supply is abundant: at 1:1 the engine leads by 0.002 in average score, and at 1.5:1 by 0.007, because when every student can still obtain a near-best tutor, global coordination has little to add. Under contention the gap widens. The engine’s globally score-ordered assignment beats self-selection by 0.012 at 2:1, 0.023 at 3:1, and 0.130 at 10:1, because early arrivals under FCFS take tutors that later students needed more, while the batch engine gives each remaining seat to the pairing that values it most, regardless of arrival order. The deferred-acceptance baseline produces essentially the same average score as the engine at every ratio (within 0.001), as both optimise over the same static utilities; the engine’s advantage shows up in load distribution instead: Jain’s index is 0.5620 against 0.5236 at 1:1 and 0.6335 against 0.6057 at 1.5:1, because the greedy engine keeps recomputing fairness as tutors fill, whereas a stable matching fixes each pair once. The practical reading for RQ6 is that the algorithm’s advantage over simpler methods is concentrated exactly where a real platform hurts, when demand presses against tutor capacity; it offers no false promise of improvement when supply is abundant.</w:t>
+        <w:t>recomputing fairness as tutors fill, whereas a stable matching fixes each pair once. The practical reading for RQ6 is that the algorithm’s advantage over simpler methods is concentrated exactly where a real platform hurts, when demand presses against tutor capacity; it offers no false promise of improvement when supply is abundant.</w:t>
       </w:r>
     </w:p>
     <w:p>
@@ -21559,7 +22653,6 @@
                 <w:sz w:val="20"/>
                 <w:szCs w:val="20"/>
               </w:rPr>
-              <w:lastRenderedPageBreak/>
               <w:t xml:space="preserve">    </w:t>
             </w:r>
             <w:r>
@@ -22252,7 +23345,6 @@
         <w:pStyle w:val="FirstParagraph"/>
       </w:pPr>
       <w:r>
-        <w:lastRenderedPageBreak/>
         <w:t>The client renders this breakdown as a percentage alongside a per-criterion explanation, making the algorithm’s decision inspectable rather than a black box — directly addressing RQ7.</w:t>
       </w:r>
     </w:p>
@@ -22303,6 +23395,7 @@
           <w:b/>
           <w:bCs/>
         </w:rPr>
+        <w:lastRenderedPageBreak/>
         <w:t>Measured and strong:</w:t>
       </w:r>
       <w:r>
@@ -22321,11 +23414,7 @@
         <w:t>Measured and regime-dependent:</w:t>
       </w:r>
       <w:r>
-        <w:t xml:space="preserve"> the fairness mechanism was shown to measurably improve load distribution (Jain’s index +0.039 at a 1.5:1 student:tutor ratio, with no measurable change at 2:1 or beyond in the current fixtures (Table 4.5) — the fairness-aware runs report slightly higher average scores in the moderate band, though the comparison is confounded by the fairness term </w:t>
-      </w:r>
-      <w:r>
-        <w:lastRenderedPageBreak/>
-        <w:t>being part of the composite — because tutor capacity becomes the binding constraint on load distribution, not the scoring function. This is not a flaw in the fairness scorer – a dedicated unit test confirms it functions exactly as designed at the level of an individual student-tutor comparison (Section 4.10.3) – it is a property of the regime being tested. The honest conclusion is that load-factor weighting is most valuable when the tutor pool has moderate slack; under severe oversubscription, no scoring mechanism can substitute for having enough tutor capacity in the first place. In that regime the load-factor weight is best disabled outright: it buys no redistribution and carries a small compatibility cost.</w:t>
+        <w:t xml:space="preserve"> the fairness mechanism was shown to measurably improve load distribution (Jain’s index +0.039 at a 1.5:1 student:tutor ratio, with no measurable change at 2:1 or beyond in the current fixtures (Table 4.5) — the fairness-aware runs report slightly higher average scores in the moderate band, though the comparison is confounded by the fairness term being part of the composite — because tutor capacity becomes the binding constraint on load distribution, not the scoring function. This is not a flaw in the fairness scorer – a dedicated unit test confirms it functions exactly as designed at the level of an individual student-tutor comparison (Section 4.10.3) – it is a property of the regime being tested. The honest conclusion is that load-factor weighting is most valuable when the tutor pool has moderate slack; under severe oversubscription, no scoring mechanism can substitute for having enough tutor capacity in the first place. In that regime the load-factor weight is best disabled outright: it buys no redistribution and carries a small compatibility cost.</w:t>
       </w:r>
     </w:p>
     <w:p>
@@ -22402,7 +23491,15 @@
         <w:pStyle w:val="BodyText"/>
       </w:pPr>
       <w:r>
-        <w:t xml:space="preserve">The algorithm’s time complexity was analyzed as O(n^2 log n), with the n^2 term arising from exhaustive pair scoring and the log factor from the heap/sort machinery (Section 4.5.3). This bound was independently confirmed empirically: pairs scored grew by roughly the square of the scale factor at each five-fold increase, and mean execution time grew consistently with the predicted quadratic-times-log shape (Section 4.10.4). A 1/2-approximation guarantee was established through the standard exchange argument for greedy weighted bipartite matching (Preis, 1999; Korte &amp; Vygen, 2018), and separately, an exact min-cost max-flow baseline computed at small scales showed the implemented algorithm achieving 94.3-100% of the true optimal score in practice — far exceeding its own proven worst-case bound (Section 4.5.5). Compared with baseline strategies on identical fixtures, the engine delivered 13–26% higher average compatibility </w:t>
+        <w:t xml:space="preserve">The algorithm’s time complexity was analyzed as </w:t>
+      </w:r>
+      <w:proofErr w:type="gramStart"/>
+      <w:r>
+        <w:t>O(</w:t>
+      </w:r>
+      <w:proofErr w:type="gramEnd"/>
+      <w:r>
+        <w:t xml:space="preserve">n^2 log n), with the n^2 term arising from exhaustive pair scoring and the log factor from the heap/sort machinery (Section 4.5.3). This bound was independently confirmed empirically: pairs scored grew by roughly the square of the scale factor at each five-fold increase, and mean execution time grew consistently with the predicted quadratic-times-log shape (Section 4.10.4). A 1/2-approximation guarantee was established through the standard exchange argument for greedy weighted bipartite matching (Preis, 1999; Korte &amp; Vygen, 2018), and separately, an exact min-cost max-flow baseline computed at small scales showed the implemented algorithm achieving 94.3-100% of the true optimal score in practice — far exceeding its own proven worst-case bound (Section 4.5.5). Compared with baseline strategies on identical fixtures, the engine delivered 13–26% higher average compatibility </w:t>
       </w:r>
       <w:r>
         <w:lastRenderedPageBreak/>
@@ -22414,7 +23511,15 @@
         <w:pStyle w:val="BodyText"/>
       </w:pPr>
       <w:r>
-        <w:t>An evaluation harness (Section 4.10) measured match quality, Jain’s fairness index, and execution time across three scenario families: a realistic scenario mirroring the platform’s actual 1:1 student:tutor seed data, a moderate-load band (1.5:1 to 4:1) added specifically to probe the fairness mechanism, and a 10:1 stress-sweep used to validate scaling behaviour. The fairness weight was found to measurably improve load distribution (Jain’s index +0.039 at a 1.5:1 ratio, Table 4.5), with no measurable change at 2:1 or beyond, where tutor capacity itself becomes the binding constraint on load distribution; the fairness-aware runs reported slightly higher average scores in the moderate band, so the weight is recommended mainly for moderate-load deployments (Section 4.10.3). A dedicated unit test confirmed the mechanism functions correctly at the level of an individual student-tutor comparison, independent of this capacity-driven aggregate effect.</w:t>
+        <w:t xml:space="preserve">An evaluation harness (Section 4.10) measured match quality, Jain’s fairness index, and execution time across three scenario families: a realistic scenario mirroring the platform’s actual 1:1 </w:t>
+      </w:r>
+      <w:proofErr w:type="gramStart"/>
+      <w:r>
+        <w:t>student:tutor</w:t>
+      </w:r>
+      <w:proofErr w:type="gramEnd"/>
+      <w:r>
+        <w:t xml:space="preserve"> seed data, a moderate-load band (1.5:1 to 4:1) added specifically to probe the fairness mechanism, and a 10:1 stress-sweep used to validate scaling behaviour. The fairness weight was found to measurably improve load distribution (Jain’s index +0.039 at a 1.5:1 ratio, Table 4.5), with no measurable change at 2:1 or beyond, where tutor capacity itself becomes the binding constraint on load distribution; the fairness-aware runs reported slightly higher average scores in the moderate band, so the weight is recommended mainly for moderate-load deployments (Section 4.10.3). A dedicated unit test confirmed the mechanism functions correctly at the level of an individual student-tutor comparison, independent of this capacity-driven aggregate effect.</w:t>
       </w:r>
     </w:p>
     <w:p>
@@ -22455,7 +23560,23 @@
         </w:numPr>
       </w:pPr>
       <w:r>
-        <w:t>RQ1: A multi-criteria weighted model with four sub-scorers (M(s,t) = alpha</w:t>
+        <w:t xml:space="preserve">RQ1: A </w:t>
+      </w:r>
+      <w:proofErr w:type="gramStart"/>
+      <w:r>
+        <w:t>multi-criteria</w:t>
+      </w:r>
+      <w:proofErr w:type="gramEnd"/>
+      <w:r>
+        <w:t xml:space="preserve"> weighted model with four sub-scorers (M(</w:t>
+      </w:r>
+      <w:proofErr w:type="gramStart"/>
+      <w:r>
+        <w:t>s,t</w:t>
+      </w:r>
+      <w:proofErr w:type="gramEnd"/>
+      <w:r>
+        <w:t>) = alpha</w:t>
       </w:r>
       <w:r>
         <w:rPr>
@@ -22509,7 +23630,31 @@
       </w:pPr>
       <w:r>
         <w:lastRenderedPageBreak/>
-        <w:t>RQ4: Fairness and load balancing are achieved through the FairnessScorer F(t) = min(1, (1 - LoadRatio(t))^1.15 + b(t)), with a cold-start boost for unused tutors. The mechanism measurably improves Jain’s fairness index at a 1.5:1 student:tutor ratio (by 0.039, Table 4.5), with no measurable change once tutor capacity binds; at higher ratios in the moderate band it neither improves load distribution nor lowers match quality, and under severe oversubscription it carries a small compatibility cost, so the weight is best disabled there (Section 4.10.3).</w:t>
+        <w:t xml:space="preserve">RQ4: Fairness and load balancing are achieved through the FairnessScorer F(t) = </w:t>
+      </w:r>
+      <w:proofErr w:type="gramStart"/>
+      <w:r>
+        <w:t>min(</w:t>
+      </w:r>
+      <w:proofErr w:type="gramEnd"/>
+      <w:r>
+        <w:t>1, (1 - LoadRatio(t</w:t>
+      </w:r>
+      <w:proofErr w:type="gramStart"/>
+      <w:r>
+        <w:t>))^</w:t>
+      </w:r>
+      <w:proofErr w:type="gramEnd"/>
+      <w:r>
+        <w:t xml:space="preserve">1.15 + b(t)), with a cold-start boost for unused tutors. The mechanism measurably improves Jain’s fairness index at a 1.5:1 student:tutor ratio (by 0.039, Table 4.5), with no measurable change once tutor capacity binds; at higher ratios in the moderate </w:t>
+      </w:r>
+      <w:proofErr w:type="gramStart"/>
+      <w:r>
+        <w:t>band</w:t>
+      </w:r>
+      <w:proofErr w:type="gramEnd"/>
+      <w:r>
+        <w:t xml:space="preserve"> it neither improves load distribution nor lowers match quality, and under severe oversubscription it carries a small compatibility cost, so the weight is best disabled there (Section 4.10.3).</w:t>
       </w:r>
     </w:p>
     <w:p>
@@ -22531,7 +23676,15 @@
         </w:numPr>
       </w:pPr>
       <w:r>
-        <w:t>RQ6: The algorithm scales as O(n^2 log n), confirmed empirically: pairs scored grow by roughly the square of the system size. It carries a proven 1/2-approximation guarantee (Preis, 1999) and was measured at 94.3-100% of true optimal score against an exact baseline at small scales. Against traditional matching methods run on identical fixtures, it delivered 13–26% higher average compatibility than filter-only FCFS assignment at every ratio and outperformed score-based self-selection by up to 0.130 under capacity contention (Section 4.10.5).</w:t>
+        <w:t xml:space="preserve">RQ6: The algorithm scales as </w:t>
+      </w:r>
+      <w:proofErr w:type="gramStart"/>
+      <w:r>
+        <w:t>O(</w:t>
+      </w:r>
+      <w:proofErr w:type="gramEnd"/>
+      <w:r>
+        <w:t>n^2 log n), confirmed empirically: pairs scored grow by roughly the square of the system size. It carries a proven 1/2-approximation guarantee (Preis, 1999) and was measured at 94.3-100% of true optimal score against an exact baseline at small scales. Against traditional matching methods run on identical fixtures, it delivered 13–26% higher average compatibility than filter-only FCFS assignment at every ratio and outperformed score-based self-selection by up to 0.130 under capacity contention (Section 4.10.5).</w:t>
       </w:r>
     </w:p>
     <w:p>
@@ -22642,7 +23795,15 @@
         </w:numPr>
       </w:pPr>
       <w:r>
-        <w:t>A composite scoring architecture with four independently testable sub-scorers and a priority-queue greedy assignment engine with lazy fairness recompute, achieving O(n² log n) time complexity with a proven 1/2-approximation guarantee.</w:t>
+        <w:t xml:space="preserve">A composite scoring architecture with four independently testable sub-scorers and a priority-queue greedy assignment engine with lazy fairness recompute, achieving </w:t>
+      </w:r>
+      <w:proofErr w:type="gramStart"/>
+      <w:r>
+        <w:t>O(</w:t>
+      </w:r>
+      <w:proofErr w:type="gramEnd"/>
+      <w:r>
+        <w:t>n² log n) time complexity with a proven 1/2-approximation guarantee.</w:t>
       </w:r>
     </w:p>
     <w:p>
@@ -22863,6 +24024,7 @@
         <w:pStyle w:val="BodyText"/>
       </w:pPr>
       <w:r>
+        <w:lastRenderedPageBreak/>
         <w:t>Karaci, A. (2019). Intelligent tutoring system model based on fuzzy logic and constraint-based student model. Neural Computing and Applications, 31(8), 3619–3628. https://doi.org/10.1007/s00521-017-3311-2</w:t>
       </w:r>
     </w:p>
@@ -22871,8 +24033,80 @@
         <w:pStyle w:val="BodyText"/>
       </w:pPr>
       <w:r>
+        <w:t>Kester, L., van Rosmalen, P., Sloep, P., Brouns, F., Kone, M., &amp; Koper, R. (2007). Matchmaking in learning networks: Bringing learners together for knowledge sharing. Interactive Learning Environments, 15(2), 117–126. https://doi.org/10.1080/10494820701332663</w:t>
+      </w:r>
+    </w:p>
+    <w:p>
+      <w:pPr>
+        <w:pStyle w:val="BodyText"/>
+      </w:pPr>
+      <w:r>
+        <w:t>Konstan, J. A., &amp; Riedl, J. (2012). Recommender systems: From algorithms to user experience. User Modeling and User-Adapted Interaction, 22(1–2), 101–123. https://doi.org/10.1007/s11257-011-9112-x</w:t>
+      </w:r>
+    </w:p>
+    <w:p>
+      <w:pPr>
+        <w:pStyle w:val="BodyText"/>
+      </w:pPr>
+      <w:r>
+        <w:t>Korte, B., &amp; Vygen, J. (2018). Combinatorial Optimization: Theory and Algorithms (6th ed.). Springer. https://doi.org/10.1007/978-3-662-56039-6</w:t>
+      </w:r>
+    </w:p>
+    <w:p>
+      <w:pPr>
+        <w:pStyle w:val="BodyText"/>
+      </w:pPr>
+      <w:r>
+        <w:t>Lechuga, C. G., &amp; Doroudi, S. (2023). Three algorithms for grouping students: A bridge between personalized tutoring system data and classroom pedagogy. International Journal of Artificial Intelligence in Education, 33(4), 843–884. https://doi.org/10.1007/s40593-022-00309-y</w:t>
+      </w:r>
+    </w:p>
+    <w:p>
+      <w:pPr>
+        <w:pStyle w:val="BodyText"/>
+      </w:pPr>
+      <w:r>
+        <w:t>Leung, J. Y. T. (2004). Handbook of Scheduling: Algorithms, Models, and Performance Analysis. Chapman and Hall/CRC. https://doi.org/10.1201/9780203489802</w:t>
+      </w:r>
+    </w:p>
+    <w:p>
+      <w:pPr>
+        <w:pStyle w:val="BodyText"/>
+      </w:pPr>
+      <w:r>
+        <w:t>Lotfian, E., &amp; Kabgani, A. (2026). HiMARS: Hybrid multi-objective algorithms for recommender systems. arXiv preprint arXiv:2604.07572. https://arxiv.org/abs/2604.07572</w:t>
+      </w:r>
+    </w:p>
+    <w:p>
+      <w:pPr>
+        <w:pStyle w:val="BodyText"/>
+      </w:pPr>
+      <w:r>
+        <w:t>Nuseibeh, B., &amp; Easterbrook, S. (2000). Requirements engineering: A roadmap. In Proceedings of the Conference on the Future of Software Engineering (pp. 35–46). ACM. https://doi.org/10.1145/336512.336523</w:t>
+      </w:r>
+    </w:p>
+    <w:p>
+      <w:pPr>
+        <w:pStyle w:val="BodyText"/>
+      </w:pPr>
+      <w:r>
+        <w:t>Peffers, K., Tuunanen, T., Rothenberger, M. A., &amp; Chatterjee, S. (2007). A design science research methodology for information systems research. Journal of Management Information Systems, 24(3), 45–77. https://doi.org/10.2753/MIS0742-1222240302</w:t>
+      </w:r>
+    </w:p>
+    <w:p>
+      <w:pPr>
+        <w:pStyle w:val="BodyText"/>
+      </w:pPr>
+      <w:r>
+        <w:t>Pinedo, M. L. (2022). Scheduling: Theory, Algorithms, and Systems (6th ed.). Springer. https://doi.org/10.1007/978-3-031-05921-6</w:t>
+      </w:r>
+    </w:p>
+    <w:p>
+      <w:pPr>
+        <w:pStyle w:val="BodyText"/>
+      </w:pPr>
+      <w:r>
         <w:lastRenderedPageBreak/>
-        <w:t>Kester, L., van Rosmalen, P., Sloep, P., Brouns, F., Kone, M., &amp; Koper, R. (2007). Matchmaking in learning networks: Bringing learners together for knowledge sharing. Interactive Learning Environments, 15(2), 117–126. https://doi.org/10.1080/10494820701332663</w:t>
+        <w:t>Pitoura, E., Stefanidis, K., &amp; Koutrika, G. (2022). Fairness in rankings and recommendations: An overview. The VLDB Journal, 31(3), 431–458. https://doi.org/10.1007/s00778-021-00697-y</w:t>
       </w:r>
     </w:p>
     <w:p>
@@ -22880,7 +24114,7 @@
         <w:pStyle w:val="BodyText"/>
       </w:pPr>
       <w:r>
-        <w:t>Konstan, J. A., &amp; Riedl, J. (2012). Recommender systems: From algorithms to user experience. User Modeling and User-Adapted Interaction, 22(1–2), 101–123. https://doi.org/10.1007/s11257-011-9112-x</w:t>
+        <w:t>Preis, R. (1999). Linear time 1/2-approximation algorithm for maximum weighted matching in general graphs. In C. Meinel &amp; S. Tison (Eds.), STACS 99 (Lecture Notes in Computer Science, Vol. 1563, pp. 259–269). Springer. https://doi.org/10.1007/3-540-49116-3_24</w:t>
       </w:r>
     </w:p>
     <w:p>
@@ -22888,7 +24122,7 @@
         <w:pStyle w:val="BodyText"/>
       </w:pPr>
       <w:r>
-        <w:t>Korte, B., &amp; Vygen, J. (2018). Combinatorial Optimization: Theory and Algorithms (6th ed.). Springer. https://doi.org/10.1007/978-3-662-56039-6</w:t>
+        <w:t>Ramesh, V. (2020). Developing an accurate method and algorithm to identify and match tutors with their respective students, according to intellectual level and teaching style. 2020 Intern Reports, 20. Illinois Mathematics and Science Academy. https://digitalcommons.imsa.edu/intern_reports_2020/20/</w:t>
       </w:r>
     </w:p>
     <w:p>
@@ -22896,7 +24130,7 @@
         <w:pStyle w:val="BodyText"/>
       </w:pPr>
       <w:r>
-        <w:t>Lechuga, C. G., &amp; Doroudi, S. (2023). Three algorithms for grouping students: A bridge between personalized tutoring system data and classroom pedagogy. International Journal of Artificial Intelligence in Education, 33(4), 843–884. https://doi.org/10.1007/s40593-022-00309-y</w:t>
+        <w:t>Ricci, F., Rokach, L., &amp; Shapira, B. (Eds.). (2022). Recommender Systems Handbook (3rd ed.). Springer. https://doi.org/10.1007/978-1-0716-2197-4</w:t>
       </w:r>
     </w:p>
     <w:p>
@@ -22904,7 +24138,7 @@
         <w:pStyle w:val="BodyText"/>
       </w:pPr>
       <w:r>
-        <w:t>Leung, J. Y. T. (2004). Handbook of Scheduling: Algorithms, Models, and Performance Analysis. Chapman and Hall/CRC. https://doi.org/10.1201/9780203489802</w:t>
+        <w:t>Roth, A. E. (2008). Deferred acceptance algorithms: History, theory, practice, and open questions. International Journal of Game Theory, 36(3–4), 537–569. https://doi.org/10.1007/s00182-008-0117-6</w:t>
       </w:r>
     </w:p>
     <w:p>
@@ -22912,7 +24146,7 @@
         <w:pStyle w:val="BodyText"/>
       </w:pPr>
       <w:r>
-        <w:t>Lotfian, E., &amp; Kabgani, A. (2026). HiMARS: Hybrid multi-objective algorithms for recommender systems. arXiv preprint arXiv:2604.07572. https://arxiv.org/abs/2604.07572</w:t>
+        <w:t>Sommerville, I. (2016). Software Engineering (10th ed.). Pearson. https://www.pearson.com/en-us/subject-catalog/p/software-engineering/P200000003258/9780137503148</w:t>
       </w:r>
     </w:p>
     <w:p>
@@ -22920,7 +24154,7 @@
         <w:pStyle w:val="BodyText"/>
       </w:pPr>
       <w:r>
-        <w:t>Nuseibeh, B., &amp; Easterbrook, S. (2000). Requirements engineering: A roadmap. In Proceedings of the Conference on the Future of Software Engineering (pp. 35–46). ACM. https://doi.org/10.1145/336512.336523</w:t>
+        <w:t>Spivakovsky, A., Poltoratskyi, M., Lemeshchuk, O., Denysenko, V., Karpov, I., &amp; Revenko, Y. (2025). Algorithms for using online tutoring as a tool for personalization of learning. In ICT in Education, Research, and Industrial Applications (CCIS 2359, pp. 178–193). Springer. https://doi.org/10.1007/978-3-031-81372-6</w:t>
       </w:r>
     </w:p>
     <w:p>
@@ -22928,7 +24162,7 @@
         <w:pStyle w:val="BodyText"/>
       </w:pPr>
       <w:r>
-        <w:t>Peffers, K., Tuunanen, T., Rothenberger, M. A., &amp; Chatterjee, S. (2007). A design science research methodology for information systems research. Journal of Management Information Systems, 24(3), 45–77. https://doi.org/10.2753/MIS0742-1222240302</w:t>
+        <w:t>Tarus, J. K., Niu, Z., &amp; Mustafa, G. (2018). Knowledge-based recommendation: A review of ontology-based recommender systems for e-learning. Artificial Intelligence Review, 50(1), 21–48. https://doi.org/10.1007/s10462-017-9539-5</w:t>
       </w:r>
     </w:p>
     <w:p>
@@ -22936,7 +24170,7 @@
         <w:pStyle w:val="BodyText"/>
       </w:pPr>
       <w:r>
-        <w:t>Pinedo, M. L. (2022). Scheduling: Theory, Algorithms, and Systems (6th ed.). Springer. https://doi.org/10.1007/978-3-031-05921-6</w:t>
+        <w:t>Taveekarn, W., Latthitham, R., Kittichareonjit, N., &amp; Visoottiviseth, V. (2014). FindMyTutor: An Android application for matching students and private tutors. In Proceedings of the 2014 3rd ICT International Senior Project Conference (pp. 5–8). IEEE. https://murex.mahidol.ac.th/en/publications/findmytutor-an-android-application-for-matching-students-and-priv/</w:t>
       </w:r>
     </w:p>
     <w:p>
@@ -22944,79 +24178,7 @@
         <w:pStyle w:val="BodyText"/>
       </w:pPr>
       <w:r>
-        <w:t>Pitoura, E., Stefanidis, K., &amp; Koutrika, G. (2022). Fairness in rankings and recommendations: An overview. The VLDB Journal, 31(3), 431–458. https://doi.org/10.1007/s00778-021-00697-y</w:t>
-      </w:r>
-    </w:p>
-    <w:p>
-      <w:pPr>
-        <w:pStyle w:val="BodyText"/>
-      </w:pPr>
-      <w:r>
-        <w:t>Preis, R. (1999). Linear time 1/2-approximation algorithm for maximum weighted matching in general graphs. In C. Meinel &amp; S. Tison (Eds.), STACS 99 (Lecture Notes in Computer Science, Vol. 1563, pp. 259–269). Springer. https://doi.org/10.1007/3-540-49116-3_24</w:t>
-      </w:r>
-    </w:p>
-    <w:p>
-      <w:pPr>
-        <w:pStyle w:val="BodyText"/>
-      </w:pPr>
-      <w:r>
         <w:lastRenderedPageBreak/>
-        <w:t>Ramesh, V. (2020). Developing an accurate method and algorithm to identify and match tutors with their respective students, according to intellectual level and teaching style. 2020 Intern Reports, 20. Illinois Mathematics and Science Academy. https://digitalcommons.imsa.edu/intern_reports_2020/20/</w:t>
-      </w:r>
-    </w:p>
-    <w:p>
-      <w:pPr>
-        <w:pStyle w:val="BodyText"/>
-      </w:pPr>
-      <w:r>
-        <w:t>Ricci, F., Rokach, L., &amp; Shapira, B. (Eds.). (2022). Recommender Systems Handbook (3rd ed.). Springer. https://doi.org/10.1007/978-1-0716-2197-4</w:t>
-      </w:r>
-    </w:p>
-    <w:p>
-      <w:pPr>
-        <w:pStyle w:val="BodyText"/>
-      </w:pPr>
-      <w:r>
-        <w:t>Roth, A. E. (2008). Deferred acceptance algorithms: History, theory, practice, and open questions. International Journal of Game Theory, 36(3–4), 537–569. https://doi.org/10.1007/s00182-008-0117-6</w:t>
-      </w:r>
-    </w:p>
-    <w:p>
-      <w:pPr>
-        <w:pStyle w:val="BodyText"/>
-      </w:pPr>
-      <w:r>
-        <w:t>Sommerville, I. (2016). Software Engineering (10th ed.). Pearson. https://www.pearson.com/en-us/subject-catalog/p/software-engineering/P200000003258/9780137503148</w:t>
-      </w:r>
-    </w:p>
-    <w:p>
-      <w:pPr>
-        <w:pStyle w:val="BodyText"/>
-      </w:pPr>
-      <w:r>
-        <w:t>Spivakovsky, A., Poltoratskyi, M., Lemeshchuk, O., Denysenko, V., Karpov, I., &amp; Revenko, Y. (2025). Algorithms for using online tutoring as a tool for personalization of learning. In ICT in Education, Research, and Industrial Applications (CCIS 2359, pp. 178–193). Springer. https://doi.org/10.1007/978-3-031-81372-6</w:t>
-      </w:r>
-    </w:p>
-    <w:p>
-      <w:pPr>
-        <w:pStyle w:val="BodyText"/>
-      </w:pPr>
-      <w:r>
-        <w:t>Tarus, J. K., Niu, Z., &amp; Mustafa, G. (2018). Knowledge-based recommendation: A review of ontology-based recommender systems for e-learning. Artificial Intelligence Review, 50(1), 21–48. https://doi.org/10.1007/s10462-017-9539-5</w:t>
-      </w:r>
-    </w:p>
-    <w:p>
-      <w:pPr>
-        <w:pStyle w:val="BodyText"/>
-      </w:pPr>
-      <w:r>
-        <w:t>Taveekarn, W., Latthitham, R., Kittichareonjit, N., &amp; Visoottiviseth, V. (2014). FindMyTutor: An Android application for matching students and private tutors. In Proceedings of the 2014 3rd ICT International Senior Project Conference (pp. 5–8). IEEE. https://murex.mahidol.ac.th/en/publications/findmytutor-an-android-application-for-matching-students-and-priv/</w:t>
-      </w:r>
-    </w:p>
-    <w:p>
-      <w:pPr>
-        <w:pStyle w:val="BodyText"/>
-      </w:pPr>
-      <w:r>
         <w:t>Vanguard. (2024, August 12). WAEC releases 2024 WASSCE results. Vanguard Nigeria. https://www.vanguardngr.com/2024/08/breaking-waec-releases-2024-wassce-results/</w:t>
       </w:r>
     </w:p>
@@ -23342,7 +24504,15 @@
               <w:jc w:val="left"/>
             </w:pPr>
             <w:r>
-              <w:t>Hierarchical four-bucket composite: M(s,t) = alpha*A + beta*P + gamma*S + delta*F, with sub-weights inside each bucket</w:t>
+              <w:t>Hierarchical four-bucket composite: M(</w:t>
+            </w:r>
+            <w:proofErr w:type="gramStart"/>
+            <w:r>
+              <w:t>s,t</w:t>
+            </w:r>
+            <w:proofErr w:type="gramEnd"/>
+            <w:r>
+              <w:t>) = alpha*A + beta*P + gamma*S + delta*F, with sub-weights inside each bucket</w:t>
             </w:r>
           </w:p>
         </w:tc>
@@ -23458,7 +24628,23 @@
               <w:jc w:val="left"/>
             </w:pPr>
             <w:r>
-              <w:t>Lvl(s,t) = max(0, 1 - |Ls - Lt| / Lmax) with Lmax = 12; clamping prevents negative scores</w:t>
+              <w:t>Lvl(</w:t>
+            </w:r>
+            <w:proofErr w:type="gramStart"/>
+            <w:r>
+              <w:t>s,t</w:t>
+            </w:r>
+            <w:proofErr w:type="gramEnd"/>
+            <w:r>
+              <w:t xml:space="preserve">) = </w:t>
+            </w:r>
+            <w:proofErr w:type="gramStart"/>
+            <w:r>
+              <w:t>max(</w:t>
+            </w:r>
+            <w:proofErr w:type="gramEnd"/>
+            <w:r>
+              <w:t>0, 1 - |Ls - Lt| / Lmax) with Lmax = 12; clamping prevents negative scores</w:t>
             </w:r>
           </w:p>
         </w:tc>
@@ -23519,7 +24705,35 @@
               <w:rPr>
                 <w:rFonts w:eastAsiaTheme="minorEastAsia"/>
               </w:rPr>
-              <w:t>Exp'(t) = theta*min(Years/20, 1) + (1-theta)*Q_t with theta = 0.4, cold start Q_t = 0.5</w:t>
+              <w:t>Exp'(t) = theta*</w:t>
+            </w:r>
+            <w:proofErr w:type="gramStart"/>
+            <w:r>
+              <w:rPr>
+                <w:rFonts w:eastAsiaTheme="minorEastAsia"/>
+              </w:rPr>
+              <w:t>min(</w:t>
+            </w:r>
+            <w:proofErr w:type="gramEnd"/>
+            <w:r>
+              <w:rPr>
+                <w:rFonts w:eastAsiaTheme="minorEastAsia"/>
+              </w:rPr>
+              <w:t>Years/20, 1) + (1-</w:t>
+            </w:r>
+            <w:proofErr w:type="gramStart"/>
+            <w:r>
+              <w:rPr>
+                <w:rFonts w:eastAsiaTheme="minorEastAsia"/>
+              </w:rPr>
+              <w:t>theta)*</w:t>
+            </w:r>
+            <w:proofErr w:type="gramEnd"/>
+            <w:r>
+              <w:rPr>
+                <w:rFonts w:eastAsiaTheme="minorEastAsia"/>
+              </w:rPr>
+              <w:t>Q_t with theta = 0.4, cold start Q_t = 0.5</w:t>
             </w:r>
           </w:p>
         </w:tc>
@@ -23636,7 +24850,23 @@
               <w:jc w:val="left"/>
             </w:pPr>
             <w:r>
-              <w:t>Budget(s,t) = 1 if rate &lt;= budget; max(0, 1 - (rate-budget)/budget) if over; zero-division guard</w:t>
+              <w:t>Budget(</w:t>
+            </w:r>
+            <w:proofErr w:type="gramStart"/>
+            <w:r>
+              <w:t>s,t</w:t>
+            </w:r>
+            <w:proofErr w:type="gramEnd"/>
+            <w:r>
+              <w:t xml:space="preserve">) = 1 if rate &lt;= budget; </w:t>
+            </w:r>
+            <w:proofErr w:type="gramStart"/>
+            <w:r>
+              <w:t>max(</w:t>
+            </w:r>
+            <w:proofErr w:type="gramEnd"/>
+            <w:r>
+              <w:t>0, 1 - (rate-budget)/budget) if over; zero-division guard</w:t>
             </w:r>
           </w:p>
         </w:tc>
@@ -23752,7 +24982,15 @@
               <w:jc w:val="left"/>
             </w:pPr>
             <w:r>
-              <w:t>S(s,t) = |Hs intersect Ht| / |Hs| with contiguous coverage; zero-availability students rejected as incomplete</w:t>
+              <w:t>S(</w:t>
+            </w:r>
+            <w:proofErr w:type="gramStart"/>
+            <w:r>
+              <w:t>s,t</w:t>
+            </w:r>
+            <w:proofErr w:type="gramEnd"/>
+            <w:r>
+              <w:t>) = |Hs intersect Ht| / |Hs| with contiguous coverage; zero-availability students rejected as incomplete</w:t>
             </w:r>
           </w:p>
         </w:tc>
@@ -23985,7 +25223,23 @@
               <w:jc w:val="left"/>
             </w:pPr>
             <w:r>
-              <w:t>EMA: Q_t_new = (1-lambda)*Q_t_old + lambda*FB(s,t) with lambda = 0.3, FB = rating/5</w:t>
+              <w:t>EMA: Q_t_new = (1-</w:t>
+            </w:r>
+            <w:proofErr w:type="gramStart"/>
+            <w:r>
+              <w:t>lambda)*</w:t>
+            </w:r>
+            <w:proofErr w:type="gramEnd"/>
+            <w:r>
+              <w:t>Q_t_old + lambda*FB(</w:t>
+            </w:r>
+            <w:proofErr w:type="gramStart"/>
+            <w:r>
+              <w:t>s,t</w:t>
+            </w:r>
+            <w:proofErr w:type="gramEnd"/>
+            <w:r>
+              <w:t>) with lambda = 0.3, FB = rating/5</w:t>
             </w:r>
           </w:p>
         </w:tc>
@@ -24043,21 +25297,37 @@
               <w:jc w:val="left"/>
             </w:pPr>
             <w:r>
-              <w:t>Top-K ranking layer for student-facing display (full sort then truncate, O(T log T) per request), plus per-student top-K truncation inside the batch engine</w:t>
-            </w:r>
-          </w:p>
-        </w:tc>
-        <w:tc>
-          <w:tcPr>
-            <w:tcW w:w="0" w:type="auto"/>
-          </w:tcPr>
-          <w:p>
-            <w:pPr>
-              <w:pStyle w:val="Compact"/>
-              <w:jc w:val="left"/>
-            </w:pPr>
-            <w:r>
-              <w:t>Bounds the response to the top 5–10 tutors and caps batch heap memory at O(S × k) (Section 4.5.3)</w:t>
+              <w:t xml:space="preserve">Top-K ranking layer for student-facing display (full sort then truncate, </w:t>
+            </w:r>
+            <w:proofErr w:type="gramStart"/>
+            <w:r>
+              <w:t>O(</w:t>
+            </w:r>
+            <w:proofErr w:type="gramEnd"/>
+            <w:r>
+              <w:t>T log T) per request), plus per-student top-K truncation inside the batch engine</w:t>
+            </w:r>
+          </w:p>
+        </w:tc>
+        <w:tc>
+          <w:tcPr>
+            <w:tcW w:w="0" w:type="auto"/>
+          </w:tcPr>
+          <w:p>
+            <w:pPr>
+              <w:pStyle w:val="Compact"/>
+              <w:jc w:val="left"/>
+            </w:pPr>
+            <w:r>
+              <w:t xml:space="preserve">Bounds the response to the top 5–10 tutors and caps batch heap memory at </w:t>
+            </w:r>
+            <w:proofErr w:type="gramStart"/>
+            <w:r>
+              <w:t>O(</w:t>
+            </w:r>
+            <w:proofErr w:type="gramEnd"/>
+            <w:r>
+              <w:t>S × k) (Section 4.5.3)</w:t>
             </w:r>
           </w:p>
         </w:tc>
@@ -24469,7 +25739,15 @@
         <w:pStyle w:val="FirstParagraph"/>
       </w:pPr>
       <w:r>
-        <w:t>Second, the generated suite and harness were executed against the repository and their output transcribed into Tables 4.2 through 4.7. The final authoritative run was performed on 13 August 2026: pnpm test:cov (78 of 78 core tests passing; per-class coverage in Table 4.2), the evaluation harness scenarios including the three-strategy baseline comparison (Tables 4.4, 4.5, and 4.7), and the optimal-baseline comparison (Section 4.5.5). The harness contains no un-seeded randomness, so the match-quality and fairness figures in Tables 4.4, 4.5, and 4.7 are exactly reproducible from the repository; the wall-clock timings in Table 4.6 vary with hardware and were therefore excluded from the reproducibility claim.</w:t>
+        <w:t xml:space="preserve">Second, the generated suite and harness were executed against the repository and their output transcribed into Tables 4.2 through 4.7. The final authoritative run was performed on 13 August 2026: pnpm </w:t>
+      </w:r>
+      <w:proofErr w:type="gramStart"/>
+      <w:r>
+        <w:t>test:cov</w:t>
+      </w:r>
+      <w:proofErr w:type="gramEnd"/>
+      <w:r>
+        <w:t xml:space="preserve"> (78 of 78 core tests passing; per-class coverage in Table 4.2), the evaluation harness scenarios including the three-strategy baseline comparison (Tables 4.4, 4.5, and 4.7), and the optimal-baseline comparison (Section 4.5.5). The harness contains no un-seeded randomness, so the match-quality and fairness figures in Tables 4.4, 4.5, and 4.7 are exactly reproducible from the repository; the wall-clock timings in Table 4.6 vary with hardware and were therefore excluded from the reproducibility claim.</w:t>
       </w:r>
     </w:p>
     <w:p>

</xml_diff>